<commit_message>
Update assignment documentation and website privacy
</commit_message>
<xml_diff>
--- a/report/Website development report.docx
+++ b/report/Website development report.docx
@@ -1,2252 +1,2297 @@
 
 <file path=word/document.xml><?xml version="1.0" encoding="utf-8"?>
-<ns0:document xmlns:ns0="http://schemas.openxmlformats.org/wordprocessingml/2006/main" xmlns:ns1="http://schemas.openxmlformats.org/markup-compatibility/2006" xmlns:ns2="http://schemas.microsoft.com/office/word/2010/wordml" xmlns:ns3="http://schemas.openxmlformats.org/drawingml/2006/wordprocessingDrawing" xmlns:ns4="http://schemas.microsoft.com/office/word/2010/wordprocessingDrawing" xmlns:ns5="http://schemas.openxmlformats.org/drawingml/2006/main" xmlns:ns6="http://schemas.openxmlformats.org/drawingml/2006/picture" xmlns:ns7="http://schemas.openxmlformats.org/officeDocument/2006/relationships" xmlns:w14="http://schemas.microsoft.com/office/word/2010/wordml" xmlns:w15="http://schemas.microsoft.com/office/word/2012/wordml" xmlns:w16se="http://schemas.microsoft.com/office/word/2015/wordml/symex" xmlns:w16cid="http://schemas.microsoft.com/office/word/2016/wordml/cid" xmlns:w16="http://schemas.microsoft.com/office/word/2018/wordml" xmlns:w16cex="http://schemas.microsoft.com/office/word/2018/wordml/cex" xmlns:w16sdtdh="http://schemas.microsoft.com/office/word/2022/wordml/sdtdatahash" xmlns:w16sdtfl="http://schemas.microsoft.com/office/word/2024/wordml/sdtformatlock" xmlns:w16du="http://schemas.microsoft.com/office/word/2023/word/word16du" xmlns:wp14="http://schemas.microsoft.com/office/word/2010/wordprocessingDrawing" ns1:Ignorable="w14 w15 w16se w16cid w16 w16cex w16sdtdh w16sdtfl w16du wp14">
-  <ns0:body>
-    <ns0:p ns2:paraId="1E840916" ns2:textId="77777777" ns0:rsidR="00C421DB" ns0:rsidRDefault="00000000">
-      <ns0:pPr>
-        <ns0:pStyle ns0:val="Title"/>
-      </ns0:pPr>
-      <ns0:r>
-        <ns0:t>Website Development</ns0:t>
-      </ns0:r>
-    </ns0:p>
-    <ns0:p ns2:paraId="4A5D5806" ns2:textId="39CB4708" ns0:rsidR="00C421DB" ns0:rsidRDefault="00000000">
-      <ns0:r>
-        <ns0:t xml:space="preserve">Unit 3 assignment report </ns0:t>
-      </ns0:r>
-      <ns0:r ns0:rsidR="009A26F4">
-        <ns0:t>/</ns0:t>
-      </ns0:r>
-      <ns0:r>
-        <ns0:t xml:space="preserve"> Seventies Sound </ns0:t>
-      </ns0:r>
-      <ns0:r ns0:rsidR="009A26F4">
-        <ns0:t>/</ns0:t>
-      </ns0:r>
-      <ns0:r>
-        <ns0:t xml:space="preserve"> September 2026</ns0:t>
-      </ns0:r>
-    </ns0:p>
-    <ns0:p ns2:paraId="7A06BF82" ns2:textId="30D20324" ns0:rsidR="00C421DB" ns0:rsidRDefault="00000000">
-      <ns0:r>
-        <ns0:t xml:space="preserve">This is a </ns0:t>
-      </ns0:r>
-      <ns0:r ns0:rsidR="00D43AA3">
-        <ns0:t>3-</ns0:t>
-      </ns0:r>
-      <ns0:r>
-        <ns0:t>page website introducing 1970s music to 17-23-year-olds. I used HTML, CSS and JavaScript.</ns0:t>
-      </ns0:r>
-    </ns0:p>
-    <ns0:p ns2:paraId="6FEDDC8E" ns2:textId="77777777" ns0:rsidR="00C421DB" ns0:rsidRDefault="00000000">
-      <ns0:r>
-        <ns0:br ns0:type="page"/>
-      </ns0:r>
-    </ns0:p>
-    <ns0:p ns2:paraId="133316DE" ns2:textId="77777777" ns0:rsidR="00C421DB" ns0:rsidRDefault="00000000">
-      <ns0:pPr>
-        <ns0:pStyle ns0:val="Heading1"/>
-      </ns0:pPr>
-      <ns0:r>
-        <ns0:lastRenderedPageBreak/>
-        <ns0:t>Task 1: Research and planning</ns0:t>
-      </ns0:r>
-    </ns0:p>
-    <ns0:p ns2:paraId="2A01100D" ns2:textId="77777777" ns0:rsidR="00C421DB" ns0:rsidRDefault="00000000">
-      <ns0:pPr>
-        <ns0:pStyle ns0:val="Heading2"/>
-      </ns0:pPr>
-      <ns0:r>
-        <ns0:t>Brief, audience and research</ns0:t>
-      </ns0:r>
-    </ns0:p>
-    <ns0:p ns2:paraId="05D18E8E" ns2:textId="7DD81633" ns0:rsidR="00C421DB" ns0:rsidRDefault="00000000">
-      <ns0:r>
-        <ns0:t>The brief asks for a mobile-friendly three-page site with navigation, search, an accordion, video, image popups, external links, a request form and accessibility features. I wanted the site to work for someone who knows a song already and someone who has never listened to 70s music.</ns0:t>
-      </ns0:r>
-    </ns0:p>
-    <ns0:tbl>
-      <ns0:tblPr>
-        <ns0:tblStyle ns0:val="TableGrid"/>
-        <ns0:tblW ns0:w="0" ns0:type="auto"/>
-        <ns0:tblLook ns0:val="04A0" ns0:firstRow="1" ns0:lastRow="0" ns0:firstColumn="1" ns0:lastColumn="0" ns0:noHBand="0" ns0:noVBand="1"/>
-      </ns0:tblPr>
-      <ns0:tblGrid>
-        <ns0:gridCol ns0:w="3250"/>
-        <ns0:gridCol ns0:w="3250"/>
-        <ns0:gridCol ns0:w="3250"/>
-      </ns0:tblGrid>
-      <ns0:tr ns0:rsidR="00C421DB" ns2:paraId="38F5BE42" ns2:textId="77777777">
-        <ns0:trPr>
-          <ns0:cantSplit/>
-        </ns0:trPr>
-        <ns0:tc>
-          <ns0:tcPr>
-            <ns0:tcW ns0:w="3250" ns0:type="dxa"/>
-          </ns0:tcPr>
-          <ns0:p ns2:paraId="53568A2B" ns2:textId="77777777" ns0:rsidR="00C421DB" ns0:rsidRDefault="00000000">
-            <ns0:pPr>
-              <ns0:spacing ns0:after="80"/>
-            </ns0:pPr>
-            <ns0:r>
-              <ns0:rPr>
-                <ns0:sz ns0:val="20"/>
-              </ns0:rPr>
-              <ns0:t>Site</ns0:t>
-            </ns0:r>
-          </ns0:p>
-        </ns0:tc>
-        <ns0:tc>
-          <ns0:tcPr>
-            <ns0:tcW ns0:w="3250" ns0:type="dxa"/>
-          </ns0:tcPr>
-          <ns0:p ns2:paraId="39FF7062" ns2:textId="77777777" ns0:rsidR="00C421DB" ns0:rsidRDefault="00000000">
-            <ns0:pPr>
-              <ns0:spacing ns0:after="80"/>
-            </ns0:pPr>
-            <ns0:r>
-              <ns0:rPr>
-                <ns0:sz ns0:val="20"/>
-              </ns0:rPr>
-              <ns0:t>What I noticed</ns0:t>
-            </ns0:r>
-          </ns0:p>
-        </ns0:tc>
-        <ns0:tc>
-          <ns0:tcPr>
-            <ns0:tcW ns0:w="3250" ns0:type="dxa"/>
-          </ns0:tcPr>
-          <ns0:p ns2:paraId="17873480" ns2:textId="77777777" ns0:rsidR="00C421DB" ns0:rsidRDefault="00000000">
-            <ns0:pPr>
-              <ns0:spacing ns0:after="80"/>
-            </ns0:pPr>
-            <ns0:r>
-              <ns0:rPr>
-                <ns0:sz ns0:val="20"/>
-              </ns0:rPr>
-              <ns0:t>What I used</ns0:t>
-            </ns0:r>
-          </ns0:p>
-        </ns0:tc>
-      </ns0:tr>
-      <ns0:tr ns0:rsidR="00C421DB" ns2:paraId="052BDECC" ns2:textId="77777777">
-        <ns0:trPr>
-          <ns0:cantSplit/>
-        </ns0:trPr>
-        <ns0:tc>
-          <ns0:tcPr>
-            <ns0:tcW ns0:w="3250" ns0:type="dxa"/>
-          </ns0:tcPr>
-          <ns0:p ns2:paraId="4690C6D0" ns2:textId="77777777" ns0:rsidR="00C421DB" ns0:rsidRDefault="00000000">
-            <ns0:pPr>
-              <ns0:spacing ns0:after="80"/>
-            </ns0:pPr>
-            <ns0:r>
-              <ns0:rPr>
-                <ns0:sz ns0:val="20"/>
-              </ns0:rPr>
-              <ns0:t>TheGreat70s [1]</ns0:t>
-            </ns0:r>
-          </ns0:p>
-        </ns0:tc>
-        <ns0:tc>
-          <ns0:tcPr>
-            <ns0:tcW ns0:w="3250" ns0:type="dxa"/>
-          </ns0:tcPr>
-          <ns0:p ns2:paraId="3B27F56D" ns2:textId="77777777" ns0:rsidR="00C421DB" ns0:rsidRDefault="00000000">
-            <ns0:pPr>
-              <ns0:spacing ns0:after="80"/>
-            </ns0:pPr>
-            <ns0:r>
-              <ns0:rPr>
-                <ns0:sz ns0:val="20"/>
-              </ns0:rPr>
-              <ns0:t>The image makes the decade obvious, but the advert uses too much room on a phone.</ns0:t>
-            </ns0:r>
-          </ns0:p>
-        </ns0:tc>
-        <ns0:tc>
-          <ns0:tcPr>
-            <ns0:tcW ns0:w="3250" ns0:type="dxa"/>
-          </ns0:tcPr>
-          <ns0:p ns2:paraId="06FF249A" ns2:textId="77777777" ns0:rsidR="00C421DB" ns0:rsidRDefault="00000000">
-            <ns0:pPr>
-              <ns0:spacing ns0:after="80"/>
-            </ns0:pPr>
-            <ns0:r>
-              <ns0:rPr>
-                <ns0:sz ns0:val="20"/>
-              </ns0:rPr>
-              <ns0:t>Clear heading and image, but no adverts.</ns0:t>
-            </ns0:r>
-          </ns0:p>
-        </ns0:tc>
-      </ns0:tr>
-      <ns0:tr ns0:rsidR="00C421DB" ns2:paraId="6C30C18C" ns2:textId="77777777">
-        <ns0:trPr>
-          <ns0:cantSplit/>
-        </ns0:trPr>
-        <ns0:tc>
-          <ns0:tcPr>
-            <ns0:tcW ns0:w="3250" ns0:type="dxa"/>
-          </ns0:tcPr>
-          <ns0:p ns2:paraId="7F0EEA15" ns2:textId="77777777" ns0:rsidR="00C421DB" ns0:rsidRDefault="00000000">
-            <ns0:pPr>
-              <ns0:spacing ns0:after="80"/>
-            </ns0:pPr>
-            <ns0:r>
-              <ns0:rPr>
-                <ns0:sz ns0:val="20"/>
-              </ns0:rPr>
-              <ns0:t>ABBA [2]</ns0:t>
-            </ns0:r>
-          </ns0:p>
-        </ns0:tc>
-        <ns0:tc>
-          <ns0:tcPr>
-            <ns0:tcW ns0:w="3250" ns0:type="dxa"/>
-          </ns0:tcPr>
-          <ns0:p ns2:paraId="7A372DBF" ns2:textId="77777777" ns0:rsidR="00C421DB" ns0:rsidRDefault="00000000">
-            <ns0:pPr>
-              <ns0:spacing ns0:after="80"/>
-            </ns0:pPr>
-            <ns0:r>
-              <ns0:rPr>
-                <ns0:sz ns0:val="20"/>
-              </ns0:rPr>
-              <ns0:t>The dark layout and large image are strong. It mainly suits people who already know ABBA.</ns0:t>
-            </ns0:r>
-          </ns0:p>
-        </ns0:tc>
-        <ns0:tc>
-          <ns0:tcPr>
-            <ns0:tcW ns0:w="3250" ns0:type="dxa"/>
-          </ns0:tcPr>
-          <ns0:p ns2:paraId="31E2FDD6" ns2:textId="77777777" ns0:rsidR="00C421DB" ns0:rsidRDefault="00000000">
-            <ns0:pPr>
-              <ns0:spacing ns0:after="80"/>
-            </ns0:pPr>
-            <ns0:r>
-              <ns0:rPr>
-                <ns0:sz ns0:val="20"/>
-              </ns0:rPr>
-              <ns0:t>Short introduction before a listening link.</ns0:t>
-            </ns0:r>
-          </ns0:p>
-        </ns0:tc>
-      </ns0:tr>
-      <ns0:tr ns0:rsidR="00C421DB" ns2:paraId="5B441F9E" ns2:textId="77777777">
-        <ns0:trPr>
-          <ns0:cantSplit/>
-        </ns0:trPr>
-        <ns0:tc>
-          <ns0:tcPr>
-            <ns0:tcW ns0:w="3250" ns0:type="dxa"/>
-          </ns0:tcPr>
-          <ns0:p ns2:paraId="257E0AA7" ns2:textId="77777777" ns0:rsidR="00C421DB" ns0:rsidRDefault="00000000">
-            <ns0:pPr>
-              <ns0:spacing ns0:after="80"/>
-            </ns0:pPr>
-            <ns0:r>
-              <ns0:rPr>
-                <ns0:sz ns0:val="20"/>
-              </ns0:rPr>
-              <ns0:t>Rock Hall [3]</ns0:t>
-            </ns0:r>
-          </ns0:p>
-        </ns0:tc>
-        <ns0:tc>
-          <ns0:tcPr>
-            <ns0:tcW ns0:w="3250" ns0:type="dxa"/>
-          </ns0:tcPr>
-          <ns0:p ns2:paraId="6F6B66A2" ns2:textId="77777777" ns0:rsidR="00C421DB" ns0:rsidRDefault="00000000">
-            <ns0:pPr>
-              <ns0:spacing ns0:after="80"/>
-            </ns0:pPr>
-            <ns0:r>
-              <ns0:rPr>
-                <ns0:sz ns0:val="20"/>
-              </ns0:rPr>
-              <ns0:t>Artist cards and search make browsing easy. Its phone layout feels busy.</ns0:t>
-            </ns0:r>
-          </ns0:p>
-        </ns0:tc>
-        <ns0:tc>
-          <ns0:tcPr>
-            <ns0:tcW ns0:w="3250" ns0:type="dxa"/>
-          </ns0:tcPr>
-          <ns0:p ns2:paraId="064D3703" ns2:textId="77777777" ns0:rsidR="00C421DB" ns0:rsidRDefault="00000000">
-            <ns0:pPr>
-              <ns0:spacing ns0:after="80"/>
-            </ns0:pPr>
-            <ns0:r>
-              <ns0:rPr>
-                <ns0:sz ns0:val="20"/>
-              </ns0:rPr>
-              <ns0:t>Genre buttons and search, with one-column phone cards.</ns0:t>
-            </ns0:r>
-          </ns0:p>
-        </ns0:tc>
-      </ns0:tr>
-    </ns0:tbl>
-    <ns0:p ns2:paraId="5F7DCCB5" ns2:textId="77777777" ns0:rsidR="00C421DB" ns0:rsidRDefault="00000000">
-      <ns0:r>
-        <ns0:t>The research screenshots are saved in planning-and-research/research-notes. ABBA's history gave me the 1974 Eurovision fact. I used David Bowie for glam rock and Donna Summer for disco, with official pages and chart information for facts and dates. [4-7]</ns0:t>
-      </ns0:r>
-    </ns0:p>
-    <ns0:p ns2:paraId="78233390" ns2:textId="77777777" ns0:rsidR="00C421DB" ns0:rsidRDefault="00000000">
-      <ns0:pPr>
-        <ns0:pStyle ns0:val="Heading2"/>
-      </ns0:pPr>
-      <ns0:r>
-        <ns0:t>Content, copyright and accessibility</ns0:t>
-      </ns0:r>
-    </ns0:p>
-    <ns0:tbl>
-      <ns0:tblPr>
-        <ns0:tblStyle ns0:val="TableGrid"/>
-        <ns0:tblW ns0:w="0" ns0:type="auto"/>
-        <ns0:tblLook ns0:val="04A0" ns0:firstRow="1" ns0:lastRow="0" ns0:firstColumn="1" ns0:lastColumn="0" ns0:noHBand="0" ns0:noVBand="1"/>
-      </ns0:tblPr>
-      <ns0:tblGrid>
-        <ns0:gridCol ns0:w="4874"/>
-        <ns0:gridCol ns0:w="4874"/>
-      </ns0:tblGrid>
-      <ns0:tr ns0:rsidR="00C421DB" ns2:paraId="2B40B8C1" ns2:textId="77777777">
-        <ns0:trPr>
-          <ns0:cantSplit/>
-        </ns0:trPr>
-        <ns0:tc>
-          <ns0:tcPr>
-            <ns0:tcW ns0:w="4874" ns0:type="dxa"/>
-          </ns0:tcPr>
-          <ns0:p ns2:paraId="797E0628" ns2:textId="77777777" ns0:rsidR="00C421DB" ns0:rsidRDefault="00000000">
-            <ns0:pPr>
-              <ns0:spacing ns0:after="80"/>
-            </ns0:pPr>
-            <ns0:r>
-              <ns0:rPr>
-                <ns0:sz ns0:val="20"/>
-              </ns0:rPr>
-              <ns0:t>Decision</ns0:t>
-            </ns0:r>
-          </ns0:p>
-        </ns0:tc>
-        <ns0:tc>
-          <ns0:tcPr>
-            <ns0:tcW ns0:w="4874" ns0:type="dxa"/>
-          </ns0:tcPr>
-          <ns0:p ns2:paraId="72BF2D7B" ns2:textId="77777777" ns0:rsidR="00C421DB" ns0:rsidRDefault="00000000">
-            <ns0:pPr>
-              <ns0:spacing ns0:after="80"/>
-            </ns0:pPr>
-            <ns0:r>
-              <ns0:rPr>
-                <ns0:sz ns0:val="20"/>
-              </ns0:rPr>
-              <ns0:t>Reason</ns0:t>
-            </ns0:r>
-          </ns0:p>
-        </ns0:tc>
-      </ns0:tr>
-      <ns0:tr ns0:rsidR="00C421DB" ns2:paraId="02C29BF8" ns2:textId="77777777">
-        <ns0:trPr>
-          <ns0:cantSplit/>
-        </ns0:trPr>
-        <ns0:tc>
-          <ns0:tcPr>
-            <ns0:tcW ns0:w="4874" ns0:type="dxa"/>
-          </ns0:tcPr>
-          <ns0:p ns2:paraId="6CFC7B55" ns2:textId="77777777" ns0:rsidR="00C421DB" ns0:rsidRDefault="00000000">
-            <ns0:pPr>
-              <ns0:spacing ns0:after="80"/>
-            </ns0:pPr>
-            <ns0:r>
-              <ns0:rPr>
-                <ns0:sz ns0:val="20"/>
-              </ns0:rPr>
-              <ns0:t>Seven artists from different genres</ns0:t>
-            </ns0:r>
-          </ns0:p>
-        </ns0:tc>
-        <ns0:tc>
-          <ns0:tcPr>
-            <ns0:tcW ns0:w="4874" ns0:type="dxa"/>
-          </ns0:tcPr>
-          <ns0:p ns2:paraId="2D146710" ns2:textId="77777777" ns0:rsidR="00C421DB" ns0:rsidRDefault="00000000">
-            <ns0:pPr>
-              <ns0:spacing ns0:after="80"/>
-            </ns0:pPr>
-            <ns0:r>
-              <ns0:rPr>
-                <ns0:sz ns0:val="20"/>
-              </ns0:rPr>
-              <ns0:t>There is enough choice for a beginner, without making Explore hard to look through.</ns0:t>
-            </ns0:r>
-          </ns0:p>
-        </ns0:tc>
-      </ns0:tr>
-      <ns0:tr ns0:rsidR="00C421DB" ns2:paraId="6E84B81F" ns2:textId="77777777">
-        <ns0:trPr>
-          <ns0:cantSplit/>
-        </ns0:trPr>
-        <ns0:tc>
-          <ns0:tcPr>
-            <ns0:tcW ns0:w="4874" ns0:type="dxa"/>
-          </ns0:tcPr>
-          <ns0:p ns2:paraId="7EE633AF" ns2:textId="77777777" ns0:rsidR="00C421DB" ns0:rsidRDefault="00000000">
-            <ns0:pPr>
-              <ns0:spacing ns0:after="80"/>
-            </ns0:pPr>
-            <ns0:r>
-              <ns0:rPr>
-                <ns0:sz ns0:val="20"/>
-              </ns0:rPr>
-              <ns0:t>Official YouTube links and credited images</ns0:t>
-            </ns0:r>
-          </ns0:p>
-        </ns0:tc>
-        <ns0:tc>
-          <ns0:tcPr>
-            <ns0:tcW ns0:w="4874" ns0:type="dxa"/>
-          </ns0:tcPr>
-          <ns0:p ns2:paraId="6059C26D" ns2:textId="77777777" ns0:rsidR="00C421DB" ns0:rsidRDefault="00000000">
-            <ns0:pPr>
-              <ns0:spacing ns0:after="80"/>
-            </ns0:pPr>
-            <ns0:r>
-              <ns0:rPr>
-                <ns0:sz ns0:val="20"/>
-              </ns0:rPr>
-              <ns0:t>This avoids copying music files. Source and licence records are kept with the assets. [8]</ns0:t>
-            </ns0:r>
-          </ns0:p>
-        </ns0:tc>
-      </ns0:tr>
-      <ns0:tr ns0:rsidR="00C421DB" ns2:paraId="10E1729C" ns2:textId="77777777">
-        <ns0:trPr>
-          <ns0:cantSplit/>
-        </ns0:trPr>
-        <ns0:tc>
-          <ns0:tcPr>
-            <ns0:tcW ns0:w="4874" ns0:type="dxa"/>
-          </ns0:tcPr>
-          <ns0:p ns2:paraId="74986602" ns2:textId="77777777" ns0:rsidR="00C421DB" ns0:rsidRDefault="00000000">
-            <ns0:pPr>
-              <ns0:spacing ns0:after="80"/>
-            </ns0:pPr>
-            <ns0:r>
-              <ns0:rPr>
-                <ns0:sz ns0:val="20"/>
-              </ns0:rPr>
-              <ns0:t>Short request form</ns0:t>
-            </ns0:r>
-          </ns0:p>
-        </ns0:tc>
-        <ns0:tc>
-          <ns0:tcPr>
-            <ns0:tcW ns0:w="4874" ns0:type="dxa"/>
-          </ns0:tcPr>
-          <ns0:p ns2:paraId="158E5862" ns2:textId="77777777" ns0:rsidR="00C421DB" ns0:rsidRDefault="00000000">
-            <ns0:pPr>
-              <ns0:spacing ns0:after="80"/>
-            </ns0:pPr>
-            <ns0:r>
-              <ns0:rPr>
-                <ns0:sz ns0:val="20"/>
-              </ns0:rPr>
-              <ns0:t>It only asks for a topic, type of idea and optional reason. The visitor sends it from their own email app. [10, 11]</ns0:t>
-            </ns0:r>
-          </ns0:p>
-        </ns0:tc>
-      </ns0:tr>
-      <ns0:tr ns0:rsidR="00C421DB" ns2:paraId="46D202A9" ns2:textId="77777777">
-        <ns0:trPr>
-          <ns0:cantSplit/>
-        </ns0:trPr>
-        <ns0:tc>
-          <ns0:tcPr>
-            <ns0:tcW ns0:w="4874" ns0:type="dxa"/>
-          </ns0:tcPr>
-          <ns0:p ns2:paraId="33F67755" ns2:textId="77777777" ns0:rsidR="00C421DB" ns0:rsidRDefault="00000000">
-            <ns0:pPr>
-              <ns0:spacing ns0:after="80"/>
-            </ns0:pPr>
-            <ns0:r>
-              <ns0:rPr>
-                <ns0:sz ns0:val="20"/>
-              </ns0:rPr>
-              <ns0:t>Labels, alt text, captions and keyboard controls</ns0:t>
-            </ns0:r>
-          </ns0:p>
-        </ns0:tc>
-        <ns0:tc>
-          <ns0:tcPr>
-            <ns0:tcW ns0:w="4874" ns0:type="dxa"/>
-          </ns0:tcPr>
-          <ns0:p ns2:paraId="114CB540" ns2:textId="77777777" ns0:rsidR="00C421DB" ns0:rsidRDefault="00000000">
-            <ns0:pPr>
-              <ns0:spacing ns0:after="80"/>
-            </ns0:pPr>
-            <ns0:r>
-              <ns0:rPr>
-                <ns0:sz ns0:val="20"/>
-              </ns0:rPr>
-              <ns0:t>These make the content easier to use with a keyboard, screen reader or without sound. [11]</ns0:t>
-            </ns0:r>
-          </ns0:p>
-        </ns0:tc>
-      </ns0:tr>
-    </ns0:tbl>
-    <ns0:p ns2:paraId="01BCDFE5" ns2:textId="77777777" ns0:rsidR="00C421DB" ns0:rsidRDefault="00000000">
-      <ns0:pPr>
-        <ns0:pStyle ns0:val="Heading2"/>
-      </ns0:pPr>
-      <ns0:r>
-        <ns0:t>Site map and page plan</ns0:t>
-      </ns0:r>
-    </ns0:p>
-    <ns0:p ns2:paraId="45E60725" ns2:textId="77777777" ns0:rsidR="00C421DB" ns0:rsidRDefault="00000000">
-      <ns0:r>
-        <ns0:rPr>
-          <ns0:noProof/>
-        </ns0:rPr>
-        <ns0:drawing>
-          <ns3:inline distT="0" distB="0" distL="0" distR="0" ns4:anchorId="68DE24DE" ns4:editId="2D394CCA">
-            <ns3:extent cx="6035040" cy="2042629"/>
-            <ns3:effectExtent l="0" t="0" r="0" b="0"/>
-            <ns3:docPr id="1" name="Picture 1" descr="Home, Explore and Request are connected through the shared navigation."/>
-            <ns3:cNvGraphicFramePr>
-              <ns5:graphicFrameLocks noChangeAspect="1"/>
-            </ns3:cNvGraphicFramePr>
-            <ns5:graphic>
-              <ns5:graphicData uri="http://schemas.openxmlformats.org/drawingml/2006/picture">
-                <ns6:pic>
-                  <ns6:nvPicPr>
-                    <ns6:cNvPr id="0" name="site-map.png"/>
-                    <ns6:cNvPicPr/>
-                  </ns6:nvPicPr>
-                  <ns6:blipFill>
-                    <ns5:blip ns7:embed="rId8"/>
-                    <ns5:stretch>
-                      <ns5:fillRect/>
-                    </ns5:stretch>
-                  </ns6:blipFill>
-                  <ns6:spPr>
-                    <ns5:xfrm>
-                      <ns5:off x="0" y="0"/>
-                      <ns5:ext cx="6035040" cy="2042629"/>
-                    </ns5:xfrm>
-                    <ns5:prstGeom prst="rect">
-                      <ns5:avLst/>
-                    </ns5:prstGeom>
-                  </ns6:spPr>
-                </ns6:pic>
-              </ns5:graphicData>
-            </ns5:graphic>
-          </ns3:inline>
-        </ns0:drawing>
-      </ns0:r>
-    </ns0:p>
-    <ns0:p ns2:paraId="24ACDDB4" ns2:textId="77777777" ns0:rsidR="00C421DB" ns0:rsidRDefault="00000000">
-      <ns0:r>
-        <ns0:t>All three pages share the same navigation. Explore has genre shortcuts, and on a phone the links open inside Menu.</ns0:t>
-      </ns0:r>
-    </ns0:p>
-    <ns0:tbl>
-      <ns0:tblPr>
-        <ns0:tblStyle ns0:val="TableGrid"/>
-        <ns0:tblW ns0:w="0" ns0:type="auto"/>
-        <ns0:tblLook ns0:val="04A0" ns0:firstRow="1" ns0:lastRow="0" ns0:firstColumn="1" ns0:lastColumn="0" ns0:noHBand="0" ns0:noVBand="1"/>
-      </ns0:tblPr>
-      <ns0:tblGrid>
-        <ns0:gridCol ns0:w="4874"/>
-        <ns0:gridCol ns0:w="4874"/>
-      </ns0:tblGrid>
-      <ns0:tr ns0:rsidR="00C421DB" ns2:paraId="21217728" ns2:textId="77777777">
-        <ns0:trPr>
-          <ns0:cantSplit/>
-        </ns0:trPr>
-        <ns0:tc>
-          <ns0:tcPr>
-            <ns0:tcW ns0:w="4874" ns0:type="dxa"/>
-          </ns0:tcPr>
-          <ns0:p ns2:paraId="16C202E8" ns2:textId="77777777" ns0:rsidR="00C421DB" ns0:rsidRDefault="00000000">
-            <ns0:pPr>
-              <ns0:spacing ns0:after="80"/>
-            </ns0:pPr>
-            <ns0:r>
-              <ns0:rPr>
-                <ns0:sz ns0:val="20"/>
-              </ns0:rPr>
-              <ns0:t>Page</ns0:t>
-            </ns0:r>
-          </ns0:p>
-        </ns0:tc>
-        <ns0:tc>
-          <ns0:tcPr>
-            <ns0:tcW ns0:w="4874" ns0:type="dxa"/>
-          </ns0:tcPr>
-          <ns0:p ns2:paraId="2BF640D2" ns2:textId="77777777" ns0:rsidR="00C421DB" ns0:rsidRDefault="00000000">
-            <ns0:pPr>
-              <ns0:spacing ns0:after="80"/>
-            </ns0:pPr>
-            <ns0:r>
-              <ns0:rPr>
-                <ns0:sz ns0:val="20"/>
-              </ns0:rPr>
-              <ns0:t>Content and features</ns0:t>
-            </ns0:r>
-          </ns0:p>
-        </ns0:tc>
-      </ns0:tr>
-      <ns0:tr ns0:rsidR="00C421DB" ns2:paraId="0FE11541" ns2:textId="77777777">
-        <ns0:trPr>
-          <ns0:cantSplit/>
-        </ns0:trPr>
-        <ns0:tc>
-          <ns0:tcPr>
-            <ns0:tcW ns0:w="4874" ns0:type="dxa"/>
-          </ns0:tcPr>
-          <ns0:p ns2:paraId="1BE4FC38" ns2:textId="77777777" ns0:rsidR="00C421DB" ns0:rsidRDefault="00000000">
-            <ns0:pPr>
-              <ns0:spacing ns0:after="80"/>
-            </ns0:pPr>
-            <ns0:r>
-              <ns0:rPr>
-                <ns0:sz ns0:val="20"/>
-              </ns0:rPr>
-              <ns0:t>Home</ns0:t>
-            </ns0:r>
-            <ns0:r>
-              <ns0:rPr>
-                <ns0:sz ns0:val="20"/>
-              </ns0:rPr>
-              <ns0:br/>
-              <ns0:t>index.html</ns0:t>
-            </ns0:r>
-          </ns0:p>
-        </ns0:tc>
-        <ns0:tc>
-          <ns0:tcPr>
-            <ns0:tcW ns0:w="4874" ns0:type="dxa"/>
-          </ns0:tcPr>
-          <ns0:p ns2:paraId="3AACBD25" ns2:textId="77777777" ns0:rsidR="00C421DB" ns0:rsidRDefault="00000000">
-            <ns0:pPr>
-              <ns0:spacing ns0:after="80"/>
-            </ns0:pPr>
-            <ns0:r>
-              <ns0:rPr>
-                <ns0:sz ns0:val="20"/>
-              </ns0:rPr>
-              <ns0:t>Introduction, genre cards, short timeline and video with captions and written text.</ns0:t>
-            </ns0:r>
-          </ns0:p>
-        </ns0:tc>
-      </ns0:tr>
-      <ns0:tr ns0:rsidR="00C421DB" ns2:paraId="50CBE5DD" ns2:textId="77777777">
-        <ns0:trPr>
-          <ns0:cantSplit/>
-        </ns0:trPr>
-        <ns0:tc>
-          <ns0:tcPr>
-            <ns0:tcW ns0:w="4874" ns0:type="dxa"/>
-          </ns0:tcPr>
-          <ns0:p ns2:paraId="48F905CD" ns2:textId="77777777" ns0:rsidR="00C421DB" ns0:rsidRDefault="00000000">
-            <ns0:pPr>
-              <ns0:spacing ns0:after="80"/>
-            </ns0:pPr>
-            <ns0:r>
-              <ns0:rPr>
-                <ns0:sz ns0:val="20"/>
-              </ns0:rPr>
-              <ns0:lastRenderedPageBreak/>
-              <ns0:t>Explore</ns0:t>
-            </ns0:r>
-            <ns0:r>
-              <ns0:rPr>
-                <ns0:sz ns0:val="20"/>
-              </ns0:rPr>
-              <ns0:br/>
-              <ns0:t>explore.html</ns0:t>
-            </ns0:r>
-          </ns0:p>
-        </ns0:tc>
-        <ns0:tc>
-          <ns0:tcPr>
-            <ns0:tcW ns0:w="4874" ns0:type="dxa"/>
-          </ns0:tcPr>
-          <ns0:p ns2:paraId="1460633D" ns2:textId="77777777" ns0:rsidR="00C421DB" ns0:rsidRDefault="00000000">
-            <ns0:pPr>
-              <ns0:spacing ns0:after="80"/>
-            </ns0:pPr>
-            <ns0:r>
-              <ns0:rPr>
-                <ns0:sz ns0:val="20"/>
-              </ns0:rPr>
-              <ns0:t>Artist cards, genre buttons, search, extra facts, larger photos and official listening links.</ns0:t>
-            </ns0:r>
-          </ns0:p>
-        </ns0:tc>
-      </ns0:tr>
-      <ns0:tr ns0:rsidR="00C421DB" ns2:paraId="1659BBA5" ns2:textId="77777777">
-        <ns0:trPr>
-          <ns0:cantSplit/>
-        </ns0:trPr>
-        <ns0:tc>
-          <ns0:tcPr>
-            <ns0:tcW ns0:w="4874" ns0:type="dxa"/>
-          </ns0:tcPr>
-          <ns0:p ns2:paraId="393E2CCC" ns2:textId="77777777" ns0:rsidR="00C421DB" ns0:rsidRDefault="00000000">
-            <ns0:pPr>
-              <ns0:spacing ns0:after="80"/>
-            </ns0:pPr>
-            <ns0:r>
-              <ns0:rPr>
-                <ns0:sz ns0:val="20"/>
-              </ns0:rPr>
-              <ns0:t>Request</ns0:t>
-            </ns0:r>
-            <ns0:r>
-              <ns0:rPr>
-                <ns0:sz ns0:val="20"/>
-              </ns0:rPr>
-              <ns0:br/>
-              <ns0:t>request.html</ns0:t>
-            </ns0:r>
-          </ns0:p>
-        </ns0:tc>
-        <ns0:tc>
-          <ns0:tcPr>
-            <ns0:tcW ns0:w="4874" ns0:type="dxa"/>
-          </ns0:tcPr>
-          <ns0:p ns2:paraId="21495BF6" ns2:textId="77777777" ns0:rsidR="00C421DB" ns0:rsidRDefault="00000000">
-            <ns0:pPr>
-              <ns0:spacing ns0:after="80"/>
-            </ns0:pPr>
-            <ns0:r>
-              <ns0:rPr>
-                <ns0:sz ns0:val="20"/>
-              </ns0:rPr>
-              <ns0:t>Topic request form, privacy, credits and accessibility information.</ns0:t>
-            </ns0:r>
-          </ns0:p>
-        </ns0:tc>
-      </ns0:tr>
-    </ns0:tbl>
-    <ns0:p ns2:paraId="0B80632A" ns2:textId="77777777" ns0:rsidR="00C421DB" ns0:rsidRDefault="00000000">
-      <ns0:r>
-        <ns0:t>Home is the starting point, Explore has the music and Request is for suggestions. Search ignores capital letters and extra spaces. If there is no result, the genre buttons are still there to browse from.</ns0:t>
-      </ns0:r>
-    </ns0:p>
-    <ns0:p ns2:paraId="30E7D3F1" ns2:textId="11EE3605" ns0:rsidR="00C421DB" ns0:rsidRDefault="00000000" ns0:rsidP="009A26F4">
-      <ns0:pPr>
-        <ns0:pStyle ns0:val="Heading2"/>
-      </ns0:pPr>
-      <ns0:r>
-        <ns0:t>Sources</ns0:t>
-      </ns0:r>
-    </ns0:p>
-    <ns0:p ns2:paraId="48BA8643" ns2:textId="2B158EDC" ns0:rsidR="00C421DB" ns0:rsidRDefault="00000000">
-      <ns0:r>
-        <ns0:rPr>
-          <ns0:sz ns0:val="20"/>
-        </ns0:rPr>
-        <ns0:t>[</ns0:t>
-      </ns0:r>
-      <ns0:r ns0:rsidR="009A26F4">
-        <ns0:rPr>
-          <ns0:sz ns0:val="20"/>
-        </ns0:rPr>
-        <ns0:t>1</ns0:t>
-      </ns0:r>
-      <ns0:r>
-        <ns0:rPr>
-          <ns0:sz ns0:val="20"/>
-        </ns0:rPr>
-        <ns0:t>] TheGreat70s, homepage. https://thegreat70s.com/</ns0:t>
-      </ns0:r>
-    </ns0:p>
-    <ns0:p ns2:paraId="36BD9DA5" ns2:textId="0FB68A57" ns0:rsidR="00C421DB" ns0:rsidRDefault="00000000">
-      <ns0:r>
-        <ns0:rPr>
-          <ns0:sz ns0:val="20"/>
-        </ns0:rPr>
-        <ns0:t>[</ns0:t>
-      </ns0:r>
-      <ns0:r ns0:rsidR="009A26F4">
-        <ns0:rPr>
-          <ns0:sz ns0:val="20"/>
-        </ns0:rPr>
-        <ns0:t>2</ns0:t>
-      </ns0:r>
-      <ns0:r>
-        <ns0:rPr>
-          <ns0:sz ns0:val="20"/>
-        </ns0:rPr>
-        <ns0:t>] ABBA, official homepage. https://abbasite.com/</ns0:t>
-      </ns0:r>
-    </ns0:p>
-    <ns0:p ns2:paraId="23558C99" ns2:textId="584C9C0A" ns0:rsidR="00C421DB" ns0:rsidRDefault="00000000">
-      <ns0:r>
-        <ns0:rPr>
-          <ns0:sz ns0:val="20"/>
-        </ns0:rPr>
-        <ns0:t>[</ns0:t>
-      </ns0:r>
-      <ns0:r ns0:rsidR="009A26F4">
-        <ns0:rPr>
-          <ns0:sz ns0:val="20"/>
-        </ns0:rPr>
-        <ns0:t>3</ns0:t>
-      </ns0:r>
-      <ns0:r>
-        <ns0:rPr>
-          <ns0:sz ns0:val="20"/>
-        </ns0:rPr>
-        <ns0:t>] Rock &amp; Roll Hall of Fame, artist directory. https://rockhall.com/inductees/inductees/</ns0:t>
-      </ns0:r>
-    </ns0:p>
-    <ns0:p ns2:paraId="23FF9244" ns2:textId="57034E75" ns0:rsidR="00C421DB" ns0:rsidRDefault="00000000">
-      <ns0:r>
-        <ns0:rPr>
-          <ns0:sz ns0:val="20"/>
-        </ns0:rPr>
-        <ns0:t>[</ns0:t>
-      </ns0:r>
-      <ns0:r ns0:rsidR="009A26F4">
-        <ns0:rPr>
-          <ns0:sz ns0:val="20"/>
-        </ns0:rPr>
-        <ns0:t>4</ns0:t>
-      </ns0:r>
-      <ns0:r>
-        <ns0:rPr>
-          <ns0:sz ns0:val="20"/>
-        </ns0:rPr>
-        <ns0:t>] ABBA, The Story. https://abbasite.com/story/</ns0:t>
-      </ns0:r>
-    </ns0:p>
-    <ns0:p ns2:paraId="1E9AF586" ns2:textId="6CBE0F8D" ns0:rsidR="00C421DB" ns0:rsidRDefault="00000000">
-      <ns0:r>
-        <ns0:rPr>
-          <ns0:sz ns0:val="20"/>
-        </ns0:rPr>
-        <ns0:t>[</ns0:t>
-      </ns0:r>
-      <ns0:r ns0:rsidR="009A26F4">
-        <ns0:rPr>
-          <ns0:sz ns0:val="20"/>
-        </ns0:rPr>
-        <ns0:t>5</ns0:t>
-      </ns0:r>
-      <ns0:r>
-        <ns0:rPr>
-          <ns0:sz ns0:val="20"/>
-        </ns0:rPr>
-        <ns0:t>] ABBA, In Focus: Dancing Queen. https://abbasite.com/articles/dancing-queen/</ns0:t>
-      </ns0:r>
-    </ns0:p>
-    <ns0:p ns2:paraId="39C9DFB6" ns2:textId="2AA70B11" ns0:rsidR="00C421DB" ns0:rsidRDefault="00000000">
-      <ns0:r>
-        <ns0:rPr>
-          <ns0:sz ns0:val="20"/>
-        </ns0:rPr>
-        <ns0:t>[</ns0:t>
-      </ns0:r>
-      <ns0:r ns0:rsidR="009A26F4">
-        <ns0:rPr>
-          <ns0:sz ns0:val="20"/>
-        </ns0:rPr>
-        <ns0:t>6</ns0:t>
-      </ns0:r>
-      <ns0:r>
-        <ns0:rPr>
-          <ns0:sz ns0:val="20"/>
-        </ns0:rPr>
-        <ns0:t>] Rock &amp; Roll Hall of Fame, David Bowie. https://rockhall.com/inductees/david-bowie/</ns0:t>
-      </ns0:r>
-    </ns0:p>
-    <ns0:p ns2:paraId="10980E47" ns2:textId="3E12FBFF" ns0:rsidR="00C421DB" ns0:rsidRDefault="00000000">
-      <ns0:r>
-        <ns0:rPr>
-          <ns0:sz ns0:val="20"/>
-        </ns0:rPr>
-        <ns0:t>[</ns0:t>
-      </ns0:r>
-      <ns0:r ns0:rsidR="009A26F4">
-        <ns0:rPr>
-          <ns0:sz ns0:val="20"/>
-        </ns0:rPr>
-        <ns0:t>7</ns0:t>
-      </ns0:r>
-      <ns0:r>
-        <ns0:rPr>
-          <ns0:sz ns0:val="20"/>
-        </ns0:rPr>
-        <ns0:t>] Official Charts, I Feel Love - Donna Summer. https://www.officialcharts.com/songs/donna-summer-i-feel-love/</ns0:t>
-      </ns0:r>
-    </ns0:p>
-    <ns0:p ns2:paraId="3468865F" ns2:textId="76E98C7B" ns0:rsidR="00C421DB" ns0:rsidRDefault="00000000">
-      <ns0:r>
-        <ns0:rPr>
-          <ns0:sz ns0:val="20"/>
-        </ns0:rPr>
-        <ns0:t>[</ns0:t>
-      </ns0:r>
-      <ns0:r ns0:rsidR="009A26F4">
-        <ns0:rPr>
-          <ns0:sz ns0:val="20"/>
-        </ns0:rPr>
-        <ns0:t>8</ns0:t>
-      </ns0:r>
-      <ns0:r>
-        <ns0:rPr>
-          <ns0:sz ns0:val="20"/>
-        </ns0:rPr>
-        <ns0:t>] GOV.UK, Using somebody else's intellectual property: Copyright. https://www.gov.uk/using-somebody-elses-intellectual-property/copyright</ns0:t>
-      </ns0:r>
-    </ns0:p>
-    <ns0:p ns2:paraId="28F7B66A" ns2:textId="374AC906" ns0:rsidR="00C421DB" ns0:rsidRDefault="00000000">
-      <ns0:r>
-        <ns0:rPr>
-          <ns0:sz ns0:val="20"/>
-        </ns0:rPr>
-        <ns0:t>[</ns0:t>
-      </ns0:r>
-      <ns0:r ns0:rsidR="009A26F4">
-        <ns0:rPr>
-          <ns0:sz ns0:val="20"/>
-        </ns0:rPr>
-        <ns0:t>9</ns0:t>
-      </ns0:r>
-      <ns0:r>
-        <ns0:rPr>
-          <ns0:sz ns0:val="20"/>
-        </ns0:rPr>
-        <ns0:t>] ICO, Cookies and privacy notices in detail. Guidance marked under review. https://ico.org.uk/for-organisations/advice-for-small-organisations/privacy-notices-and-cookies/cookies-and-privacy-notices-in-detail/</ns0:t>
-      </ns0:r>
-    </ns0:p>
-    <ns0:p ns2:paraId="421DDA6C" ns2:textId="0CF76D0A" ns0:rsidR="00C421DB" ns0:rsidRDefault="00000000">
-      <ns0:r>
-        <ns0:rPr>
-          <ns0:sz ns0:val="20"/>
-        </ns0:rPr>
-        <ns0:t>[1</ns0:t>
-      </ns0:r>
-      <ns0:r ns0:rsidR="009A26F4">
-        <ns0:rPr>
-          <ns0:sz ns0:val="20"/>
-        </ns0:rPr>
-        <ns0:t>0</ns0:t>
-      </ns0:r>
-      <ns0:r>
-        <ns0:rPr>
-          <ns0:sz ns0:val="20"/>
-        </ns0:rPr>
-        <ns0:t>] ICO, Children and the UK GDPR. https://ico.org.uk/for-organisations/uk-gdpr-guidance-and-resources/childrens-information/children-and-the-uk-gdpr/</ns0:t>
-      </ns0:r>
-    </ns0:p>
-    <ns0:p ns2:paraId="0E5139E1" ns2:textId="396EE9FD" ns0:rsidR="00C421DB" ns0:rsidRDefault="00000000">
-      <ns0:r>
-        <ns0:rPr>
-          <ns0:sz ns0:val="20"/>
-        </ns0:rPr>
-        <ns0:t>[1</ns0:t>
-      </ns0:r>
-      <ns0:r ns0:rsidR="009A26F4">
-        <ns0:rPr>
-          <ns0:sz ns0:val="20"/>
-        </ns0:rPr>
-        <ns0:t>1</ns0:t>
-      </ns0:r>
-      <ns0:r>
-        <ns0:rPr>
-          <ns0:sz ns0:val="20"/>
-        </ns0:rPr>
-        <ns0:t>] W3C, How to Meet WCAG 2.2. https://www.w3.org/WAI/WCAG22/quickref/</ns0:t>
-      </ns0:r>
-    </ns0:p>
-    <ns0:p ns2:paraId="5D261BA4" ns2:textId="77777777" ns0:rsidR="00C421DB" ns0:rsidRDefault="00000000">
-      <ns0:r>
-        <ns0:br ns0:type="page"/>
-      </ns0:r>
-    </ns0:p>
-    <ns0:p ns2:paraId="19FF578B" ns2:textId="77777777" ns0:rsidR="00C421DB" ns0:rsidRDefault="00000000">
-      <ns0:pPr>
-        <ns0:pStyle ns0:val="Heading1"/>
-      </ns0:pPr>
-      <ns0:r>
-        <ns0:lastRenderedPageBreak/>
-        <ns0:t>Task 2: Designs and assets</ns0:t>
-      </ns0:r>
-    </ns0:p>
-    <ns0:p ns2:paraId="73CE37B9" ns2:textId="77777777" ns0:rsidR="00C421DB" ns0:rsidRDefault="00000000">
-      <ns0:r>
-        <ns0:t>I kept the three pages from my plan. Georgia is used for headings and Arial for the main text, because both are easy to read. I used the same dark blue, gold and pale background on every page so it feels like one site.</ns0:t>
-      </ns0:r>
-    </ns0:p>
-    <ns0:p ns2:paraId="493CB84E" ns2:textId="77777777" ns0:rsidR="00C421DB" ns0:rsidRDefault="00000000">
-      <ns0:r>
-        <ns0:rPr>
-          <ns0:noProof/>
-        </ns0:rPr>
-        <ns0:drawing>
-          <ns3:inline distT="0" distB="0" distL="0" distR="0" ns4:anchorId="0A43A9B1" ns4:editId="60D1A9A4">
-            <ns3:extent cx="4389120" cy="2179425"/>
-            <ns3:effectExtent l="0" t="0" r="0" b="0"/>
-            <ns3:docPr id="2" name="Picture 2" descr="Colours and text styles used across the website."/>
-            <ns3:cNvGraphicFramePr>
-              <ns5:graphicFrameLocks noChangeAspect="1"/>
-            </ns3:cNvGraphicFramePr>
-            <ns5:graphic>
-              <ns5:graphicData uri="http://schemas.openxmlformats.org/drawingml/2006/picture">
-                <ns6:pic>
-                  <ns6:nvPicPr>
-                    <ns6:cNvPr id="0" name="style-sheet.png"/>
-                    <ns6:cNvPicPr/>
-                  </ns6:nvPicPr>
-                  <ns6:blipFill>
-                    <ns5:blip ns7:embed="rId9"/>
-                    <ns5:stretch>
-                      <ns5:fillRect/>
-                    </ns5:stretch>
-                  </ns6:blipFill>
-                  <ns6:spPr>
-                    <ns5:xfrm>
-                      <ns5:off x="0" y="0"/>
-                      <ns5:ext cx="4389120" cy="2179425"/>
-                    </ns5:xfrm>
-                    <ns5:prstGeom prst="rect">
-                      <ns5:avLst/>
-                    </ns5:prstGeom>
-                  </ns6:spPr>
-                </ns6:pic>
-              </ns5:graphicData>
-            </ns5:graphic>
-          </ns3:inline>
-        </ns0:drawing>
-      </ns0:r>
-    </ns0:p>
-    <ns0:p ns2:paraId="39776B2B" ns2:textId="77777777" ns0:rsidR="00C421DB" ns0:rsidRDefault="00000000">
-      <ns0:pPr>
-        <ns0:pStyle ns0:val="Caption"/>
-      </ns0:pPr>
-      <ns0:r>
-        <ns0:t>Colours and text styles used across the website.</ns0:t>
-      </ns0:r>
-    </ns0:p>
-    <ns0:p ns2:paraId="35571A80" ns2:textId="77777777" ns0:rsidR="00C421DB" ns0:rsidRDefault="00000000">
-      <ns0:pPr>
-        <ns0:pStyle ns0:val="Heading2"/>
-      </ns0:pPr>
-      <ns0:r>
-        <ns0:t>Final page designs</ns0:t>
-      </ns0:r>
-    </ns0:p>
-    <ns0:p ns2:paraId="69A07E15" ns2:textId="77777777" ns0:rsidR="00C421DB" ns0:rsidRDefault="00000000">
-      <ns0:r>
-        <ns0:t>The three designs below show the wireframe, finished desktop page and phone layout. Full-size versions are saved in website-design/page-plans and website-design/website.</ns0:t>
-      </ns0:r>
-    </ns0:p>
-    <ns0:tbl>
-      <ns0:tblPr>
-        <ns0:tblStyle ns0:val="TableGrid"/>
-        <ns0:tblW ns0:w="0" ns0:type="auto"/>
-        <ns0:tblLook ns0:val="04A0" ns0:firstRow="1" ns0:lastRow="0" ns0:firstColumn="1" ns0:lastColumn="0" ns0:noHBand="0" ns0:noVBand="1"/>
-      </ns0:tblPr>
-      <ns0:tblGrid>
-        <ns0:gridCol ns0:w="3250"/>
-        <ns0:gridCol ns0:w="3250"/>
-        <ns0:gridCol ns0:w="3250"/>
-      </ns0:tblGrid>
-      <ns0:tr ns0:rsidR="00C421DB" ns2:paraId="4D6AD5B2" ns2:textId="77777777">
-        <ns0:tc>
-          <ns0:tcPr>
-            <ns0:tcW ns0:w="3250" ns0:type="dxa"/>
-          </ns0:tcPr>
-          <ns0:p ns2:paraId="4D11E6CF" ns2:textId="77777777" ns0:rsidR="00C421DB" ns0:rsidRDefault="00000000">
-            <ns0:r>
-              <ns0:t>Home</ns0:t>
-            </ns0:r>
-          </ns0:p>
-          <ns0:p ns2:paraId="42D084B7" ns2:textId="77777777" ns0:rsidR="00C421DB" ns0:rsidRDefault="00000000">
-            <ns0:r>
-              <ns0:rPr>
-                <ns0:noProof/>
-              </ns0:rPr>
-              <ns0:drawing>
-                <ns3:inline distT="0" distB="0" distL="0" distR="0" ns4:anchorId="6665D736" ns4:editId="6BFE1C44">
-                  <ns3:extent cx="1737360" cy="1485443"/>
-                  <ns3:effectExtent l="0" t="0" r="0" b="0"/>
-                  <ns3:docPr id="3" name="Picture 3"/>
-                  <ns3:cNvGraphicFramePr>
-                    <ns5:graphicFrameLocks noChangeAspect="1"/>
-                  </ns3:cNvGraphicFramePr>
-                  <ns5:graphic>
-                    <ns5:graphicData uri="http://schemas.openxmlformats.org/drawingml/2006/picture">
-                      <ns6:pic>
-                        <ns6:nvPicPr>
-                          <ns6:cNvPr id="0" name="home-sheet.png"/>
-                          <ns6:cNvPicPr/>
-                        </ns6:nvPicPr>
-                        <ns6:blipFill>
-                          <ns5:blip ns7:embed="rId10"/>
-                          <ns5:stretch>
-                            <ns5:fillRect/>
-                          </ns5:stretch>
-                        </ns6:blipFill>
-                        <ns6:spPr>
-                          <ns5:xfrm>
-                            <ns5:off x="0" y="0"/>
-                            <ns5:ext cx="1737360" cy="1485443"/>
-                          </ns5:xfrm>
-                          <ns5:prstGeom prst="rect">
-                            <ns5:avLst/>
-                          </ns5:prstGeom>
-                        </ns6:spPr>
-                      </ns6:pic>
-                    </ns5:graphicData>
-                  </ns5:graphic>
-                </ns3:inline>
-              </ns0:drawing>
-            </ns0:r>
-          </ns0:p>
-        </ns0:tc>
-        <ns0:tc>
-          <ns0:tcPr>
-            <ns0:tcW ns0:w="3250" ns0:type="dxa"/>
-          </ns0:tcPr>
-          <ns0:p ns2:paraId="54804170" ns2:textId="77777777" ns0:rsidR="00C421DB" ns0:rsidRDefault="00000000">
-            <ns0:r>
-              <ns0:t>Explore</ns0:t>
-            </ns0:r>
-          </ns0:p>
-          <ns0:p ns2:paraId="575B412D" ns2:textId="77777777" ns0:rsidR="00C421DB" ns0:rsidRDefault="00000000">
-            <ns0:r>
-              <ns0:rPr>
-                <ns0:noProof/>
-              </ns0:rPr>
-              <ns0:drawing>
-                <ns3:inline distT="0" distB="0" distL="0" distR="0" ns4:anchorId="0E8F3AE4" ns4:editId="27D2FCBE">
-                  <ns3:extent cx="1737360" cy="1485443"/>
-                  <ns3:effectExtent l="0" t="0" r="0" b="0"/>
-                  <ns3:docPr id="4" name="Picture 4"/>
-                  <ns3:cNvGraphicFramePr>
-                    <ns5:graphicFrameLocks noChangeAspect="1"/>
-                  </ns3:cNvGraphicFramePr>
-                  <ns5:graphic>
-                    <ns5:graphicData uri="http://schemas.openxmlformats.org/drawingml/2006/picture">
-                      <ns6:pic>
-                        <ns6:nvPicPr>
-                          <ns6:cNvPr id="0" name="explore-sheet.png"/>
-                          <ns6:cNvPicPr/>
-                        </ns6:nvPicPr>
-                        <ns6:blipFill>
-                          <ns5:blip ns7:embed="rId11"/>
-                          <ns5:stretch>
-                            <ns5:fillRect/>
-                          </ns5:stretch>
-                        </ns6:blipFill>
-                        <ns6:spPr>
-                          <ns5:xfrm>
-                            <ns5:off x="0" y="0"/>
-                            <ns5:ext cx="1737360" cy="1485443"/>
-                          </ns5:xfrm>
-                          <ns5:prstGeom prst="rect">
-                            <ns5:avLst/>
-                          </ns5:prstGeom>
-                        </ns6:spPr>
-                      </ns6:pic>
-                    </ns5:graphicData>
-                  </ns5:graphic>
-                </ns3:inline>
-              </ns0:drawing>
-            </ns0:r>
-          </ns0:p>
-        </ns0:tc>
-        <ns0:tc>
-          <ns0:tcPr>
-            <ns0:tcW ns0:w="3250" ns0:type="dxa"/>
-          </ns0:tcPr>
-          <ns0:p ns2:paraId="62E02CDE" ns2:textId="77777777" ns0:rsidR="00C421DB" ns0:rsidRDefault="00000000">
-            <ns0:r>
-              <ns0:t>Request</ns0:t>
-            </ns0:r>
-          </ns0:p>
-          <ns0:p ns2:paraId="4D263277" ns2:textId="77777777" ns0:rsidR="00C421DB" ns0:rsidRDefault="00000000">
-            <ns0:r>
-              <ns0:rPr>
-                <ns0:noProof/>
-              </ns0:rPr>
-              <ns0:drawing>
-                <ns3:inline distT="0" distB="0" distL="0" distR="0" ns4:anchorId="6436DC8A" ns4:editId="27B779F8">
-                  <ns3:extent cx="1737360" cy="1485443"/>
-                  <ns3:effectExtent l="0" t="0" r="0" b="0"/>
-                  <ns3:docPr id="5" name="Picture 5"/>
-                  <ns3:cNvGraphicFramePr>
-                    <ns5:graphicFrameLocks noChangeAspect="1"/>
-                  </ns3:cNvGraphicFramePr>
-                  <ns5:graphic>
-                    <ns5:graphicData uri="http://schemas.openxmlformats.org/drawingml/2006/picture">
-                      <ns6:pic>
-                        <ns6:nvPicPr>
-                          <ns6:cNvPr id="0" name="request-sheet.png"/>
-                          <ns6:cNvPicPr/>
-                        </ns6:nvPicPr>
-                        <ns6:blipFill>
-                          <ns5:blip ns7:embed="rId12"/>
-                          <ns5:stretch>
-                            <ns5:fillRect/>
-                          </ns5:stretch>
-                        </ns6:blipFill>
-                        <ns6:spPr>
-                          <ns5:xfrm>
-                            <ns5:off x="0" y="0"/>
-                            <ns5:ext cx="1737360" cy="1485443"/>
-                          </ns5:xfrm>
-                          <ns5:prstGeom prst="rect">
-                            <ns5:avLst/>
-                          </ns5:prstGeom>
-                        </ns6:spPr>
-                      </ns6:pic>
-                    </ns5:graphicData>
-                  </ns5:graphic>
-                </ns3:inline>
-              </ns0:drawing>
-            </ns0:r>
-          </ns0:p>
-        </ns0:tc>
-      </ns0:tr>
-    </ns0:tbl>
-    <ns0:p ns2:paraId="1694FF09" ns2:textId="77777777" ns0:rsidR="00C421DB" ns0:rsidRDefault="00000000">
-      <ns0:r>
-        <ns0:t>Home gives a quick way into the music. Explore keeps each artist, photo and song together, with extra facts hidden in accordions. Request uses a short labelled form. On a phone, the content becomes one column and the page links go inside Menu.</ns0:t>
-      </ns0:r>
-    </ns0:p>
-    <ns0:p ns2:paraId="6D08A8ED" ns2:textId="77777777" ns0:rsidR="00C421DB" ns0:rsidRDefault="00000000">
-      <ns0:pPr>
-        <ns0:pStyle ns0:val="Heading2"/>
-      </ns0:pPr>
-      <ns0:r>
-        <ns0:lastRenderedPageBreak/>
-        <ns0:t>Important states</ns0:t>
-      </ns0:r>
-    </ns0:p>
-    <ns0:p ns2:paraId="00456FD5" ns2:textId="77777777" ns0:rsidR="00C421DB" ns0:rsidRDefault="00000000">
-      <ns0:r>
-        <ns0:rPr>
-          <ns0:noProof/>
-        </ns0:rPr>
-        <ns0:drawing>
-          <ns3:inline distT="0" distB="0" distL="0" distR="0" ns4:anchorId="44CEDEC8" ns4:editId="4F4587A1">
-            <ns3:extent cx="3474720" cy="6344079"/>
-            <ns3:effectExtent l="0" t="0" r="0" b="0"/>
-            <ns3:docPr id="6" name="Picture 6" descr="Drop-down, search, image popup and form messages."/>
-            <ns3:cNvGraphicFramePr>
-              <ns5:graphicFrameLocks noChangeAspect="1"/>
-            </ns3:cNvGraphicFramePr>
-            <ns5:graphic>
-              <ns5:graphicData uri="http://schemas.openxmlformats.org/drawingml/2006/picture">
-                <ns6:pic>
-                  <ns6:nvPicPr>
-                    <ns6:cNvPr id="0" name="states-desktop.png"/>
-                    <ns6:cNvPicPr/>
-                  </ns6:nvPicPr>
-                  <ns6:blipFill>
-                    <ns5:blip ns7:embed="rId13"/>
-                    <ns5:stretch>
-                      <ns5:fillRect/>
-                    </ns5:stretch>
-                  </ns6:blipFill>
-                  <ns6:spPr>
-                    <ns5:xfrm>
-                      <ns5:off x="0" y="0"/>
-                      <ns5:ext cx="3474720" cy="6344079"/>
-                    </ns5:xfrm>
-                    <ns5:prstGeom prst="rect">
-                      <ns5:avLst/>
-                    </ns5:prstGeom>
-                  </ns6:spPr>
-                </ns6:pic>
-              </ns5:graphicData>
-            </ns5:graphic>
-          </ns3:inline>
-        </ns0:drawing>
-      </ns0:r>
-    </ns0:p>
-    <ns0:p ns2:paraId="02DFE8DE" ns2:textId="77777777" ns0:rsidR="00C421DB" ns0:rsidRDefault="00000000">
-      <ns0:pPr>
-        <ns0:pStyle ns0:val="Caption"/>
-      </ns0:pPr>
-      <ns0:r>
-        <ns0:t>Drop-down, search, image popup and form messages.</ns0:t>
-      </ns0:r>
-    </ns0:p>
-    <ns0:p ns2:paraId="62F53FC0" ns2:textId="77777777" ns0:rsidR="00C421DB" ns0:rsidRDefault="00000000">
-      <ns0:r>
-        <ns0:t>The Explore menu links to each genre. Search stays on Explore. A blank search gives help and no matches gives a way back to all artists. The image popup has a Close button and keyboard support. The request button checks the required boxes, then opens a pre-filled email for the visitor to send.</ns0:t>
-      </ns0:r>
-    </ns0:p>
-    <ns0:p ns2:paraId="759B8C51" ns2:textId="77777777" ns0:rsidR="00C421DB" ns0:rsidRDefault="00000000">
-      <ns0:pPr>
-        <ns0:pStyle ns0:val="Heading2"/>
-      </ns0:pPr>
-      <ns0:r>
-        <ns0:lastRenderedPageBreak/>
-        <ns0:t>Review and assets</ns0:t>
-      </ns0:r>
-    </ns0:p>
-    <ns0:p ns2:paraId="6B62E8B3" ns2:textId="77777777" ns0:rsidR="00C421DB" ns0:rsidRDefault="00000000">
-      <ns0:r>
-        <ns0:rPr>
-          <ns0:noProof/>
-        </ns0:rPr>
-        <ns0:drawing>
-          <ns3:inline distT="0" distB="0" distL="0" distR="0" ns4:anchorId="397117AF" ns4:editId="42A67981">
-            <ns3:extent cx="2926080" cy="3483429"/>
-            <ns3:effectExtent l="0" t="0" r="0" b="0"/>
-            <ns3:docPr id="7" name="Picture 7" descr="First Home phone layout compared with the revised layout."/>
-            <ns3:cNvGraphicFramePr>
-              <ns5:graphicFrameLocks noChangeAspect="1"/>
-            </ns3:cNvGraphicFramePr>
-            <ns5:graphic>
-              <ns5:graphicData uri="http://schemas.openxmlformats.org/drawingml/2006/picture">
-                <ns6:pic>
-                  <ns6:nvPicPr>
-                    <ns6:cNvPr id="0" name="home-comparison.png"/>
-                    <ns6:cNvPicPr/>
-                  </ns6:nvPicPr>
-                  <ns6:blipFill>
-                    <ns5:blip ns7:embed="rId14"/>
-                    <ns5:stretch>
-                      <ns5:fillRect/>
-                    </ns5:stretch>
-                  </ns6:blipFill>
-                  <ns6:spPr>
-                    <ns5:xfrm>
-                      <ns5:off x="0" y="0"/>
-                      <ns5:ext cx="2926080" cy="3483429"/>
-                    </ns5:xfrm>
-                    <ns5:prstGeom prst="rect">
-                      <ns5:avLst/>
-                    </ns5:prstGeom>
-                  </ns6:spPr>
-                </ns6:pic>
-              </ns5:graphicData>
-            </ns5:graphic>
-          </ns3:inline>
-        </ns0:drawing>
-      </ns0:r>
-    </ns0:p>
-    <ns0:p ns2:paraId="4C85FCCF" ns2:textId="77777777" ns0:rsidR="00C421DB" ns0:rsidRDefault="00000000">
-      <ns0:pPr>
-        <ns0:pStyle ns0:val="Caption"/>
-      </ns0:pPr>
-      <ns0:r>
-        <ns0:t>First Home phone layout compared with the revised layout.</ns0:t>
-      </ns0:r>
-    </ns0:p>
-    <ns0:p ns2:paraId="4B406CB0" ns2:textId="77777777" ns0:rsidR="00C421DB" ns0:rsidRDefault="00000000">
-      <ns0:r>
-        <ns0:t>In my first Home design, the heading and record took up too much room, so the genre cards were too far down on a phone. I made the heading smaller and removed the fixed height. The cards now appear much sooner.</ns0:t>
-      </ns0:r>
-    </ns0:p>
-    <ns0:p ns2:paraId="01966D77" ns2:textId="77777777" ns0:rsidR="00C421DB" ns0:rsidRDefault="00000000">
-      <ns0:r>
-        <ns0:t>The pages fitted both screen sizes and the links stayed in the same place. I also checked the popup with a keyboard. Explore has seven artists from different styles, and videos only load when someone presses Play.</ns0:t>
-      </ns0:r>
-    </ns0:p>
-    <ns0:p ns2:paraId="02F21353" ns2:textId="2FE2F11C" ns0:rsidR="00C421DB" ns0:rsidRDefault="00000000">
-      <ns0:r>
-        <ns0:t xml:space="preserve">The logo and record illustrations were made in Canva, then saved as SVG files for the website. I used credited artist photos, </ns0:t>
-      </ns0:r>
-      <ns0:proofErr ns0:type="spellStart"/>
-      <ns0:r>
-        <ns0:t>Lucide</ns0:t>
-      </ns0:r>
-      <ns0:proofErr ns0:type="spellEnd"/>
-      <ns0:r>
-        <ns0:t xml:space="preserve"> icons</ns0:t>
-      </ns0:r>
-      <ns0:r ns0:rsidR="00D43AA3">
-        <ns0:t xml:space="preserve"> </ns0:t>
-      </ns0:r>
-      <ns0:r ns0:rsidR="00D43AA3">
-        <ns0:t>[12]</ns0:t>
-      </ns0:r>
-      <ns0:r>
-        <ns0:t xml:space="preserve"> and official YouTube embeds. The video has original title cards and script, an ElevenLabs voiceover, captions and a written transcript. </ns0:t>
-      </ns0:r>
-    </ns0:p>
-    <ns0:p ns2:paraId="1BDC0743" ns2:textId="4371AB79" ns0:rsidR="00C421DB" ns0:rsidRDefault="00000000">
-      <ns0:r>
-        <ns0:t xml:space="preserve">[12] </ns0:t>
-      </ns0:r>
-      <ns0:proofErr ns0:type="spellStart"/>
-      <ns0:r>
-        <ns0:t>Lucide</ns0:t>
-      </ns0:r>
-      <ns0:proofErr ns0:type="spellEnd"/>
-      <ns0:r>
-        <ns0:t xml:space="preserve"> </ns0:t>
-      </ns0:r>
-      <ns0:proofErr ns0:type="spellStart"/>
-      <ns0:r>
-        <ns0:t>licence</ns0:t>
-      </ns0:r>
-      <ns0:proofErr ns0:type="spellEnd"/>
-      <ns0:r>
-        <ns0:t>: https://lucide.dev/license.</ns0:t>
-      </ns0:r>
-    </ns0:p>
-    <ns0:p ns2:paraId="630F457A" ns2:textId="77777777" ns0:rsidR="00C421DB" ns0:rsidRDefault="00000000">
-      <ns0:r>
-        <ns0:br ns0:type="page"/>
-      </ns0:r>
-    </ns0:p>
-    <ns0:p ns2:paraId="5BE94A59" ns2:textId="77777777" ns0:rsidR="00C421DB" ns0:rsidRDefault="00000000">
-      <ns0:pPr>
-        <ns0:pStyle ns0:val="Heading1"/>
-      </ns0:pPr>
-      <ns0:r>
-        <ns0:lastRenderedPageBreak/>
-        <ns0:t>Task 3: Building and testing</ns0:t>
-      </ns0:r>
-    </ns0:p>
-    <ns0:p ns2:paraId="1FD62594" ns2:textId="7C3AF52C" ns0:rsidR="00C421DB" ns0:rsidRDefault="00000000">
-      <ns0:r>
-        <ns0:t xml:space="preserve">I made the </ns0:t>
-      </ns0:r>
-      <ns0:r ns0:rsidR="00D52656">
-        <ns0:t>3</ns0:t>
-      </ns0:r>
-      <ns0:r>
-        <ns0:t xml:space="preserve"> pages in HTML, CSS and Javascript. I used one CSS file so the colours, fonts and links stay the same on each page. I kept the writing as normal webpage text, so it can be searched and read properly.</ns0:t>
-      </ns0:r>
-    </ns0:p>
-    <ns0:p ns2:paraId="756C7228" ns2:textId="77777777" ns0:rsidR="00C421DB" ns0:rsidRDefault="00000000">
-      <ns0:r>
-        <ns0:rPr>
-          <ns0:noProof/>
-        </ns0:rPr>
-        <ns0:lastRenderedPageBreak/>
-        <ns0:drawing>
-          <ns3:inline distT="0" distB="0" distL="0" distR="0" ns4:anchorId="0790170B" ns4:editId="3DD0B7EB">
-            <ns3:extent cx="5212080" cy="16621649"/>
-            <ns3:effectExtent l="0" t="0" r="0" b="0"/>
-            <ns3:docPr id="8" name="Picture 8" descr="Explore page after building: search, genre choices, artist sections and listening links."/>
-            <ns3:cNvGraphicFramePr>
-              <ns5:graphicFrameLocks noChangeAspect="1"/>
-            </ns3:cNvGraphicFramePr>
-            <ns5:graphic>
-              <ns5:graphicData uri="http://schemas.openxmlformats.org/drawingml/2006/picture">
-                <ns6:pic>
-                  <ns6:nvPicPr>
-                    <ns6:cNvPr id="0" name="explore-desktop.png"/>
-                    <ns6:cNvPicPr/>
-                  </ns6:nvPicPr>
-                  <ns6:blipFill>
-                    <ns5:blip ns7:embed="rId15"/>
-                    <ns5:stretch>
-                      <ns5:fillRect/>
-                    </ns5:stretch>
-                  </ns6:blipFill>
-                  <ns6:spPr>
-                    <ns5:xfrm>
-                      <ns5:off x="0" y="0"/>
-                      <ns5:ext cx="5212080" cy="16621649"/>
-                    </ns5:xfrm>
-                    <ns5:prstGeom prst="rect">
-                      <ns5:avLst/>
-                    </ns5:prstGeom>
-                  </ns6:spPr>
-                </ns6:pic>
-              </ns5:graphicData>
-            </ns5:graphic>
-          </ns3:inline>
-        </ns0:drawing>
-      </ns0:r>
-    </ns0:p>
-    <ns0:p ns2:paraId="5C646F1A" ns2:textId="77777777" ns0:rsidR="00C421DB" ns0:rsidRDefault="00000000">
-      <ns0:pPr>
-        <ns0:pStyle ns0:val="Caption"/>
-      </ns0:pPr>
-      <ns0:r>
-        <ns0:lastRenderedPageBreak/>
-        <ns0:t>Explore page after building: search, genre choices, artist sections and listening links.</ns0:t>
-      </ns0:r>
-    </ns0:p>
-    <ns0:p ns2:paraId="14071AFB" ns2:textId="77777777" ns0:rsidR="00C421DB" ns0:rsidRDefault="00000000">
-      <ns0:r>
-        <ns0:t>I kept all the artists on Explore because it is easier to look through them in one place. Search takes you there too. The genre buttons still work with search, so you can look for ABBA while keeping Pop selected. The request link checks the required boxes before it opens an email.</ns0:t>
-      </ns0:r>
-    </ns0:p>
-    <ns0:p ns2:paraId="6FA2BD30" ns2:textId="77777777" ns0:rsidR="00C421DB" ns0:rsidRDefault="00000000">
-      <ns0:pPr>
-        <ns0:pStyle ns0:val="Heading2"/>
-      </ns0:pPr>
-      <ns0:r>
-        <ns0:t>Changes made while building</ns0:t>
-      </ns0:r>
-    </ns0:p>
-    <ns0:p ns2:paraId="5140C882" ns2:textId="77777777" ns0:rsidR="00C421DB" ns0:rsidRDefault="00000000">
-      <ns0:r>
-        <ns0:t>I made the Explore button open a list of the music styles. On a phone, the Menu button puts the page links into one list. I also added a Skip to content link and made the keyboard outline easier to see. The photo popup has a Close button, works with Escape and sends you back to the same button when it closes.</ns0:t>
-      </ns0:r>
-    </ns0:p>
-    <ns0:p ns2:paraId="3D58F69F" ns2:textId="77777777" ns0:rsidR="00C421DB" ns0:rsidRDefault="00000000">
-      <ns0:r>
-        <ns0:t>The song videos only load after someone presses Play, so the page is not trying to load all of them straight away. I had a problem with YouTube in my first preview, so I used the localhost address in Live Server and it worked. Sources and credits open in a new tab, which means people do not lose their place on the site.</ns0:t>
-      </ns0:r>
-    </ns0:p>
-    <ns0:p ns2:paraId="18FA11F9" ns2:textId="77777777" ns0:rsidR="00C421DB" ns0:rsidRDefault="00000000">
-      <ns0:pPr>
-        <ns0:pStyle ns0:val="Heading2"/>
-      </ns0:pPr>
-      <ns0:r>
-        <ns0:t>Functionality checks</ns0:t>
-      </ns0:r>
-    </ns0:p>
-    <ns0:p ns2:paraId="4C9039A0" ns2:textId="0EA88044" ns0:rsidR="00C421DB" ns0:rsidRDefault="00000000">
-      <ns0:r>
-        <ns0:t xml:space="preserve">I tried the pages on Edge on my laptop and at phone size. I also used the keyboard for the menu, Skip link and bigger-photo button. I checked the YouTube videos in my local preview as well. </ns0:t>
-      </ns0:r>
-    </ns0:p>
-    <ns0:tbl>
-      <ns0:tblPr>
-        <ns0:tblStyle ns0:val="TableGrid"/>
-        <ns0:tblW ns0:w="0" ns0:type="auto"/>
-        <ns0:tblLook ns0:val="04A0" ns0:firstRow="1" ns0:lastRow="0" ns0:firstColumn="1" ns0:lastColumn="0" ns0:noHBand="0" ns0:noVBand="1"/>
-      </ns0:tblPr>
-      <ns0:tblGrid>
-        <ns0:gridCol ns0:w="3250"/>
-        <ns0:gridCol ns0:w="3250"/>
-        <ns0:gridCol ns0:w="3250"/>
-      </ns0:tblGrid>
-      <ns0:tr ns0:rsidR="00C421DB" ns2:paraId="23FE01A0" ns2:textId="77777777">
-        <ns0:tc>
-          <ns0:tcPr>
-            <ns0:tcW ns0:w="3250" ns0:type="dxa"/>
-          </ns0:tcPr>
-          <ns0:p ns2:paraId="53FF837E" ns2:textId="77777777" ns0:rsidR="00C421DB" ns0:rsidRDefault="00000000">
-            <ns0:pPr>
-              <ns0:spacing ns0:after="60"/>
-            </ns0:pPr>
-            <ns0:r>
-              <ns0:rPr>
-                <ns0:sz ns0:val="18"/>
-              </ns0:rPr>
-              <ns0:t>Check</ns0:t>
-            </ns0:r>
-          </ns0:p>
-        </ns0:tc>
-        <ns0:tc>
-          <ns0:tcPr>
-            <ns0:tcW ns0:w="3250" ns0:type="dxa"/>
-          </ns0:tcPr>
-          <ns0:p ns2:paraId="0C6466D9" ns2:textId="77777777" ns0:rsidR="00C421DB" ns0:rsidRDefault="00000000">
-            <ns0:pPr>
-              <ns0:spacing ns0:after="60"/>
-            </ns0:pPr>
-            <ns0:r>
-              <ns0:rPr>
-                <ns0:sz ns0:val="18"/>
-              </ns0:rPr>
-              <ns0:t>Result</ns0:t>
-            </ns0:r>
-          </ns0:p>
-        </ns0:tc>
-        <ns0:tc>
-          <ns0:tcPr>
-            <ns0:tcW ns0:w="3250" ns0:type="dxa"/>
-          </ns0:tcPr>
-          <ns0:p ns2:paraId="02CA3FCB" ns2:textId="77777777" ns0:rsidR="00C421DB" ns0:rsidRDefault="00000000">
-            <ns0:pPr>
-              <ns0:spacing ns0:after="60"/>
-            </ns0:pPr>
-            <ns0:r>
-              <ns0:rPr>
-                <ns0:sz ns0:val="18"/>
-              </ns0:rPr>
-              <ns0:t>What happened</ns0:t>
-            </ns0:r>
-          </ns0:p>
-        </ns0:tc>
-      </ns0:tr>
-      <ns0:tr ns0:rsidR="00C421DB" ns2:paraId="7AA34FC9" ns2:textId="77777777">
-        <ns0:tc>
-          <ns0:tcPr>
-            <ns0:tcW ns0:w="3250" ns0:type="dxa"/>
-          </ns0:tcPr>
-          <ns0:p ns2:paraId="6291176A" ns2:textId="77777777" ns0:rsidR="00C421DB" ns0:rsidRDefault="00000000">
-            <ns0:pPr>
-              <ns0:spacing ns0:after="60"/>
-            </ns0:pPr>
-            <ns0:r>
-              <ns0:rPr>
-                <ns0:sz ns0:val="18"/>
-              </ns0:rPr>
-              <ns0:t>index.html on a computer</ns0:t>
-            </ns0:r>
-          </ns0:p>
-        </ns0:tc>
-        <ns0:tc>
-          <ns0:tcPr>
-            <ns0:tcW ns0:w="3250" ns0:type="dxa"/>
-          </ns0:tcPr>
-          <ns0:p ns2:paraId="733C2881" ns2:textId="77777777" ns0:rsidR="00C421DB" ns0:rsidRDefault="00000000">
-            <ns0:pPr>
-              <ns0:spacing ns0:after="60"/>
-            </ns0:pPr>
-            <ns0:r>
-              <ns0:rPr>
-                <ns0:sz ns0:val="18"/>
-              </ns0:rPr>
-              <ns0:t>Pass</ns0:t>
-            </ns0:r>
-          </ns0:p>
-        </ns0:tc>
-        <ns0:tc>
-          <ns0:tcPr>
-            <ns0:tcW ns0:w="3250" ns0:type="dxa"/>
-          </ns0:tcPr>
-          <ns0:p ns2:paraId="65EAC563" ns2:textId="77777777" ns0:rsidR="00C421DB" ns0:rsidRDefault="00000000">
-            <ns0:pPr>
-              <ns0:spacing ns0:after="60"/>
-            </ns0:pPr>
-            <ns0:r>
-              <ns0:rPr>
-                <ns0:sz ns0:val="18"/>
-              </ns0:rPr>
-              <ns0:t>Nothing went off the side of the page.</ns0:t>
-            </ns0:r>
-          </ns0:p>
-        </ns0:tc>
-      </ns0:tr>
-      <ns0:tr ns0:rsidR="00C421DB" ns2:paraId="6D175AAD" ns2:textId="77777777">
-        <ns0:tc>
-          <ns0:tcPr>
-            <ns0:tcW ns0:w="3250" ns0:type="dxa"/>
-          </ns0:tcPr>
-          <ns0:p ns2:paraId="6638D6A4" ns2:textId="77777777" ns0:rsidR="00C421DB" ns0:rsidRDefault="00000000">
-            <ns0:pPr>
-              <ns0:spacing ns0:after="60"/>
-            </ns0:pPr>
-            <ns0:r>
-              <ns0:rPr>
-                <ns0:sz ns0:val="18"/>
-              </ns0:rPr>
-              <ns0:t>index.html on a phone</ns0:t>
-            </ns0:r>
-          </ns0:p>
-        </ns0:tc>
-        <ns0:tc>
-          <ns0:tcPr>
-            <ns0:tcW ns0:w="3250" ns0:type="dxa"/>
-          </ns0:tcPr>
-          <ns0:p ns2:paraId="2D8F3EC0" ns2:textId="77777777" ns0:rsidR="00C421DB" ns0:rsidRDefault="00000000">
-            <ns0:pPr>
-              <ns0:spacing ns0:after="60"/>
-            </ns0:pPr>
-            <ns0:r>
-              <ns0:rPr>
-                <ns0:sz ns0:val="18"/>
-              </ns0:rPr>
-              <ns0:t>Pass</ns0:t>
-            </ns0:r>
-          </ns0:p>
-        </ns0:tc>
-        <ns0:tc>
-          <ns0:tcPr>
-            <ns0:tcW ns0:w="3250" ns0:type="dxa"/>
-          </ns0:tcPr>
-          <ns0:p ns2:paraId="6B67182D" ns2:textId="77777777" ns0:rsidR="00C421DB" ns0:rsidRDefault="00000000">
-            <ns0:pPr>
-              <ns0:spacing ns0:after="60"/>
-            </ns0:pPr>
-            <ns0:r>
-              <ns0:rPr>
-                <ns0:sz ns0:val="18"/>
-              </ns0:rPr>
-              <ns0:t>The page still fitted the phone screen.</ns0:t>
-            </ns0:r>
-          </ns0:p>
-        </ns0:tc>
-      </ns0:tr>
-      <ns0:tr ns0:rsidR="00C421DB" ns2:paraId="412897A3" ns2:textId="77777777">
-        <ns0:tc>
-          <ns0:tcPr>
-            <ns0:tcW ns0:w="3250" ns0:type="dxa"/>
-          </ns0:tcPr>
-          <ns0:p ns2:paraId="33FE8114" ns2:textId="77777777" ns0:rsidR="00C421DB" ns0:rsidRDefault="00000000">
-            <ns0:pPr>
-              <ns0:spacing ns0:after="60"/>
-            </ns0:pPr>
-            <ns0:r>
-              <ns0:rPr>
-                <ns0:sz ns0:val="18"/>
-              </ns0:rPr>
-              <ns0:t>explore.html on a computer</ns0:t>
-            </ns0:r>
-          </ns0:p>
-        </ns0:tc>
-        <ns0:tc>
-          <ns0:tcPr>
-            <ns0:tcW ns0:w="3250" ns0:type="dxa"/>
-          </ns0:tcPr>
-          <ns0:p ns2:paraId="45AABB33" ns2:textId="77777777" ns0:rsidR="00C421DB" ns0:rsidRDefault="00000000">
-            <ns0:pPr>
-              <ns0:spacing ns0:after="60"/>
-            </ns0:pPr>
-            <ns0:r>
-              <ns0:rPr>
-                <ns0:sz ns0:val="18"/>
-              </ns0:rPr>
-              <ns0:t>Pass</ns0:t>
-            </ns0:r>
-          </ns0:p>
-        </ns0:tc>
-        <ns0:tc>
-          <ns0:tcPr>
-            <ns0:tcW ns0:w="3250" ns0:type="dxa"/>
-          </ns0:tcPr>
-          <ns0:p ns2:paraId="41DC72B0" ns2:textId="77777777" ns0:rsidR="00C421DB" ns0:rsidRDefault="00000000">
-            <ns0:pPr>
-              <ns0:spacing ns0:after="60"/>
-            </ns0:pPr>
-            <ns0:r>
-              <ns0:rPr>
-                <ns0:sz ns0:val="18"/>
-              </ns0:rPr>
-              <ns0:t>Nothing went off the side of the page.</ns0:t>
-            </ns0:r>
-          </ns0:p>
-        </ns0:tc>
-      </ns0:tr>
-      <ns0:tr ns0:rsidR="00C421DB" ns2:paraId="7EFECB62" ns2:textId="77777777">
-        <ns0:tc>
-          <ns0:tcPr>
-            <ns0:tcW ns0:w="3250" ns0:type="dxa"/>
-          </ns0:tcPr>
-          <ns0:p ns2:paraId="4D4E2FEA" ns2:textId="77777777" ns0:rsidR="00C421DB" ns0:rsidRDefault="00000000">
-            <ns0:pPr>
-              <ns0:spacing ns0:after="60"/>
-            </ns0:pPr>
-            <ns0:r>
-              <ns0:rPr>
-                <ns0:sz ns0:val="18"/>
-              </ns0:rPr>
-              <ns0:t>explore.html on a phone</ns0:t>
-            </ns0:r>
-          </ns0:p>
-        </ns0:tc>
-        <ns0:tc>
-          <ns0:tcPr>
-            <ns0:tcW ns0:w="3250" ns0:type="dxa"/>
-          </ns0:tcPr>
-          <ns0:p ns2:paraId="4B910CD5" ns2:textId="77777777" ns0:rsidR="00C421DB" ns0:rsidRDefault="00000000">
-            <ns0:pPr>
-              <ns0:spacing ns0:after="60"/>
-            </ns0:pPr>
-            <ns0:r>
-              <ns0:rPr>
-                <ns0:sz ns0:val="18"/>
-              </ns0:rPr>
-              <ns0:t>Pass</ns0:t>
-            </ns0:r>
-          </ns0:p>
-        </ns0:tc>
-        <ns0:tc>
-          <ns0:tcPr>
-            <ns0:tcW ns0:w="3250" ns0:type="dxa"/>
-          </ns0:tcPr>
-          <ns0:p ns2:paraId="16A625A4" ns2:textId="77777777" ns0:rsidR="00C421DB" ns0:rsidRDefault="00000000">
-            <ns0:pPr>
-              <ns0:spacing ns0:after="60"/>
-            </ns0:pPr>
-            <ns0:r>
-              <ns0:rPr>
-                <ns0:sz ns0:val="18"/>
-              </ns0:rPr>
-              <ns0:t>The page still fitted the phone screen.</ns0:t>
-            </ns0:r>
-          </ns0:p>
-        </ns0:tc>
-      </ns0:tr>
-      <ns0:tr ns0:rsidR="00C421DB" ns2:paraId="512F4154" ns2:textId="77777777">
-        <ns0:tc>
-          <ns0:tcPr>
-            <ns0:tcW ns0:w="3250" ns0:type="dxa"/>
-          </ns0:tcPr>
-          <ns0:p ns2:paraId="0FCD6165" ns2:textId="77777777" ns0:rsidR="00C421DB" ns0:rsidRDefault="00000000">
-            <ns0:pPr>
-              <ns0:spacing ns0:after="60"/>
-            </ns0:pPr>
-            <ns0:r>
-              <ns0:rPr>
-                <ns0:sz ns0:val="18"/>
-              </ns0:rPr>
-              <ns0:t>request.html on a computer</ns0:t>
-            </ns0:r>
-          </ns0:p>
-        </ns0:tc>
-        <ns0:tc>
-          <ns0:tcPr>
-            <ns0:tcW ns0:w="3250" ns0:type="dxa"/>
-          </ns0:tcPr>
-          <ns0:p ns2:paraId="551E1DA8" ns2:textId="77777777" ns0:rsidR="00C421DB" ns0:rsidRDefault="00000000">
-            <ns0:pPr>
-              <ns0:spacing ns0:after="60"/>
-            </ns0:pPr>
-            <ns0:r>
-              <ns0:rPr>
-                <ns0:sz ns0:val="18"/>
-              </ns0:rPr>
-              <ns0:t>Pass</ns0:t>
-            </ns0:r>
-          </ns0:p>
-        </ns0:tc>
-        <ns0:tc>
-          <ns0:tcPr>
-            <ns0:tcW ns0:w="3250" ns0:type="dxa"/>
-          </ns0:tcPr>
-          <ns0:p ns2:paraId="7F64982F" ns2:textId="77777777" ns0:rsidR="00C421DB" ns0:rsidRDefault="00000000">
-            <ns0:pPr>
-              <ns0:spacing ns0:after="60"/>
-            </ns0:pPr>
-            <ns0:r>
-              <ns0:rPr>
-                <ns0:sz ns0:val="18"/>
-              </ns0:rPr>
-              <ns0:t>Nothing went off the side of the page.</ns0:t>
-            </ns0:r>
-          </ns0:p>
-        </ns0:tc>
-      </ns0:tr>
-      <ns0:tr ns0:rsidR="00C421DB" ns2:paraId="77523D45" ns2:textId="77777777">
-        <ns0:tc>
-          <ns0:tcPr>
-            <ns0:tcW ns0:w="3250" ns0:type="dxa"/>
-          </ns0:tcPr>
-          <ns0:p ns2:paraId="1CEA0FE8" ns2:textId="77777777" ns0:rsidR="00C421DB" ns0:rsidRDefault="00000000">
-            <ns0:pPr>
-              <ns0:spacing ns0:after="60"/>
-            </ns0:pPr>
-            <ns0:r>
-              <ns0:rPr>
-                <ns0:sz ns0:val="18"/>
-              </ns0:rPr>
-              <ns0:t>request.html on a phone</ns0:t>
-            </ns0:r>
-          </ns0:p>
-        </ns0:tc>
-        <ns0:tc>
-          <ns0:tcPr>
-            <ns0:tcW ns0:w="3250" ns0:type="dxa"/>
-          </ns0:tcPr>
-          <ns0:p ns2:paraId="5A70E955" ns2:textId="77777777" ns0:rsidR="00C421DB" ns0:rsidRDefault="00000000">
-            <ns0:pPr>
-              <ns0:spacing ns0:after="60"/>
-            </ns0:pPr>
-            <ns0:r>
-              <ns0:rPr>
-                <ns0:sz ns0:val="18"/>
-              </ns0:rPr>
-              <ns0:t>Pass</ns0:t>
-            </ns0:r>
-          </ns0:p>
-        </ns0:tc>
-        <ns0:tc>
-          <ns0:tcPr>
-            <ns0:tcW ns0:w="3250" ns0:type="dxa"/>
-          </ns0:tcPr>
-          <ns0:p ns2:paraId="38B4489B" ns2:textId="77777777" ns0:rsidR="00C421DB" ns0:rsidRDefault="00000000">
-            <ns0:pPr>
-              <ns0:spacing ns0:after="60"/>
-            </ns0:pPr>
-            <ns0:r>
-              <ns0:rPr>
-                <ns0:sz ns0:val="18"/>
-              </ns0:rPr>
-              <ns0:t>The page still fitted the phone screen.</ns0:t>
-            </ns0:r>
-          </ns0:p>
-        </ns0:tc>
-      </ns0:tr>
-      <ns0:tr ns0:rsidR="00C421DB" ns2:paraId="1A1DBC26" ns2:textId="77777777">
-        <ns0:tc>
-          <ns0:tcPr>
-            <ns0:tcW ns0:w="3250" ns0:type="dxa"/>
-          </ns0:tcPr>
-          <ns0:p ns2:paraId="29056D8A" ns2:textId="77777777" ns0:rsidR="00C421DB" ns0:rsidRDefault="00000000">
-            <ns0:pPr>
-              <ns0:spacing ns0:after="60"/>
-            </ns0:pPr>
-            <ns0:r>
-              <ns0:rPr>
-                <ns0:sz ns0:val="18"/>
-              </ns0:rPr>
-              <ns0:t>Skip link</ns0:t>
-            </ns0:r>
-          </ns0:p>
-        </ns0:tc>
-        <ns0:tc>
-          <ns0:tcPr>
-            <ns0:tcW ns0:w="3250" ns0:type="dxa"/>
-          </ns0:tcPr>
-          <ns0:p ns2:paraId="50480925" ns2:textId="77777777" ns0:rsidR="00C421DB" ns0:rsidRDefault="00000000">
-            <ns0:pPr>
-              <ns0:spacing ns0:after="60"/>
-            </ns0:pPr>
-            <ns0:r>
-              <ns0:rPr>
-                <ns0:sz ns0:val="18"/>
-              </ns0:rPr>
-              <ns0:t>Pass</ns0:t>
-            </ns0:r>
-          </ns0:p>
-        </ns0:tc>
-        <ns0:tc>
-          <ns0:tcPr>
-            <ns0:tcW ns0:w="3250" ns0:type="dxa"/>
-          </ns0:tcPr>
-          <ns0:p ns2:paraId="7693AB40" ns2:textId="77777777" ns0:rsidR="00C421DB" ns0:rsidRDefault="00000000">
-            <ns0:pPr>
-              <ns0:spacing ns0:after="60"/>
-            </ns0:pPr>
-            <ns0:r>
-              <ns0:rPr>
-                <ns0:sz ns0:val="18"/>
-              </ns0:rPr>
-              <ns0:t>It took me straight to the main part of the page.</ns0:t>
-            </ns0:r>
-          </ns0:p>
-        </ns0:tc>
-      </ns0:tr>
-      <ns0:tr ns0:rsidR="00C421DB" ns2:paraId="4A8B46A6" ns2:textId="77777777">
-        <ns0:tc>
-          <ns0:tcPr>
-            <ns0:tcW ns0:w="3250" ns0:type="dxa"/>
-          </ns0:tcPr>
-          <ns0:p ns2:paraId="01C7C810" ns2:textId="77777777" ns0:rsidR="00C421DB" ns0:rsidRDefault="00000000">
-            <ns0:pPr>
-              <ns0:spacing ns0:after="60"/>
-            </ns0:pPr>
-            <ns0:r>
-              <ns0:rPr>
-                <ns0:sz ns0:val="18"/>
-              </ns0:rPr>
-              <ns0:t>Explore menu</ns0:t>
-            </ns0:r>
-          </ns0:p>
-        </ns0:tc>
-        <ns0:tc>
-          <ns0:tcPr>
-            <ns0:tcW ns0:w="3250" ns0:type="dxa"/>
-          </ns0:tcPr>
-          <ns0:p ns2:paraId="6852C183" ns2:textId="77777777" ns0:rsidR="00C421DB" ns0:rsidRDefault="00000000">
-            <ns0:pPr>
-              <ns0:spacing ns0:after="60"/>
-            </ns0:pPr>
-            <ns0:r>
-              <ns0:rPr>
-                <ns0:sz ns0:val="18"/>
-              </ns0:rPr>
-              <ns0:t>Pass</ns0:t>
-            </ns0:r>
-          </ns0:p>
-        </ns0:tc>
-        <ns0:tc>
-          <ns0:tcPr>
-            <ns0:tcW ns0:w="3250" ns0:type="dxa"/>
-          </ns0:tcPr>
-          <ns0:p ns2:paraId="49D6A52B" ns2:textId="77777777" ns0:rsidR="00C421DB" ns0:rsidRDefault="00000000">
-            <ns0:pPr>
-              <ns0:spacing ns0:after="60"/>
-            </ns0:pPr>
-            <ns0:r>
-              <ns0:rPr>
-                <ns0:sz ns0:val="18"/>
-              </ns0:rPr>
-              <ns0:t>It opened, closed with Escape, then focus went back to the button.</ns0:t>
-            </ns0:r>
-          </ns0:p>
-        </ns0:tc>
-      </ns0:tr>
-      <ns0:tr ns0:rsidR="00C421DB" ns2:paraId="60868F37" ns2:textId="77777777">
-        <ns0:tc>
-          <ns0:tcPr>
-            <ns0:tcW ns0:w="3250" ns0:type="dxa"/>
-          </ns0:tcPr>
-          <ns0:p ns2:paraId="5C223AF3" ns2:textId="77777777" ns0:rsidR="00C421DB" ns0:rsidRDefault="00000000">
-            <ns0:pPr>
-              <ns0:spacing ns0:after="60"/>
-            </ns0:pPr>
-            <ns0:r>
-              <ns0:rPr>
-                <ns0:sz ns0:val="18"/>
-              </ns0:rPr>
-              <ns0:t>Menu on phone</ns0:t>
-            </ns0:r>
-          </ns0:p>
-        </ns0:tc>
-        <ns0:tc>
-          <ns0:tcPr>
-            <ns0:tcW ns0:w="3250" ns0:type="dxa"/>
-          </ns0:tcPr>
-          <ns0:p ns2:paraId="283C64A7" ns2:textId="77777777" ns0:rsidR="00C421DB" ns0:rsidRDefault="00000000">
-            <ns0:pPr>
-              <ns0:spacing ns0:after="60"/>
-            </ns0:pPr>
-            <ns0:r>
-              <ns0:rPr>
-                <ns0:sz ns0:val="18"/>
-              </ns0:rPr>
-              <ns0:t>Pass</ns0:t>
-            </ns0:r>
-          </ns0:p>
-        </ns0:tc>
-        <ns0:tc>
-          <ns0:tcPr>
-            <ns0:tcW ns0:w="3250" ns0:type="dxa"/>
-          </ns0:tcPr>
-          <ns0:p ns2:paraId="2FEE357B" ns2:textId="77777777" ns0:rsidR="00C421DB" ns0:rsidRDefault="00000000">
-            <ns0:pPr>
-              <ns0:spacing ns0:after="60"/>
-            </ns0:pPr>
-            <ns0:r>
-              <ns0:rPr>
-                <ns0:sz ns0:val="18"/>
-              </ns0:rPr>
-              <ns0:t>It opened and Escape closed it again.</ns0:t>
-            </ns0:r>
-          </ns0:p>
-        </ns0:tc>
-      </ns0:tr>
-      <ns0:tr ns0:rsidR="00C421DB" ns2:paraId="0AFF6F25" ns2:textId="77777777">
-        <ns0:tc>
-          <ns0:tcPr>
-            <ns0:tcW ns0:w="3250" ns0:type="dxa"/>
-          </ns0:tcPr>
-          <ns0:p ns2:paraId="25312186" ns2:textId="77777777" ns0:rsidR="00C421DB" ns0:rsidRDefault="00000000">
-            <ns0:pPr>
-              <ns0:spacing ns0:after="60"/>
-            </ns0:pPr>
-            <ns0:r>
-              <ns0:rPr>
-                <ns0:sz ns0:val="18"/>
-              </ns0:rPr>
-              <ns0:t>Search and genre buttons</ns0:t>
-            </ns0:r>
-          </ns0:p>
-        </ns0:tc>
-        <ns0:tc>
-          <ns0:tcPr>
-            <ns0:tcW ns0:w="3250" ns0:type="dxa"/>
-          </ns0:tcPr>
-          <ns0:p ns2:paraId="68DFE4C6" ns2:textId="77777777" ns0:rsidR="00C421DB" ns0:rsidRDefault="00000000">
-            <ns0:pPr>
-              <ns0:spacing ns0:after="60"/>
-            </ns0:pPr>
-            <ns0:r>
-              <ns0:rPr>
-                <ns0:sz ns0:val="18"/>
-              </ns0:rPr>
-              <ns0:t>Pass</ns0:t>
-            </ns0:r>
-          </ns0:p>
-        </ns0:tc>
-        <ns0:tc>
-          <ns0:tcPr>
-            <ns0:tcW ns0:w="3250" ns0:type="dxa"/>
-          </ns0:tcPr>
-          <ns0:p ns2:paraId="70586AA0" ns2:textId="77777777" ns0:rsidR="00C421DB" ns0:rsidRDefault="00000000">
-            <ns0:pPr>
-              <ns0:spacing ns0:after="60"/>
-            </ns0:pPr>
-            <ns0:r>
-              <ns0:rPr>
-                <ns0:sz ns0:val="18"/>
-              </ns0:rPr>
-              <ns0:t>I could search for ABBA and then change the genre without it breaking.</ns0:t>
-            </ns0:r>
-          </ns0:p>
-        </ns0:tc>
-      </ns0:tr>
-      <ns0:tr ns0:rsidR="00C421DB" ns2:paraId="6F26DA88" ns2:textId="77777777">
-        <ns0:tc>
-          <ns0:tcPr>
-            <ns0:tcW ns0:w="3250" ns0:type="dxa"/>
-          </ns0:tcPr>
-          <ns0:p ns2:paraId="04578B07" ns2:textId="77777777" ns0:rsidR="00C421DB" ns0:rsidRDefault="00000000">
-            <ns0:pPr>
-              <ns0:spacing ns0:after="60"/>
-            </ns0:pPr>
-            <ns0:r>
-              <ns0:rPr>
-                <ns0:sz ns0:val="18"/>
-              </ns0:rPr>
-              <ns0:t>Make image bigger</ns0:t>
-            </ns0:r>
-          </ns0:p>
-        </ns0:tc>
-        <ns0:tc>
-          <ns0:tcPr>
-            <ns0:tcW ns0:w="3250" ns0:type="dxa"/>
-          </ns0:tcPr>
-          <ns0:p ns2:paraId="2D7D41F1" ns2:textId="77777777" ns0:rsidR="00C421DB" ns0:rsidRDefault="00000000">
-            <ns0:pPr>
-              <ns0:spacing ns0:after="60"/>
-            </ns0:pPr>
-            <ns0:r>
-              <ns0:rPr>
-                <ns0:sz ns0:val="18"/>
-              </ns0:rPr>
-              <ns0:t>Pass</ns0:t>
-            </ns0:r>
-          </ns0:p>
-        </ns0:tc>
-        <ns0:tc>
-          <ns0:tcPr>
-            <ns0:tcW ns0:w="3250" ns0:type="dxa"/>
-          </ns0:tcPr>
-          <ns0:p ns2:paraId="39578F72" ns2:textId="77777777" ns0:rsidR="00C421DB" ns0:rsidRDefault="00000000">
-            <ns0:pPr>
-              <ns0:spacing ns0:after="60"/>
-            </ns0:pPr>
-            <ns0:r>
-              <ns0:rPr>
-                <ns0:sz ns0:val="18"/>
-              </ns0:rPr>
-              <ns0:t>The picture opened bigger and Escape closed it.</ns0:t>
-            </ns0:r>
-          </ns0:p>
-        </ns0:tc>
-      </ns0:tr>
-      <ns0:tr ns0:rsidR="00C421DB" ns2:paraId="484AEFA6" ns2:textId="77777777">
-        <ns0:tc>
-          <ns0:tcPr>
-            <ns0:tcW ns0:w="3250" ns0:type="dxa"/>
-          </ns0:tcPr>
-          <ns0:p ns2:paraId="409A969B" ns2:textId="77777777" ns0:rsidR="00C421DB" ns0:rsidRDefault="00000000">
-            <ns0:pPr>
-              <ns0:spacing ns0:after="60"/>
-            </ns0:pPr>
-            <ns0:r>
-              <ns0:rPr>
-                <ns0:sz ns0:val="18"/>
-              </ns0:rPr>
-              <ns0:t>Song video</ns0:t>
-            </ns0:r>
-          </ns0:p>
-        </ns0:tc>
-        <ns0:tc>
-          <ns0:tcPr>
-            <ns0:tcW ns0:w="3250" ns0:type="dxa"/>
-          </ns0:tcPr>
-          <ns0:p ns2:paraId="05909440" ns2:textId="77777777" ns0:rsidR="00C421DB" ns0:rsidRDefault="00000000">
-            <ns0:pPr>
-              <ns0:spacing ns0:after="60"/>
-            </ns0:pPr>
-            <ns0:r>
-              <ns0:rPr>
-                <ns0:sz ns0:val="18"/>
-              </ns0:rPr>
-              <ns0:t>Pass</ns0:t>
-            </ns0:r>
-          </ns0:p>
-        </ns0:tc>
-        <ns0:tc>
-          <ns0:tcPr>
-            <ns0:tcW ns0:w="3250" ns0:type="dxa"/>
-          </ns0:tcPr>
-          <ns0:p ns2:paraId="169409DC" ns2:textId="77777777" ns0:rsidR="00C421DB" ns0:rsidRDefault="00000000">
-            <ns0:pPr>
-              <ns0:spacing ns0:after="60"/>
-            </ns0:pPr>
-            <ns0:r>
-              <ns0:rPr>
-                <ns0:sz ns0:val="18"/>
-              </ns0:rPr>
-              <ns0:t>Pressing Play put the YouTube video on the page. I checked the videos played in localhost too.</ns0:t>
-            </ns0:r>
-          </ns0:p>
-        </ns0:tc>
-      </ns0:tr>
-      <ns0:tr ns0:rsidR="00C421DB" ns2:paraId="59B6123A" ns2:textId="77777777">
-        <ns0:tc>
-          <ns0:tcPr>
-            <ns0:tcW ns0:w="3250" ns0:type="dxa"/>
-          </ns0:tcPr>
-          <ns0:p ns2:paraId="7DD88C04" ns2:textId="77777777" ns0:rsidR="00C421DB" ns0:rsidRDefault="00000000">
-            <ns0:pPr>
-              <ns0:spacing ns0:after="60"/>
-            </ns0:pPr>
-            <ns0:r>
-              <ns0:rPr>
-                <ns0:sz ns0:val="18"/>
-              </ns0:rPr>
-              <ns0:t>Request page</ns0:t>
-            </ns0:r>
-          </ns0:p>
-        </ns0:tc>
-        <ns0:tc>
-          <ns0:tcPr>
-            <ns0:tcW ns0:w="3250" ns0:type="dxa"/>
-          </ns0:tcPr>
-          <ns0:p ns2:paraId="7780780D" ns2:textId="77777777" ns0:rsidR="00C421DB" ns0:rsidRDefault="00000000">
-            <ns0:pPr>
-              <ns0:spacing ns0:after="60"/>
-            </ns0:pPr>
-            <ns0:r>
-              <ns0:rPr>
-                <ns0:sz ns0:val="18"/>
-              </ns0:rPr>
-              <ns0:t>Pass</ns0:t>
-            </ns0:r>
-          </ns0:p>
-        </ns0:tc>
-        <ns0:tc>
-          <ns0:tcPr>
-            <ns0:tcW ns0:w="3250" ns0:type="dxa"/>
-          </ns0:tcPr>
-          <ns0:p ns2:paraId="168A7BA4" ns2:textId="77777777" ns0:rsidR="00C421DB" ns0:rsidRDefault="00000000">
-            <ns0:pPr>
-              <ns0:spacing ns0:after="60"/>
-            </ns0:pPr>
-            <ns0:r>
-              <ns0:rPr>
-                <ns0:sz ns0:val="18"/>
-              </ns0:rPr>
-              <ns0:t>It would not make the email until I filled in the required boxes. Then it made the email with the client copied in.</ns0:t>
-            </ns0:r>
-          </ns0:p>
-        </ns0:tc>
-      </ns0:tr>
-    </ns0:tbl>
-    <ns0:p ns2:paraId="6E389AC1" ns2:textId="77777777" ns0:rsidR="00C421DB" ns0:rsidRDefault="00000000">
-      <ns0:pPr>
-        <ns0:pStyle ns0:val="Heading2"/>
-      </ns0:pPr>
-      <ns0:r>
-        <ns0:t>Review</ns0:t>
-      </ns0:r>
-    </ns0:p>
-    <ns0:p ns2:paraId="0C95C61E" ns2:textId="77777777" ns0:rsidR="00C421DB" ns0:rsidRDefault="00000000">
-      <ns0:r>
-        <ns0:t>The main thing I changed was putting the artist information and song together on Explore. Before that, it felt like there were two separate lists. I also checked that the menu and photo popup worked with a keyboard, not just with a mouse. The three pages now have the same layout and navigation, and the parts I tested worked.</ns0:t>
-      </ns0:r>
-    </ns0:p>
-    <ns0:sectPr ns0:rsidR="00C421DB" ns0:rsidSect="00034616">
-      <ns0:footerReference ns0:type="default" ns7:id="rId16"/>
-      <ns0:pgSz ns0:w="11909" ns0:h="16834"/>
-      <ns0:pgMar ns0:top="936" ns0:right="1080" ns0:bottom="936" ns0:left="1080" ns0:header="720" ns0:footer="720" ns0:gutter="0"/>
-      <ns0:cols ns0:space="720"/>
-      <ns0:docGrid ns0:linePitch="360"/>
-    </ns0:sectPr>
-  </ns0:body>
-</ns0:document>
+<w:document xmlns:wpc="http://schemas.microsoft.com/office/word/2010/wordprocessingCanvas" xmlns:cx="http://schemas.microsoft.com/office/drawing/2014/chartex" xmlns:cx1="http://schemas.microsoft.com/office/drawing/2015/9/8/chartex" xmlns:cx2="http://schemas.microsoft.com/office/drawing/2015/10/21/chartex" xmlns:cx3="http://schemas.microsoft.com/office/drawing/2016/5/9/chartex" xmlns:cx4="http://schemas.microsoft.com/office/drawing/2016/5/10/chartex" xmlns:cx5="http://schemas.microsoft.com/office/drawing/2016/5/11/chartex" xmlns:cx6="http://schemas.microsoft.com/office/drawing/2016/5/12/chartex" xmlns:cx7="http://schemas.microsoft.com/office/drawing/2016/5/13/chartex" xmlns:cx8="http://schemas.microsoft.com/office/drawing/2016/5/14/chartex" xmlns:mc="http://schemas.openxmlformats.org/markup-compatibility/2006" xmlns:aink="http://schemas.microsoft.com/office/drawing/2016/ink" xmlns:am3d="http://schemas.microsoft.com/office/drawing/2017/model3d" xmlns:o="urn:schemas-microsoft-com:office:office" xmlns:oel="http://schemas.microsoft.com/office/2019/extlst" xmlns:r="http://schemas.openxmlformats.org/officeDocument/2006/relationships" xmlns:m="http://schemas.openxmlformats.org/officeDocument/2006/math" xmlns:v="urn:schemas-microsoft-com:vml" xmlns:wp14="http://schemas.microsoft.com/office/word/2010/wordprocessingDrawing" xmlns:wp="http://schemas.openxmlformats.org/drawingml/2006/wordprocessingDrawing" xmlns:w10="urn:schemas-microsoft-com:office:word" xmlns:w="http://schemas.openxmlformats.org/wordprocessingml/2006/main" xmlns:w14="http://schemas.microsoft.com/office/word/2010/wordml" xmlns:w15="http://schemas.microsoft.com/office/word/2012/wordml" xmlns:w16cex="http://schemas.microsoft.com/office/word/2018/wordml/cex" xmlns:w16cid="http://schemas.microsoft.com/office/word/2016/wordml/cid" xmlns:w16="http://schemas.microsoft.com/office/word/2018/wordml" xmlns:w16du="http://schemas.microsoft.com/office/word/2023/wordml/word16du" xmlns:w16sdtdh="http://schemas.microsoft.com/office/word/2020/wordml/sdtdatahash" xmlns:w16sdtfl="http://schemas.microsoft.com/office/word/2024/wordml/sdtformatlock" xmlns:w16se="http://schemas.microsoft.com/office/word/2015/wordml/symex" xmlns:wpg="http://schemas.microsoft.com/office/word/2010/wordprocessingGroup" xmlns:wpi="http://schemas.microsoft.com/office/word/2010/wordprocessingInk" xmlns:wne="http://schemas.microsoft.com/office/word/2006/wordml" xmlns:wps="http://schemas.microsoft.com/office/word/2010/wordprocessingShape" mc:Ignorable="w14 w15 w16se w16cid w16 w16cex w16sdtdh w16sdtfl w16du wp14">
+  <w:body>
+    <w:p>
+      <w:pPr>
+        <w:pStyle w:val="Title"/>
+      </w:pPr>
+      <w:r>
+        <w:t>Website Development</w:t>
+      </w:r>
+    </w:p>
+    <w:p>
+      <w:r>
+        <w:t xml:space="preserve">Unit 3 assignment report </w:t>
+      </w:r>
+      <w:r>
+        <w:t>/</w:t>
+      </w:r>
+      <w:r>
+        <w:t xml:space="preserve"> Seventies Sound </w:t>
+      </w:r>
+      <w:r>
+        <w:t>/</w:t>
+      </w:r>
+      <w:r>
+        <w:t xml:space="preserve"> September 2026</w:t>
+      </w:r>
+    </w:p>
+    <w:p>
+      <w:r>
+        <w:t xml:space="preserve">This is a </w:t>
+      </w:r>
+      <w:r>
+        <w:t>3-</w:t>
+      </w:r>
+      <w:r>
+        <w:t>page website introducing 1970s music to 17-23-year-olds. I used HTML, CSS and JavaScript.</w:t>
+      </w:r>
+    </w:p>
+    <w:p>
+      <w:r>
+        <w:br w:type="page"/>
+      </w:r>
+    </w:p>
+    <w:p>
+      <w:pPr>
+        <w:pStyle w:val="Heading1"/>
+      </w:pPr>
+      <w:r>
+        <w:lastRenderedPageBreak/>
+        <w:t>Task 1: Research and planning</w:t>
+      </w:r>
+    </w:p>
+    <w:p>
+      <w:pPr>
+        <w:pStyle w:val="Heading2"/>
+      </w:pPr>
+      <w:r>
+        <w:t>Brief, audience and research</w:t>
+      </w:r>
+    </w:p>
+    <w:p>
+      <w:r>
+        <w:t>The brief asks for a mobile-friendly three-page site with navigation, search, an accordion, video, image popups, external links, a request form and accessibility features. I wanted the site to work for someone who knows a song already and someone who has never listened to 70s music.</w:t>
+      </w:r>
+    </w:p>
+    <w:tbl>
+      <w:tblPr>
+        <w:tblStyle w:val="TableGrid"/>
+        <w:tblW w:w="0" w:type="auto"/>
+        <w:tblLook w:val="04A0" w:firstRow="1" w:lastRow="0" w:firstColumn="1" w:lastColumn="0" w:noHBand="0" w:noVBand="1"/>
+      </w:tblPr>
+      <w:tblGrid>
+        <w:gridCol w:w="3250"/>
+        <w:gridCol w:w="3250"/>
+        <w:gridCol w:w="3250"/>
+      </w:tblGrid>
+      <w:tr>
+        <w:trPr>
+          <w:cantSplit/>
+        </w:trPr>
+        <w:tc>
+          <w:tcPr>
+            <w:tcW w:w="3250" w:type="dxa"/>
+          </w:tcPr>
+          <w:p>
+            <w:pPr>
+              <w:spacing w:after="80"/>
+            </w:pPr>
+            <w:r>
+              <w:rPr>
+                <w:sz w:val="20"/>
+              </w:rPr>
+              <w:t>Site</w:t>
+            </w:r>
+          </w:p>
+        </w:tc>
+        <w:tc>
+          <w:tcPr>
+            <w:tcW w:w="3250" w:type="dxa"/>
+          </w:tcPr>
+          <w:p>
+            <w:pPr>
+              <w:spacing w:after="80"/>
+            </w:pPr>
+            <w:r>
+              <w:rPr>
+                <w:sz w:val="20"/>
+              </w:rPr>
+              <w:t>What I noticed</w:t>
+            </w:r>
+          </w:p>
+        </w:tc>
+        <w:tc>
+          <w:tcPr>
+            <w:tcW w:w="3250" w:type="dxa"/>
+          </w:tcPr>
+          <w:p>
+            <w:pPr>
+              <w:spacing w:after="80"/>
+            </w:pPr>
+            <w:r>
+              <w:rPr>
+                <w:sz w:val="20"/>
+              </w:rPr>
+              <w:t>What I used</w:t>
+            </w:r>
+          </w:p>
+        </w:tc>
+      </w:tr>
+      <w:tr>
+        <w:trPr>
+          <w:cantSplit/>
+        </w:trPr>
+        <w:tc>
+          <w:tcPr>
+            <w:tcW w:w="3250" w:type="dxa"/>
+          </w:tcPr>
+          <w:p>
+            <w:pPr>
+              <w:spacing w:after="80"/>
+            </w:pPr>
+            <w:r>
+              <w:rPr>
+                <w:sz w:val="20"/>
+              </w:rPr>
+              <w:t>TheGreat70s [1]</w:t>
+            </w:r>
+          </w:p>
+        </w:tc>
+        <w:tc>
+          <w:tcPr>
+            <w:tcW w:w="3250" w:type="dxa"/>
+          </w:tcPr>
+          <w:p>
+            <w:pPr>
+              <w:spacing w:after="80"/>
+            </w:pPr>
+            <w:r>
+              <w:rPr>
+                <w:sz w:val="20"/>
+              </w:rPr>
+              <w:t>The image makes the decade obvious, but the advert uses too much room on a phone.</w:t>
+            </w:r>
+          </w:p>
+        </w:tc>
+        <w:tc>
+          <w:tcPr>
+            <w:tcW w:w="3250" w:type="dxa"/>
+          </w:tcPr>
+          <w:p>
+            <w:pPr>
+              <w:spacing w:after="80"/>
+            </w:pPr>
+            <w:r>
+              <w:rPr>
+                <w:sz w:val="20"/>
+              </w:rPr>
+              <w:t>Clear heading and image, but no adverts.</w:t>
+            </w:r>
+          </w:p>
+        </w:tc>
+      </w:tr>
+      <w:tr>
+        <w:trPr>
+          <w:cantSplit/>
+        </w:trPr>
+        <w:tc>
+          <w:tcPr>
+            <w:tcW w:w="3250" w:type="dxa"/>
+          </w:tcPr>
+          <w:p>
+            <w:pPr>
+              <w:spacing w:after="80"/>
+            </w:pPr>
+            <w:r>
+              <w:rPr>
+                <w:sz w:val="20"/>
+              </w:rPr>
+              <w:t>ABBA [2]</w:t>
+            </w:r>
+          </w:p>
+        </w:tc>
+        <w:tc>
+          <w:tcPr>
+            <w:tcW w:w="3250" w:type="dxa"/>
+          </w:tcPr>
+          <w:p>
+            <w:pPr>
+              <w:spacing w:after="80"/>
+            </w:pPr>
+            <w:r>
+              <w:rPr>
+                <w:sz w:val="20"/>
+              </w:rPr>
+              <w:t>The dark layout and large image are strong. It mainly suits people who already know ABBA.</w:t>
+            </w:r>
+          </w:p>
+        </w:tc>
+        <w:tc>
+          <w:tcPr>
+            <w:tcW w:w="3250" w:type="dxa"/>
+          </w:tcPr>
+          <w:p>
+            <w:pPr>
+              <w:spacing w:after="80"/>
+            </w:pPr>
+            <w:r>
+              <w:rPr>
+                <w:sz w:val="20"/>
+              </w:rPr>
+              <w:t>Short introduction before a listening link.</w:t>
+            </w:r>
+          </w:p>
+        </w:tc>
+      </w:tr>
+      <w:tr>
+        <w:trPr>
+          <w:cantSplit/>
+        </w:trPr>
+        <w:tc>
+          <w:tcPr>
+            <w:tcW w:w="3250" w:type="dxa"/>
+          </w:tcPr>
+          <w:p>
+            <w:pPr>
+              <w:spacing w:after="80"/>
+            </w:pPr>
+            <w:r>
+              <w:rPr>
+                <w:sz w:val="20"/>
+              </w:rPr>
+              <w:t>Rock Hall [3]</w:t>
+            </w:r>
+          </w:p>
+        </w:tc>
+        <w:tc>
+          <w:tcPr>
+            <w:tcW w:w="3250" w:type="dxa"/>
+          </w:tcPr>
+          <w:p>
+            <w:pPr>
+              <w:spacing w:after="80"/>
+            </w:pPr>
+            <w:r>
+              <w:rPr>
+                <w:sz w:val="20"/>
+              </w:rPr>
+              <w:t>Artist cards and search make browsing easy. Its phone layout feels busy.</w:t>
+            </w:r>
+          </w:p>
+        </w:tc>
+        <w:tc>
+          <w:tcPr>
+            <w:tcW w:w="3250" w:type="dxa"/>
+          </w:tcPr>
+          <w:p>
+            <w:pPr>
+              <w:spacing w:after="80"/>
+            </w:pPr>
+            <w:r>
+              <w:rPr>
+                <w:sz w:val="20"/>
+              </w:rPr>
+              <w:t>Genre buttons and search, with one-column phone cards.</w:t>
+            </w:r>
+          </w:p>
+        </w:tc>
+      </w:tr>
+    </w:tbl>
+    <w:p>
+      <w:r>
+        <w:t>The research screenshots are saved in planning-and-research/research-notes. ABBA's history gave me the 1974 Eurovision fact. I used David Bowie for glam rock and Donna Summer for disco, with official pages and chart information for facts and dates. [4-7]</w:t>
+      </w:r>
+    </w:p>
+    <w:p>
+      <w:pPr>
+        <w:pStyle w:val="Heading2"/>
+      </w:pPr>
+      <w:r>
+        <w:t>Content, copyright and accessibility</w:t>
+      </w:r>
+    </w:p>
+    <w:tbl>
+      <w:tblPr>
+        <w:tblStyle w:val="TableGrid"/>
+        <w:tblW w:w="0" w:type="auto"/>
+        <w:tblLook w:val="04A0" w:firstRow="1" w:lastRow="0" w:firstColumn="1" w:lastColumn="0" w:noHBand="0" w:noVBand="1"/>
+      </w:tblPr>
+      <w:tblGrid>
+        <w:gridCol w:w="4874"/>
+        <w:gridCol w:w="4874"/>
+      </w:tblGrid>
+      <w:tr>
+        <w:trPr>
+          <w:cantSplit/>
+        </w:trPr>
+        <w:tc>
+          <w:tcPr>
+            <w:tcW w:w="4874" w:type="dxa"/>
+          </w:tcPr>
+          <w:p>
+            <w:pPr>
+              <w:spacing w:after="80"/>
+            </w:pPr>
+            <w:r>
+              <w:rPr>
+                <w:sz w:val="20"/>
+              </w:rPr>
+              <w:t>Decision</w:t>
+            </w:r>
+          </w:p>
+        </w:tc>
+        <w:tc>
+          <w:tcPr>
+            <w:tcW w:w="4874" w:type="dxa"/>
+          </w:tcPr>
+          <w:p>
+            <w:pPr>
+              <w:spacing w:after="80"/>
+            </w:pPr>
+            <w:r>
+              <w:rPr>
+                <w:sz w:val="20"/>
+              </w:rPr>
+              <w:t>Reason</w:t>
+            </w:r>
+          </w:p>
+        </w:tc>
+      </w:tr>
+      <w:tr>
+        <w:trPr>
+          <w:cantSplit/>
+        </w:trPr>
+        <w:tc>
+          <w:tcPr>
+            <w:tcW w:w="4874" w:type="dxa"/>
+          </w:tcPr>
+          <w:p>
+            <w:pPr>
+              <w:spacing w:after="80"/>
+            </w:pPr>
+            <w:r>
+              <w:rPr>
+                <w:sz w:val="20"/>
+              </w:rPr>
+              <w:t>Seven artists from different genres</w:t>
+            </w:r>
+          </w:p>
+        </w:tc>
+        <w:tc>
+          <w:tcPr>
+            <w:tcW w:w="4874" w:type="dxa"/>
+          </w:tcPr>
+          <w:p>
+            <w:pPr>
+              <w:spacing w:after="80"/>
+            </w:pPr>
+            <w:r>
+              <w:rPr>
+                <w:sz w:val="20"/>
+              </w:rPr>
+              <w:t>There is enough choice for a beginner, without making Explore hard to look through.</w:t>
+            </w:r>
+          </w:p>
+        </w:tc>
+      </w:tr>
+      <w:tr>
+        <w:trPr>
+          <w:cantSplit/>
+        </w:trPr>
+        <w:tc>
+          <w:tcPr>
+            <w:tcW w:w="4874" w:type="dxa"/>
+          </w:tcPr>
+          <w:p>
+            <w:pPr>
+              <w:spacing w:after="80"/>
+            </w:pPr>
+            <w:r>
+              <w:rPr>
+                <w:sz w:val="20"/>
+              </w:rPr>
+              <w:t>Official YouTube links and credited images</w:t>
+            </w:r>
+          </w:p>
+        </w:tc>
+        <w:tc>
+          <w:tcPr>
+            <w:tcW w:w="4874" w:type="dxa"/>
+          </w:tcPr>
+          <w:p>
+            <w:pPr>
+              <w:spacing w:after="80"/>
+            </w:pPr>
+            <w:r>
+              <w:rPr>
+                <w:sz w:val="20"/>
+              </w:rPr>
+              <w:t>This avoids copying music files. Source and licence records are kept with the assets. [8]</w:t>
+            </w:r>
+          </w:p>
+        </w:tc>
+      </w:tr>
+      <w:tr>
+        <w:trPr>
+          <w:cantSplit/>
+        </w:trPr>
+        <w:tc>
+          <w:tcPr>
+            <w:tcW w:w="4874" w:type="dxa"/>
+          </w:tcPr>
+          <w:p>
+            <w:pPr>
+              <w:spacing w:after="80"/>
+            </w:pPr>
+            <w:r>
+              <w:rPr>
+                <w:sz w:val="20"/>
+              </w:rPr>
+              <w:t>Short request form</w:t>
+            </w:r>
+          </w:p>
+        </w:tc>
+        <w:tc>
+          <w:tcPr>
+            <w:tcW w:w="4874" w:type="dxa"/>
+          </w:tcPr>
+          <w:p>
+            <w:pPr>
+              <w:spacing w:after="80"/>
+            </w:pPr>
+            <w:r>
+              <w:rPr>
+                <w:sz w:val="20"/>
+              </w:rPr>
+              <w:t>It only asks for a topic, type of idea and optional reason. The visitor sends it from their own email app. [10, 11]</w:t>
+            </w:r>
+          </w:p>
+        </w:tc>
+      </w:tr>
+      <w:tr>
+        <w:trPr>
+          <w:cantSplit/>
+        </w:trPr>
+        <w:tc>
+          <w:tcPr>
+            <w:tcW w:w="4874" w:type="dxa"/>
+          </w:tcPr>
+          <w:p>
+            <w:pPr>
+              <w:spacing w:after="80"/>
+            </w:pPr>
+            <w:r>
+              <w:rPr>
+                <w:sz w:val="20"/>
+              </w:rPr>
+              <w:t>Labels, alt text, captions and keyboard controls</w:t>
+            </w:r>
+          </w:p>
+        </w:tc>
+        <w:tc>
+          <w:tcPr>
+            <w:tcW w:w="4874" w:type="dxa"/>
+          </w:tcPr>
+          <w:p>
+            <w:pPr>
+              <w:spacing w:after="80"/>
+            </w:pPr>
+            <w:r>
+              <w:rPr>
+                <w:sz w:val="20"/>
+              </w:rPr>
+              <w:t>These make the content easier to use with a keyboard, screen reader or without sound. [11]</w:t>
+            </w:r>
+          </w:p>
+        </w:tc>
+      </w:tr>
+    </w:tbl>
+    <w:p>
+      <w:pPr>
+        <w:pStyle w:val="Heading2"/>
+      </w:pPr>
+      <w:r>
+        <w:t>Site map and page plan</w:t>
+      </w:r>
+    </w:p>
+    <w:p>
+      <w:r>
+        <w:rPr>
+          <w:noProof/>
+        </w:rPr>
+        <w:drawing>
+          <wp:inline distT="0" distB="0" distL="0" distR="0" wp14:anchorId="68DE24DE" wp14:editId="2D394CCA">
+            <wp:extent cx="6035040" cy="2042629"/>
+            <wp:effectExtent l="0" t="0" r="0" b="0"/>
+            <wp:docPr id="1" name="Picture 1" descr="Home, Explore and Request are connected through the shared navigation."/>
+            <wp:cNvGraphicFramePr>
+              <a:graphicFrameLocks xmlns:a="http://schemas.openxmlformats.org/drawingml/2006/main" noChangeAspect="1"/>
+            </wp:cNvGraphicFramePr>
+            <a:graphic xmlns:a="http://schemas.openxmlformats.org/drawingml/2006/main">
+              <a:graphicData uri="http://schemas.openxmlformats.org/drawingml/2006/picture">
+                <pic:pic xmlns:pic="http://schemas.openxmlformats.org/drawingml/2006/picture">
+                  <pic:nvPicPr>
+                    <pic:cNvPr id="0" name="site-map.png"/>
+                    <pic:cNvPicPr/>
+                  </pic:nvPicPr>
+                  <pic:blipFill>
+                    <a:blip r:embed="rId8"/>
+                    <a:stretch>
+                      <a:fillRect/>
+                    </a:stretch>
+                  </pic:blipFill>
+                  <pic:spPr>
+                    <a:xfrm>
+                      <a:off x="0" y="0"/>
+                      <a:ext cx="6035040" cy="2042629"/>
+                    </a:xfrm>
+                    <a:prstGeom prst="rect">
+                      <a:avLst/>
+                    </a:prstGeom>
+                  </pic:spPr>
+                </pic:pic>
+              </a:graphicData>
+            </a:graphic>
+          </wp:inline>
+        </w:drawing>
+      </w:r>
+    </w:p>
+    <w:p>
+      <w:r>
+        <w:t>All three pages share the same navigation. Explore has genre shortcuts, and on a phone the links open inside Menu.</w:t>
+      </w:r>
+    </w:p>
+    <w:tbl>
+      <w:tblPr>
+        <w:tblStyle w:val="TableGrid"/>
+        <w:tblW w:w="0" w:type="auto"/>
+        <w:tblLook w:val="04A0" w:firstRow="1" w:lastRow="0" w:firstColumn="1" w:lastColumn="0" w:noHBand="0" w:noVBand="1"/>
+      </w:tblPr>
+      <w:tblGrid>
+        <w:gridCol w:w="4874"/>
+        <w:gridCol w:w="4874"/>
+      </w:tblGrid>
+      <w:tr>
+        <w:trPr>
+          <w:cantSplit/>
+        </w:trPr>
+        <w:tc>
+          <w:tcPr>
+            <w:tcW w:w="4874" w:type="dxa"/>
+          </w:tcPr>
+          <w:p>
+            <w:pPr>
+              <w:spacing w:after="80"/>
+            </w:pPr>
+            <w:r>
+              <w:rPr>
+                <w:sz w:val="20"/>
+              </w:rPr>
+              <w:t>Page</w:t>
+            </w:r>
+          </w:p>
+        </w:tc>
+        <w:tc>
+          <w:tcPr>
+            <w:tcW w:w="4874" w:type="dxa"/>
+          </w:tcPr>
+          <w:p>
+            <w:pPr>
+              <w:spacing w:after="80"/>
+            </w:pPr>
+            <w:r>
+              <w:rPr>
+                <w:sz w:val="20"/>
+              </w:rPr>
+              <w:t>Content and features</w:t>
+            </w:r>
+          </w:p>
+        </w:tc>
+      </w:tr>
+      <w:tr>
+        <w:trPr>
+          <w:cantSplit/>
+        </w:trPr>
+        <w:tc>
+          <w:tcPr>
+            <w:tcW w:w="4874" w:type="dxa"/>
+          </w:tcPr>
+          <w:p>
+            <w:pPr>
+              <w:spacing w:after="80"/>
+            </w:pPr>
+            <w:r>
+              <w:rPr>
+                <w:sz w:val="20"/>
+              </w:rPr>
+              <w:t>Home</w:t>
+            </w:r>
+            <w:r>
+              <w:rPr>
+                <w:sz w:val="20"/>
+              </w:rPr>
+              <w:br/>
+              <w:t>index.html</w:t>
+            </w:r>
+          </w:p>
+        </w:tc>
+        <w:tc>
+          <w:tcPr>
+            <w:tcW w:w="4874" w:type="dxa"/>
+          </w:tcPr>
+          <w:p>
+            <w:pPr>
+              <w:spacing w:after="80"/>
+            </w:pPr>
+            <w:r>
+              <w:rPr>
+                <w:sz w:val="20"/>
+              </w:rPr>
+              <w:t>Introduction, genr</w:t>
+            </w:r>
+            <w:r>
+              <w:rPr>
+                <w:sz w:val="20"/>
+              </w:rPr>
+              <w:t>es</w:t>
+            </w:r>
+            <w:r>
+              <w:rPr>
+                <w:sz w:val="20"/>
+              </w:rPr>
+              <w:t>, short timeline and video with captions and written text.</w:t>
+            </w:r>
+          </w:p>
+        </w:tc>
+      </w:tr>
+      <w:tr>
+        <w:trPr>
+          <w:cantSplit/>
+        </w:trPr>
+        <w:tc>
+          <w:tcPr>
+            <w:tcW w:w="4874" w:type="dxa"/>
+          </w:tcPr>
+          <w:p>
+            <w:pPr>
+              <w:spacing w:after="80"/>
+            </w:pPr>
+            <w:r>
+              <w:rPr>
+                <w:sz w:val="20"/>
+              </w:rPr>
+              <w:lastRenderedPageBreak/>
+              <w:t>Explore</w:t>
+            </w:r>
+            <w:r>
+              <w:rPr>
+                <w:sz w:val="20"/>
+              </w:rPr>
+              <w:br/>
+              <w:t>explore.html</w:t>
+            </w:r>
+          </w:p>
+        </w:tc>
+        <w:tc>
+          <w:tcPr>
+            <w:tcW w:w="4874" w:type="dxa"/>
+          </w:tcPr>
+          <w:p>
+            <w:pPr>
+              <w:spacing w:after="80"/>
+            </w:pPr>
+            <w:r>
+              <w:rPr>
+                <w:sz w:val="20"/>
+              </w:rPr>
+              <w:t>Artis</w:t>
+            </w:r>
+            <w:r>
+              <w:rPr>
+                <w:sz w:val="20"/>
+              </w:rPr>
+              <w:t>ts</w:t>
+            </w:r>
+            <w:r>
+              <w:rPr>
+                <w:sz w:val="20"/>
+              </w:rPr>
+              <w:t>, genre buttons, search, extra facts, larger photos and official listening links.</w:t>
+            </w:r>
+          </w:p>
+        </w:tc>
+      </w:tr>
+      <w:tr>
+        <w:trPr>
+          <w:cantSplit/>
+        </w:trPr>
+        <w:tc>
+          <w:tcPr>
+            <w:tcW w:w="4874" w:type="dxa"/>
+          </w:tcPr>
+          <w:p>
+            <w:pPr>
+              <w:spacing w:after="80"/>
+            </w:pPr>
+            <w:r>
+              <w:rPr>
+                <w:sz w:val="20"/>
+              </w:rPr>
+              <w:t>Request</w:t>
+            </w:r>
+            <w:r>
+              <w:rPr>
+                <w:sz w:val="20"/>
+              </w:rPr>
+              <w:br/>
+              <w:t>request.html</w:t>
+            </w:r>
+          </w:p>
+        </w:tc>
+        <w:tc>
+          <w:tcPr>
+            <w:tcW w:w="4874" w:type="dxa"/>
+          </w:tcPr>
+          <w:p>
+            <w:pPr>
+              <w:spacing w:after="80"/>
+            </w:pPr>
+            <w:r>
+              <w:rPr>
+                <w:sz w:val="20"/>
+              </w:rPr>
+              <w:t>R</w:t>
+            </w:r>
+            <w:r>
+              <w:rPr>
+                <w:sz w:val="20"/>
+              </w:rPr>
+              <w:t>equest form, privacy, credits and accessibility information.</w:t>
+            </w:r>
+          </w:p>
+        </w:tc>
+      </w:tr>
+    </w:tbl>
+    <w:p>
+      <w:r>
+        <w:t xml:space="preserve">Home is the starting point, Explore has the music and Request is for suggestions. Search ignores capital letters and extra spaces. If there is no result, the genre buttons are still there to </w:t>
+      </w:r>
+      <w:r>
+        <w:t>navigate</w:t>
+      </w:r>
+      <w:r>
+        <w:t xml:space="preserve"> </w:t>
+      </w:r>
+      <w:r>
+        <w:t>with</w:t>
+      </w:r>
+      <w:r>
+        <w:t>.</w:t>
+      </w:r>
+    </w:p>
+    <w:p>
+      <w:pPr>
+        <w:pStyle w:val="Heading2"/>
+      </w:pPr>
+      <w:r>
+        <w:t>Sources</w:t>
+      </w:r>
+    </w:p>
+    <w:p>
+      <w:r>
+        <w:rPr>
+          <w:sz w:val="20"/>
+        </w:rPr>
+        <w:t>[</w:t>
+      </w:r>
+      <w:r>
+        <w:rPr>
+          <w:sz w:val="20"/>
+        </w:rPr>
+        <w:t>1</w:t>
+      </w:r>
+      <w:r>
+        <w:rPr>
+          <w:sz w:val="20"/>
+        </w:rPr>
+        <w:t>] TheGreat70s, homepage. https://thegreat70s.com/</w:t>
+      </w:r>
+    </w:p>
+    <w:p>
+      <w:r>
+        <w:rPr>
+          <w:sz w:val="20"/>
+        </w:rPr>
+        <w:t>[</w:t>
+      </w:r>
+      <w:r>
+        <w:rPr>
+          <w:sz w:val="20"/>
+        </w:rPr>
+        <w:t>2</w:t>
+      </w:r>
+      <w:r>
+        <w:rPr>
+          <w:sz w:val="20"/>
+        </w:rPr>
+        <w:t>] ABBA, official homepage. https://abbasite.com/</w:t>
+      </w:r>
+    </w:p>
+    <w:p>
+      <w:r>
+        <w:rPr>
+          <w:sz w:val="20"/>
+        </w:rPr>
+        <w:t>[</w:t>
+      </w:r>
+      <w:r>
+        <w:rPr>
+          <w:sz w:val="20"/>
+        </w:rPr>
+        <w:t>3</w:t>
+      </w:r>
+      <w:r>
+        <w:rPr>
+          <w:sz w:val="20"/>
+        </w:rPr>
+        <w:t>] Rock &amp; Roll Hall of Fame, artist directory. https://rockhall.com/inductees/inductees/</w:t>
+      </w:r>
+    </w:p>
+    <w:p>
+      <w:r>
+        <w:rPr>
+          <w:sz w:val="20"/>
+        </w:rPr>
+        <w:t>[</w:t>
+      </w:r>
+      <w:r>
+        <w:rPr>
+          <w:sz w:val="20"/>
+        </w:rPr>
+        <w:t>4</w:t>
+      </w:r>
+      <w:r>
+        <w:rPr>
+          <w:sz w:val="20"/>
+        </w:rPr>
+        <w:t>] ABBA, The Story. https://abbasite.com/story/</w:t>
+      </w:r>
+    </w:p>
+    <w:p>
+      <w:r>
+        <w:rPr>
+          <w:sz w:val="20"/>
+        </w:rPr>
+        <w:t>[</w:t>
+      </w:r>
+      <w:r>
+        <w:rPr>
+          <w:sz w:val="20"/>
+        </w:rPr>
+        <w:t>5</w:t>
+      </w:r>
+      <w:r>
+        <w:rPr>
+          <w:sz w:val="20"/>
+        </w:rPr>
+        <w:t>] ABBA, In Focus: Dancing Queen. https://abbasite.com/articles/dancing-queen/</w:t>
+      </w:r>
+    </w:p>
+    <w:p>
+      <w:r>
+        <w:rPr>
+          <w:sz w:val="20"/>
+        </w:rPr>
+        <w:t>[</w:t>
+      </w:r>
+      <w:r>
+        <w:rPr>
+          <w:sz w:val="20"/>
+        </w:rPr>
+        <w:t>6</w:t>
+      </w:r>
+      <w:r>
+        <w:rPr>
+          <w:sz w:val="20"/>
+        </w:rPr>
+        <w:t>] Rock &amp; Roll Hall of Fame, David Bowie. https://rockhall.com/inductees/david-bowie/</w:t>
+      </w:r>
+    </w:p>
+    <w:p>
+      <w:r>
+        <w:rPr>
+          <w:sz w:val="20"/>
+        </w:rPr>
+        <w:t>[</w:t>
+      </w:r>
+      <w:r>
+        <w:rPr>
+          <w:sz w:val="20"/>
+        </w:rPr>
+        <w:t>7</w:t>
+      </w:r>
+      <w:r>
+        <w:rPr>
+          <w:sz w:val="20"/>
+        </w:rPr>
+        <w:t>] Official Charts, I Feel Love - Donna Summer. https://www.officialcharts.com/songs/donna-summer-i-feel-love/</w:t>
+      </w:r>
+    </w:p>
+    <w:p>
+      <w:r>
+        <w:rPr>
+          <w:sz w:val="20"/>
+        </w:rPr>
+        <w:t>[</w:t>
+      </w:r>
+      <w:r>
+        <w:rPr>
+          <w:sz w:val="20"/>
+        </w:rPr>
+        <w:t>8</w:t>
+      </w:r>
+      <w:r>
+        <w:rPr>
+          <w:sz w:val="20"/>
+        </w:rPr>
+        <w:t>] GOV.UK, Using somebody else's intellectual property: Copyright. https://www.gov.uk/using-somebody-elses-intellectual-property/copyright</w:t>
+      </w:r>
+    </w:p>
+    <w:p>
+      <w:r>
+        <w:rPr>
+          <w:sz w:val="20"/>
+        </w:rPr>
+        <w:t>[</w:t>
+      </w:r>
+      <w:r>
+        <w:rPr>
+          <w:sz w:val="20"/>
+        </w:rPr>
+        <w:t>9</w:t>
+      </w:r>
+      <w:r>
+        <w:rPr>
+          <w:sz w:val="20"/>
+        </w:rPr>
+        <w:t>] ICO, Cookies and privacy notices in detail. Guidance marked under review. https://ico.org.uk/for-organisations/advice-for-small-organisations/privacy-notices-and-cookies/cookies-and-privacy-notices-in-detail/</w:t>
+      </w:r>
+    </w:p>
+    <w:p>
+      <w:r>
+        <w:rPr>
+          <w:sz w:val="20"/>
+        </w:rPr>
+        <w:t>[1</w:t>
+      </w:r>
+      <w:r>
+        <w:rPr>
+          <w:sz w:val="20"/>
+        </w:rPr>
+        <w:t>0</w:t>
+      </w:r>
+      <w:r>
+        <w:rPr>
+          <w:sz w:val="20"/>
+        </w:rPr>
+        <w:t>] ICO, Children and the UK GDPR. https://ico.org.uk/for-organisations/uk-gdpr-guidance-and-resources/childrens-information/children-and-the-uk-gdpr/</w:t>
+      </w:r>
+    </w:p>
+    <w:p>
+      <w:r>
+        <w:rPr>
+          <w:sz w:val="20"/>
+        </w:rPr>
+        <w:t>[1</w:t>
+      </w:r>
+      <w:r>
+        <w:rPr>
+          <w:sz w:val="20"/>
+        </w:rPr>
+        <w:t>1</w:t>
+      </w:r>
+      <w:r>
+        <w:rPr>
+          <w:sz w:val="20"/>
+        </w:rPr>
+        <w:t>] W3C, How to Meet WCAG 2.2. https://www.w3.org/WAI/WCAG22/quickref/</w:t>
+      </w:r>
+    </w:p>
+    <w:p>
+      <w:r>
+        <w:br w:type="page"/>
+      </w:r>
+    </w:p>
+    <w:p>
+      <w:pPr>
+        <w:pStyle w:val="Heading1"/>
+      </w:pPr>
+      <w:r>
+        <w:lastRenderedPageBreak/>
+        <w:t>Task 2: Designs and assets</w:t>
+      </w:r>
+    </w:p>
+    <w:p>
+      <w:r>
+        <w:t>I kept the three pages from my plan. Georgia is used for headings and Arial for the main text, because both are easy to read. I used the same dark blue, gold and pale background on every page so it feels like one site.</w:t>
+      </w:r>
+    </w:p>
+    <w:p>
+      <w:r>
+        <w:rPr>
+          <w:noProof/>
+        </w:rPr>
+        <w:drawing>
+          <wp:inline distT="0" distB="0" distL="0" distR="0" wp14:anchorId="0A43A9B1" wp14:editId="60D1A9A4">
+            <wp:extent cx="4389120" cy="2179425"/>
+            <wp:effectExtent l="0" t="0" r="0" b="0"/>
+            <wp:docPr id="2" name="Picture 2" descr="Colours and text styles used across the website."/>
+            <wp:cNvGraphicFramePr>
+              <a:graphicFrameLocks xmlns:a="http://schemas.openxmlformats.org/drawingml/2006/main" noChangeAspect="1"/>
+            </wp:cNvGraphicFramePr>
+            <a:graphic xmlns:a="http://schemas.openxmlformats.org/drawingml/2006/main">
+              <a:graphicData uri="http://schemas.openxmlformats.org/drawingml/2006/picture">
+                <pic:pic xmlns:pic="http://schemas.openxmlformats.org/drawingml/2006/picture">
+                  <pic:nvPicPr>
+                    <pic:cNvPr id="0" name="style-sheet.png"/>
+                    <pic:cNvPicPr/>
+                  </pic:nvPicPr>
+                  <pic:blipFill>
+                    <a:blip r:embed="rId9"/>
+                    <a:stretch>
+                      <a:fillRect/>
+                    </a:stretch>
+                  </pic:blipFill>
+                  <pic:spPr>
+                    <a:xfrm>
+                      <a:off x="0" y="0"/>
+                      <a:ext cx="4389120" cy="2179425"/>
+                    </a:xfrm>
+                    <a:prstGeom prst="rect">
+                      <a:avLst/>
+                    </a:prstGeom>
+                  </pic:spPr>
+                </pic:pic>
+              </a:graphicData>
+            </a:graphic>
+          </wp:inline>
+        </w:drawing>
+      </w:r>
+    </w:p>
+    <w:p>
+      <w:pPr>
+        <w:pStyle w:val="Caption"/>
+      </w:pPr>
+      <w:r>
+        <w:t>Colours and text styles used across the website.</w:t>
+      </w:r>
+    </w:p>
+    <w:p>
+      <w:pPr>
+        <w:pStyle w:val="Heading2"/>
+      </w:pPr>
+      <w:r>
+        <w:t>Final page designs</w:t>
+      </w:r>
+    </w:p>
+    <w:p>
+      <w:r>
+        <w:t>The three designs below show the wireframe, finished desktop page and phone layout. Full-size versions are saved in website-design/page-plans and website-design/website.</w:t>
+      </w:r>
+    </w:p>
+    <w:tbl>
+      <w:tblPr>
+        <w:tblStyle w:val="TableGrid"/>
+        <w:tblW w:w="0" w:type="auto"/>
+        <w:tblLook w:val="04A0" w:firstRow="1" w:lastRow="0" w:firstColumn="1" w:lastColumn="0" w:noHBand="0" w:noVBand="1"/>
+      </w:tblPr>
+      <w:tblGrid>
+        <w:gridCol w:w="3250"/>
+        <w:gridCol w:w="3250"/>
+        <w:gridCol w:w="3250"/>
+      </w:tblGrid>
+      <w:tr>
+        <w:tc>
+          <w:tcPr>
+            <w:tcW w:w="3250" w:type="dxa"/>
+          </w:tcPr>
+          <w:p>
+            <w:r>
+              <w:t>Home</w:t>
+            </w:r>
+          </w:p>
+          <w:p>
+            <w:r>
+              <w:rPr>
+                <w:noProof/>
+              </w:rPr>
+              <w:drawing>
+                <wp:inline distT="0" distB="0" distL="0" distR="0" wp14:anchorId="6665D736" wp14:editId="6BFE1C44">
+                  <wp:extent cx="1737360" cy="1485443"/>
+                  <wp:effectExtent l="0" t="0" r="0" b="0"/>
+                  <wp:docPr id="3" name="Picture 3"/>
+                  <wp:cNvGraphicFramePr>
+                    <a:graphicFrameLocks xmlns:a="http://schemas.openxmlformats.org/drawingml/2006/main" noChangeAspect="1"/>
+                  </wp:cNvGraphicFramePr>
+                  <a:graphic xmlns:a="http://schemas.openxmlformats.org/drawingml/2006/main">
+                    <a:graphicData uri="http://schemas.openxmlformats.org/drawingml/2006/picture">
+                      <pic:pic xmlns:pic="http://schemas.openxmlformats.org/drawingml/2006/picture">
+                        <pic:nvPicPr>
+                          <pic:cNvPr id="0" name="home-sheet.png"/>
+                          <pic:cNvPicPr/>
+                        </pic:nvPicPr>
+                        <pic:blipFill>
+                          <a:blip r:embed="rId10"/>
+                          <a:stretch>
+                            <a:fillRect/>
+                          </a:stretch>
+                        </pic:blipFill>
+                        <pic:spPr>
+                          <a:xfrm>
+                            <a:off x="0" y="0"/>
+                            <a:ext cx="1737360" cy="1485443"/>
+                          </a:xfrm>
+                          <a:prstGeom prst="rect">
+                            <a:avLst/>
+                          </a:prstGeom>
+                        </pic:spPr>
+                      </pic:pic>
+                    </a:graphicData>
+                  </a:graphic>
+                </wp:inline>
+              </w:drawing>
+            </w:r>
+          </w:p>
+        </w:tc>
+        <w:tc>
+          <w:tcPr>
+            <w:tcW w:w="3250" w:type="dxa"/>
+          </w:tcPr>
+          <w:p>
+            <w:r>
+              <w:t>Explore</w:t>
+            </w:r>
+          </w:p>
+          <w:p>
+            <w:r>
+              <w:rPr>
+                <w:noProof/>
+              </w:rPr>
+              <w:drawing>
+                <wp:inline distT="0" distB="0" distL="0" distR="0" wp14:anchorId="0E8F3AE4" wp14:editId="27D2FCBE">
+                  <wp:extent cx="1737360" cy="1485443"/>
+                  <wp:effectExtent l="0" t="0" r="0" b="0"/>
+                  <wp:docPr id="4" name="Picture 4"/>
+                  <wp:cNvGraphicFramePr>
+                    <a:graphicFrameLocks xmlns:a="http://schemas.openxmlformats.org/drawingml/2006/main" noChangeAspect="1"/>
+                  </wp:cNvGraphicFramePr>
+                  <a:graphic xmlns:a="http://schemas.openxmlformats.org/drawingml/2006/main">
+                    <a:graphicData uri="http://schemas.openxmlformats.org/drawingml/2006/picture">
+                      <pic:pic xmlns:pic="http://schemas.openxmlformats.org/drawingml/2006/picture">
+                        <pic:nvPicPr>
+                          <pic:cNvPr id="0" name="explore-sheet.png"/>
+                          <pic:cNvPicPr/>
+                        </pic:nvPicPr>
+                        <pic:blipFill>
+                          <a:blip r:embed="rId11"/>
+                          <a:stretch>
+                            <a:fillRect/>
+                          </a:stretch>
+                        </pic:blipFill>
+                        <pic:spPr>
+                          <a:xfrm>
+                            <a:off x="0" y="0"/>
+                            <a:ext cx="1737360" cy="1485443"/>
+                          </a:xfrm>
+                          <a:prstGeom prst="rect">
+                            <a:avLst/>
+                          </a:prstGeom>
+                        </pic:spPr>
+                      </pic:pic>
+                    </a:graphicData>
+                  </a:graphic>
+                </wp:inline>
+              </w:drawing>
+            </w:r>
+          </w:p>
+        </w:tc>
+        <w:tc>
+          <w:tcPr>
+            <w:tcW w:w="3250" w:type="dxa"/>
+          </w:tcPr>
+          <w:p>
+            <w:r>
+              <w:t>Request</w:t>
+            </w:r>
+          </w:p>
+          <w:p>
+            <w:r>
+              <w:rPr>
+                <w:noProof/>
+              </w:rPr>
+              <w:drawing>
+                <wp:inline distT="0" distB="0" distL="0" distR="0" wp14:anchorId="6436DC8A" wp14:editId="27B779F8">
+                  <wp:extent cx="1737360" cy="1485443"/>
+                  <wp:effectExtent l="0" t="0" r="0" b="0"/>
+                  <wp:docPr id="5" name="Picture 5"/>
+                  <wp:cNvGraphicFramePr>
+                    <a:graphicFrameLocks xmlns:a="http://schemas.openxmlformats.org/drawingml/2006/main" noChangeAspect="1"/>
+                  </wp:cNvGraphicFramePr>
+                  <a:graphic xmlns:a="http://schemas.openxmlformats.org/drawingml/2006/main">
+                    <a:graphicData uri="http://schemas.openxmlformats.org/drawingml/2006/picture">
+                      <pic:pic xmlns:pic="http://schemas.openxmlformats.org/drawingml/2006/picture">
+                        <pic:nvPicPr>
+                          <pic:cNvPr id="0" name="request-sheet.png"/>
+                          <pic:cNvPicPr/>
+                        </pic:nvPicPr>
+                        <pic:blipFill>
+                          <a:blip r:embed="rId12"/>
+                          <a:stretch>
+                            <a:fillRect/>
+                          </a:stretch>
+                        </pic:blipFill>
+                        <pic:spPr>
+                          <a:xfrm>
+                            <a:off x="0" y="0"/>
+                            <a:ext cx="1737360" cy="1485443"/>
+                          </a:xfrm>
+                          <a:prstGeom prst="rect">
+                            <a:avLst/>
+                          </a:prstGeom>
+                        </pic:spPr>
+                      </pic:pic>
+                    </a:graphicData>
+                  </a:graphic>
+                </wp:inline>
+              </w:drawing>
+            </w:r>
+          </w:p>
+        </w:tc>
+      </w:tr>
+    </w:tbl>
+    <w:p>
+      <w:r>
+        <w:t>Home gives a quick way into the music. Explore keeps each artist, photo and song together, with extra facts hidden in accordions. Request uses a short labelled form. On a phone, the content becomes one column and the page links go inside Menu.</w:t>
+      </w:r>
+    </w:p>
+    <w:p>
+      <w:pPr>
+        <w:pStyle w:val="Heading2"/>
+      </w:pPr>
+      <w:r>
+        <w:lastRenderedPageBreak/>
+        <w:t>Important states</w:t>
+      </w:r>
+    </w:p>
+    <w:p>
+      <w:r>
+        <w:rPr>
+          <w:noProof/>
+        </w:rPr>
+        <w:drawing>
+          <wp:inline distT="0" distB="0" distL="0" distR="0" wp14:anchorId="44CEDEC8" wp14:editId="4F4587A1">
+            <wp:extent cx="3474720" cy="6344079"/>
+            <wp:effectExtent l="0" t="0" r="0" b="0"/>
+            <wp:docPr id="6" name="Picture 6" descr="Drop-down, search, image popup and form messages."/>
+            <wp:cNvGraphicFramePr>
+              <a:graphicFrameLocks xmlns:a="http://schemas.openxmlformats.org/drawingml/2006/main" noChangeAspect="1"/>
+            </wp:cNvGraphicFramePr>
+            <a:graphic xmlns:a="http://schemas.openxmlformats.org/drawingml/2006/main">
+              <a:graphicData uri="http://schemas.openxmlformats.org/drawingml/2006/picture">
+                <pic:pic xmlns:pic="http://schemas.openxmlformats.org/drawingml/2006/picture">
+                  <pic:nvPicPr>
+                    <pic:cNvPr id="0" name="states-desktop.png"/>
+                    <pic:cNvPicPr/>
+                  </pic:nvPicPr>
+                  <pic:blipFill>
+                    <a:blip r:embed="rId13"/>
+                    <a:stretch>
+                      <a:fillRect/>
+                    </a:stretch>
+                  </pic:blipFill>
+                  <pic:spPr>
+                    <a:xfrm>
+                      <a:off x="0" y="0"/>
+                      <a:ext cx="3474720" cy="6344079"/>
+                    </a:xfrm>
+                    <a:prstGeom prst="rect">
+                      <a:avLst/>
+                    </a:prstGeom>
+                  </pic:spPr>
+                </pic:pic>
+              </a:graphicData>
+            </a:graphic>
+          </wp:inline>
+        </w:drawing>
+      </w:r>
+    </w:p>
+    <w:p>
+      <w:pPr>
+        <w:pStyle w:val="Caption"/>
+      </w:pPr>
+      <w:r>
+        <w:t>Drop-down, search, image popup and form messages.</w:t>
+      </w:r>
+    </w:p>
+    <w:p>
+      <w:r>
+        <w:t>The Explore menu links to each genre. Search stays on Explore. A blank search gives help and no matches gives a way back to all artists. The image popup has a Close button and keyboard support. The request button checks the required boxes, then opens a pre-filled email for the visitor to send.</w:t>
+      </w:r>
+    </w:p>
+    <w:p>
+      <w:pPr>
+        <w:pStyle w:val="Heading2"/>
+      </w:pPr>
+      <w:r>
+        <w:lastRenderedPageBreak/>
+        <w:t>Review and assets</w:t>
+      </w:r>
+    </w:p>
+    <w:p>
+      <w:r>
+        <w:rPr>
+          <w:noProof/>
+        </w:rPr>
+        <w:drawing>
+          <wp:inline distT="0" distB="0" distL="0" distR="0" wp14:anchorId="397117AF" wp14:editId="42A67981">
+            <wp:extent cx="2926080" cy="3483429"/>
+            <wp:effectExtent l="0" t="0" r="0" b="0"/>
+            <wp:docPr id="7" name="Picture 7" descr="First Home phone layout compared with the revised layout."/>
+            <wp:cNvGraphicFramePr>
+              <a:graphicFrameLocks xmlns:a="http://schemas.openxmlformats.org/drawingml/2006/main" noChangeAspect="1"/>
+            </wp:cNvGraphicFramePr>
+            <a:graphic xmlns:a="http://schemas.openxmlformats.org/drawingml/2006/main">
+              <a:graphicData uri="http://schemas.openxmlformats.org/drawingml/2006/picture">
+                <pic:pic xmlns:pic="http://schemas.openxmlformats.org/drawingml/2006/picture">
+                  <pic:nvPicPr>
+                    <pic:cNvPr id="0" name="home-comparison.png"/>
+                    <pic:cNvPicPr/>
+                  </pic:nvPicPr>
+                  <pic:blipFill>
+                    <a:blip r:embed="rId14"/>
+                    <a:stretch>
+                      <a:fillRect/>
+                    </a:stretch>
+                  </pic:blipFill>
+                  <pic:spPr>
+                    <a:xfrm>
+                      <a:off x="0" y="0"/>
+                      <a:ext cx="2926080" cy="3483429"/>
+                    </a:xfrm>
+                    <a:prstGeom prst="rect">
+                      <a:avLst/>
+                    </a:prstGeom>
+                  </pic:spPr>
+                </pic:pic>
+              </a:graphicData>
+            </a:graphic>
+          </wp:inline>
+        </w:drawing>
+      </w:r>
+    </w:p>
+    <w:p>
+      <w:pPr>
+        <w:pStyle w:val="Caption"/>
+      </w:pPr>
+      <w:r>
+        <w:t>First Home phone layout compared with the revised layout.</w:t>
+      </w:r>
+    </w:p>
+    <w:p>
+      <w:r>
+        <w:t>In my first Home design, the heading and record took up too much room, so the genre cards were too far down on a phone. I made the heading smaller and removed the fixed height. The cards now appear much sooner.</w:t>
+      </w:r>
+    </w:p>
+    <w:p>
+      <w:r>
+        <w:t>The pages fitted both screen sizes and the links stayed in the same place. I also checked the popup with a keyboard. Explore has seven artists from different styles, and videos only load when someone presses Play.</w:t>
+      </w:r>
+    </w:p>
+    <w:p>
+      <w:r>
+        <w:t xml:space="preserve">The logo and record illustrations were made in Canva, then saved as SVG files for the website. I used credited artist photos, </w:t>
+      </w:r>
+      <w:proofErr w:type="spellStart"/>
+      <w:r>
+        <w:t>Lucide</w:t>
+      </w:r>
+      <w:proofErr w:type="spellEnd"/>
+      <w:r>
+        <w:t xml:space="preserve"> icons</w:t>
+      </w:r>
+      <w:r>
+        <w:t xml:space="preserve"> [12]</w:t>
+      </w:r>
+      <w:r>
+        <w:t xml:space="preserve"> and official YouTube embeds. The video has original title cards and script, an ElevenLabs voiceover, captions and a written transcript. </w:t>
+      </w:r>
+    </w:p>
+    <w:p>
+      <w:r>
+        <w:t xml:space="preserve">[12] </w:t>
+      </w:r>
+      <w:proofErr w:type="spellStart"/>
+      <w:r>
+        <w:t>Lucide</w:t>
+      </w:r>
+      <w:proofErr w:type="spellEnd"/>
+      <w:r>
+        <w:t xml:space="preserve"> </w:t>
+      </w:r>
+      <w:proofErr w:type="spellStart"/>
+      <w:r>
+        <w:t>licence</w:t>
+      </w:r>
+      <w:proofErr w:type="spellEnd"/>
+      <w:r>
+        <w:t>: https://lucide.dev/license.</w:t>
+      </w:r>
+    </w:p>
+    <w:p>
+      <w:r>
+        <w:br w:type="page"/>
+      </w:r>
+    </w:p>
+    <w:p>
+      <w:pPr>
+        <w:pStyle w:val="Heading1"/>
+      </w:pPr>
+      <w:r>
+        <w:lastRenderedPageBreak/>
+        <w:t>Task 3: Building and testing</w:t>
+      </w:r>
+    </w:p>
+    <w:p>
+      <w:r>
+        <w:t xml:space="preserve">I made the </w:t>
+      </w:r>
+      <w:r>
+        <w:t>3</w:t>
+      </w:r>
+      <w:r>
+        <w:t xml:space="preserve"> pages in HTML, CSS and Javascript. I used one CSS file so the colours, fonts and links stay the same on each page. I kept the writing as normal webpage text, so it can be searched and read properly.</w:t>
+      </w:r>
+    </w:p>
+    <w:p>
+      <w:r>
+        <w:rPr>
+          <w:noProof/>
+        </w:rPr>
+        <w:lastRenderedPageBreak/>
+        <w:drawing>
+          <wp:inline distT="0" distB="0" distL="0" distR="0" wp14:anchorId="0790170B" wp14:editId="3DD0B7EB">
+            <wp:extent cx="5212080" cy="16621649"/>
+            <wp:effectExtent l="0" t="0" r="0" b="0"/>
+            <wp:docPr id="8" name="Picture 8" descr="Explore page after building: search, genre choices, artist sections and listening links."/>
+            <wp:cNvGraphicFramePr>
+              <a:graphicFrameLocks xmlns:a="http://schemas.openxmlformats.org/drawingml/2006/main" noChangeAspect="1"/>
+            </wp:cNvGraphicFramePr>
+            <a:graphic xmlns:a="http://schemas.openxmlformats.org/drawingml/2006/main">
+              <a:graphicData uri="http://schemas.openxmlformats.org/drawingml/2006/picture">
+                <pic:pic xmlns:pic="http://schemas.openxmlformats.org/drawingml/2006/picture">
+                  <pic:nvPicPr>
+                    <pic:cNvPr id="0" name="explore-desktop.png"/>
+                    <pic:cNvPicPr/>
+                  </pic:nvPicPr>
+                  <pic:blipFill>
+                    <a:blip r:embed="rId15"/>
+                    <a:stretch>
+                      <a:fillRect/>
+                    </a:stretch>
+                  </pic:blipFill>
+                  <pic:spPr>
+                    <a:xfrm>
+                      <a:off x="0" y="0"/>
+                      <a:ext cx="5212080" cy="16621649"/>
+                    </a:xfrm>
+                    <a:prstGeom prst="rect">
+                      <a:avLst/>
+                    </a:prstGeom>
+                  </pic:spPr>
+                </pic:pic>
+              </a:graphicData>
+            </a:graphic>
+          </wp:inline>
+        </w:drawing>
+      </w:r>
+    </w:p>
+    <w:p>
+      <w:pPr>
+        <w:pStyle w:val="Caption"/>
+      </w:pPr>
+      <w:r>
+        <w:lastRenderedPageBreak/>
+        <w:t>Explore page after building: search, genre choices, artist sections and listening links.</w:t>
+      </w:r>
+    </w:p>
+    <w:p>
+      <w:r>
+        <w:t>I kept all the artists on Explore because it is easier to look through them in one place. Search takes you there too. The genre buttons still work with search, so you can look for ABBA while keeping Pop selected. The request link checks the required boxes before it opens an email.</w:t>
+      </w:r>
+    </w:p>
+    <w:p>
+      <w:pPr>
+        <w:pStyle w:val="Heading2"/>
+      </w:pPr>
+      <w:r>
+        <w:t>Changes made while building</w:t>
+      </w:r>
+    </w:p>
+    <w:p>
+      <w:r>
+        <w:t>I made the Explore button open a list of the music styles. On a phone, the Menu button puts the page links into one list. I also added a Skip to content link and made the keyboard outline easier to see. The photo popup has a Close button, works with Escape and sends you back to the same button when it closes.</w:t>
+      </w:r>
+    </w:p>
+    <w:p>
+      <w:r>
+        <w:t xml:space="preserve">The song videos only load after someone presses Play, so the page is not trying to load all of them straight away. Sources and credits open in a new tab, which means people do not lose their place on the </w:t>
+      </w:r>
+      <w:r>
+        <w:t>web</w:t>
+      </w:r>
+      <w:r>
+        <w:t>site.</w:t>
+      </w:r>
+    </w:p>
+    <w:p>
+      <w:pPr>
+        <w:pStyle w:val="Heading2"/>
+      </w:pPr>
+      <w:r>
+        <w:t>Functionality checks</w:t>
+      </w:r>
+    </w:p>
+    <w:p>
+      <w:r>
+        <w:t xml:space="preserve">I tried the pages on Edge on my laptop and at phone size. I also used the keyboard for the menu, Skip link and bigger-photo button. I checked the YouTube videos in my local preview as well. </w:t>
+      </w:r>
+    </w:p>
+    <w:tbl>
+      <w:tblPr>
+        <w:tblStyle w:val="TableGrid"/>
+        <w:tblW w:w="0" w:type="auto"/>
+        <w:tblLook w:val="04A0" w:firstRow="1" w:lastRow="0" w:firstColumn="1" w:lastColumn="0" w:noHBand="0" w:noVBand="1"/>
+      </w:tblPr>
+      <w:tblGrid>
+        <w:gridCol w:w="3250"/>
+        <w:gridCol w:w="3250"/>
+        <w:gridCol w:w="3250"/>
+      </w:tblGrid>
+      <w:tr>
+        <w:tc>
+          <w:tcPr>
+            <w:tcW w:w="3250" w:type="dxa"/>
+          </w:tcPr>
+          <w:p>
+            <w:pPr>
+              <w:spacing w:after="60"/>
+            </w:pPr>
+            <w:r>
+              <w:rPr>
+                <w:sz w:val="18"/>
+              </w:rPr>
+              <w:t>Check</w:t>
+            </w:r>
+          </w:p>
+        </w:tc>
+        <w:tc>
+          <w:tcPr>
+            <w:tcW w:w="3250" w:type="dxa"/>
+          </w:tcPr>
+          <w:p>
+            <w:pPr>
+              <w:spacing w:after="60"/>
+            </w:pPr>
+            <w:r>
+              <w:rPr>
+                <w:sz w:val="18"/>
+              </w:rPr>
+              <w:t>Result</w:t>
+            </w:r>
+          </w:p>
+        </w:tc>
+        <w:tc>
+          <w:tcPr>
+            <w:tcW w:w="3250" w:type="dxa"/>
+          </w:tcPr>
+          <w:p>
+            <w:pPr>
+              <w:spacing w:after="60"/>
+            </w:pPr>
+            <w:r>
+              <w:rPr>
+                <w:sz w:val="18"/>
+              </w:rPr>
+              <w:t>What happened</w:t>
+            </w:r>
+          </w:p>
+        </w:tc>
+      </w:tr>
+      <w:tr>
+        <w:tc>
+          <w:tcPr>
+            <w:tcW w:w="3250" w:type="dxa"/>
+          </w:tcPr>
+          <w:p>
+            <w:pPr>
+              <w:spacing w:after="60"/>
+            </w:pPr>
+            <w:r>
+              <w:rPr>
+                <w:sz w:val="18"/>
+              </w:rPr>
+              <w:t>index.html on a computer</w:t>
+            </w:r>
+          </w:p>
+        </w:tc>
+        <w:tc>
+          <w:tcPr>
+            <w:tcW w:w="3250" w:type="dxa"/>
+          </w:tcPr>
+          <w:p>
+            <w:pPr>
+              <w:spacing w:after="60"/>
+            </w:pPr>
+            <w:r>
+              <w:rPr>
+                <w:sz w:val="18"/>
+              </w:rPr>
+              <w:t>Pass</w:t>
+            </w:r>
+          </w:p>
+        </w:tc>
+        <w:tc>
+          <w:tcPr>
+            <w:tcW w:w="3250" w:type="dxa"/>
+          </w:tcPr>
+          <w:p>
+            <w:pPr>
+              <w:spacing w:after="60"/>
+            </w:pPr>
+            <w:r>
+              <w:rPr>
+                <w:sz w:val="18"/>
+              </w:rPr>
+              <w:t>Nothing went off the side of the page.</w:t>
+            </w:r>
+          </w:p>
+        </w:tc>
+      </w:tr>
+      <w:tr>
+        <w:tc>
+          <w:tcPr>
+            <w:tcW w:w="3250" w:type="dxa"/>
+          </w:tcPr>
+          <w:p>
+            <w:pPr>
+              <w:spacing w:after="60"/>
+            </w:pPr>
+            <w:r>
+              <w:rPr>
+                <w:sz w:val="18"/>
+              </w:rPr>
+              <w:t>index.html on a phone</w:t>
+            </w:r>
+          </w:p>
+        </w:tc>
+        <w:tc>
+          <w:tcPr>
+            <w:tcW w:w="3250" w:type="dxa"/>
+          </w:tcPr>
+          <w:p>
+            <w:pPr>
+              <w:spacing w:after="60"/>
+            </w:pPr>
+            <w:r>
+              <w:rPr>
+                <w:sz w:val="18"/>
+              </w:rPr>
+              <w:t>Pass</w:t>
+            </w:r>
+          </w:p>
+        </w:tc>
+        <w:tc>
+          <w:tcPr>
+            <w:tcW w:w="3250" w:type="dxa"/>
+          </w:tcPr>
+          <w:p>
+            <w:pPr>
+              <w:spacing w:after="60"/>
+            </w:pPr>
+            <w:r>
+              <w:rPr>
+                <w:sz w:val="18"/>
+              </w:rPr>
+              <w:t>The page still fitted the phone screen.</w:t>
+            </w:r>
+          </w:p>
+        </w:tc>
+      </w:tr>
+      <w:tr>
+        <w:tc>
+          <w:tcPr>
+            <w:tcW w:w="3250" w:type="dxa"/>
+          </w:tcPr>
+          <w:p>
+            <w:pPr>
+              <w:spacing w:after="60"/>
+            </w:pPr>
+            <w:r>
+              <w:rPr>
+                <w:sz w:val="18"/>
+              </w:rPr>
+              <w:t>explore.html on a computer</w:t>
+            </w:r>
+          </w:p>
+        </w:tc>
+        <w:tc>
+          <w:tcPr>
+            <w:tcW w:w="3250" w:type="dxa"/>
+          </w:tcPr>
+          <w:p>
+            <w:pPr>
+              <w:spacing w:after="60"/>
+            </w:pPr>
+            <w:r>
+              <w:rPr>
+                <w:sz w:val="18"/>
+              </w:rPr>
+              <w:t>Pass</w:t>
+            </w:r>
+          </w:p>
+        </w:tc>
+        <w:tc>
+          <w:tcPr>
+            <w:tcW w:w="3250" w:type="dxa"/>
+          </w:tcPr>
+          <w:p>
+            <w:pPr>
+              <w:spacing w:after="60"/>
+            </w:pPr>
+            <w:r>
+              <w:rPr>
+                <w:sz w:val="18"/>
+              </w:rPr>
+              <w:t>Nothing went off the side of the page.</w:t>
+            </w:r>
+          </w:p>
+        </w:tc>
+      </w:tr>
+      <w:tr>
+        <w:tc>
+          <w:tcPr>
+            <w:tcW w:w="3250" w:type="dxa"/>
+          </w:tcPr>
+          <w:p>
+            <w:pPr>
+              <w:spacing w:after="60"/>
+            </w:pPr>
+            <w:r>
+              <w:rPr>
+                <w:sz w:val="18"/>
+              </w:rPr>
+              <w:t>explore.html on a phone</w:t>
+            </w:r>
+          </w:p>
+        </w:tc>
+        <w:tc>
+          <w:tcPr>
+            <w:tcW w:w="3250" w:type="dxa"/>
+          </w:tcPr>
+          <w:p>
+            <w:pPr>
+              <w:spacing w:after="60"/>
+            </w:pPr>
+            <w:r>
+              <w:rPr>
+                <w:sz w:val="18"/>
+              </w:rPr>
+              <w:t>Pass</w:t>
+            </w:r>
+          </w:p>
+        </w:tc>
+        <w:tc>
+          <w:tcPr>
+            <w:tcW w:w="3250" w:type="dxa"/>
+          </w:tcPr>
+          <w:p>
+            <w:pPr>
+              <w:spacing w:after="60"/>
+            </w:pPr>
+            <w:r>
+              <w:rPr>
+                <w:sz w:val="18"/>
+              </w:rPr>
+              <w:t>The page still fitted the phone screen.</w:t>
+            </w:r>
+          </w:p>
+        </w:tc>
+      </w:tr>
+      <w:tr>
+        <w:tc>
+          <w:tcPr>
+            <w:tcW w:w="3250" w:type="dxa"/>
+          </w:tcPr>
+          <w:p>
+            <w:pPr>
+              <w:spacing w:after="60"/>
+            </w:pPr>
+            <w:r>
+              <w:rPr>
+                <w:sz w:val="18"/>
+              </w:rPr>
+              <w:t>request.html on a computer</w:t>
+            </w:r>
+          </w:p>
+        </w:tc>
+        <w:tc>
+          <w:tcPr>
+            <w:tcW w:w="3250" w:type="dxa"/>
+          </w:tcPr>
+          <w:p>
+            <w:pPr>
+              <w:spacing w:after="60"/>
+            </w:pPr>
+            <w:r>
+              <w:rPr>
+                <w:sz w:val="18"/>
+              </w:rPr>
+              <w:t>Pass</w:t>
+            </w:r>
+          </w:p>
+        </w:tc>
+        <w:tc>
+          <w:tcPr>
+            <w:tcW w:w="3250" w:type="dxa"/>
+          </w:tcPr>
+          <w:p>
+            <w:pPr>
+              <w:spacing w:after="60"/>
+            </w:pPr>
+            <w:r>
+              <w:rPr>
+                <w:sz w:val="18"/>
+              </w:rPr>
+              <w:t>Nothing went off the side of the page.</w:t>
+            </w:r>
+          </w:p>
+        </w:tc>
+      </w:tr>
+      <w:tr>
+        <w:tc>
+          <w:tcPr>
+            <w:tcW w:w="3250" w:type="dxa"/>
+          </w:tcPr>
+          <w:p>
+            <w:pPr>
+              <w:spacing w:after="60"/>
+            </w:pPr>
+            <w:r>
+              <w:rPr>
+                <w:sz w:val="18"/>
+              </w:rPr>
+              <w:t>request.html on a phone</w:t>
+            </w:r>
+          </w:p>
+        </w:tc>
+        <w:tc>
+          <w:tcPr>
+            <w:tcW w:w="3250" w:type="dxa"/>
+          </w:tcPr>
+          <w:p>
+            <w:pPr>
+              <w:spacing w:after="60"/>
+            </w:pPr>
+            <w:r>
+              <w:rPr>
+                <w:sz w:val="18"/>
+              </w:rPr>
+              <w:t>Pass</w:t>
+            </w:r>
+          </w:p>
+        </w:tc>
+        <w:tc>
+          <w:tcPr>
+            <w:tcW w:w="3250" w:type="dxa"/>
+          </w:tcPr>
+          <w:p>
+            <w:pPr>
+              <w:spacing w:after="60"/>
+            </w:pPr>
+            <w:r>
+              <w:rPr>
+                <w:sz w:val="18"/>
+              </w:rPr>
+              <w:t>The page still fitted the phone screen.</w:t>
+            </w:r>
+          </w:p>
+        </w:tc>
+      </w:tr>
+      <w:tr>
+        <w:tc>
+          <w:tcPr>
+            <w:tcW w:w="3250" w:type="dxa"/>
+          </w:tcPr>
+          <w:p>
+            <w:pPr>
+              <w:spacing w:after="60"/>
+            </w:pPr>
+            <w:r>
+              <w:rPr>
+                <w:sz w:val="18"/>
+              </w:rPr>
+              <w:t>Skip link</w:t>
+            </w:r>
+          </w:p>
+        </w:tc>
+        <w:tc>
+          <w:tcPr>
+            <w:tcW w:w="3250" w:type="dxa"/>
+          </w:tcPr>
+          <w:p>
+            <w:pPr>
+              <w:spacing w:after="60"/>
+            </w:pPr>
+            <w:r>
+              <w:rPr>
+                <w:sz w:val="18"/>
+              </w:rPr>
+              <w:t>Pass</w:t>
+            </w:r>
+          </w:p>
+        </w:tc>
+        <w:tc>
+          <w:tcPr>
+            <w:tcW w:w="3250" w:type="dxa"/>
+          </w:tcPr>
+          <w:p>
+            <w:pPr>
+              <w:spacing w:after="60"/>
+            </w:pPr>
+            <w:r>
+              <w:rPr>
+                <w:sz w:val="18"/>
+              </w:rPr>
+              <w:t>It took me straight to the main part of the page.</w:t>
+            </w:r>
+          </w:p>
+        </w:tc>
+      </w:tr>
+      <w:tr>
+        <w:tc>
+          <w:tcPr>
+            <w:tcW w:w="3250" w:type="dxa"/>
+          </w:tcPr>
+          <w:p>
+            <w:pPr>
+              <w:spacing w:after="60"/>
+            </w:pPr>
+            <w:r>
+              <w:rPr>
+                <w:sz w:val="18"/>
+              </w:rPr>
+              <w:t>Explore menu</w:t>
+            </w:r>
+          </w:p>
+        </w:tc>
+        <w:tc>
+          <w:tcPr>
+            <w:tcW w:w="3250" w:type="dxa"/>
+          </w:tcPr>
+          <w:p>
+            <w:pPr>
+              <w:spacing w:after="60"/>
+            </w:pPr>
+            <w:r>
+              <w:rPr>
+                <w:sz w:val="18"/>
+              </w:rPr>
+              <w:t>Pass</w:t>
+            </w:r>
+          </w:p>
+        </w:tc>
+        <w:tc>
+          <w:tcPr>
+            <w:tcW w:w="3250" w:type="dxa"/>
+          </w:tcPr>
+          <w:p>
+            <w:pPr>
+              <w:spacing w:after="60"/>
+            </w:pPr>
+            <w:r>
+              <w:rPr>
+                <w:sz w:val="18"/>
+              </w:rPr>
+              <w:t>It opened, closed with Escape, then focus went back to the button.</w:t>
+            </w:r>
+          </w:p>
+        </w:tc>
+      </w:tr>
+      <w:tr>
+        <w:tc>
+          <w:tcPr>
+            <w:tcW w:w="3250" w:type="dxa"/>
+          </w:tcPr>
+          <w:p>
+            <w:pPr>
+              <w:spacing w:after="60"/>
+            </w:pPr>
+            <w:r>
+              <w:rPr>
+                <w:sz w:val="18"/>
+              </w:rPr>
+              <w:t>Menu on phone</w:t>
+            </w:r>
+          </w:p>
+        </w:tc>
+        <w:tc>
+          <w:tcPr>
+            <w:tcW w:w="3250" w:type="dxa"/>
+          </w:tcPr>
+          <w:p>
+            <w:pPr>
+              <w:spacing w:after="60"/>
+            </w:pPr>
+            <w:r>
+              <w:rPr>
+                <w:sz w:val="18"/>
+              </w:rPr>
+              <w:t>Pass</w:t>
+            </w:r>
+          </w:p>
+        </w:tc>
+        <w:tc>
+          <w:tcPr>
+            <w:tcW w:w="3250" w:type="dxa"/>
+          </w:tcPr>
+          <w:p>
+            <w:pPr>
+              <w:spacing w:after="60"/>
+            </w:pPr>
+            <w:r>
+              <w:rPr>
+                <w:sz w:val="18"/>
+              </w:rPr>
+              <w:t>It opened and Escape closed it again.</w:t>
+            </w:r>
+          </w:p>
+        </w:tc>
+      </w:tr>
+      <w:tr>
+        <w:tc>
+          <w:tcPr>
+            <w:tcW w:w="3250" w:type="dxa"/>
+          </w:tcPr>
+          <w:p>
+            <w:pPr>
+              <w:spacing w:after="60"/>
+            </w:pPr>
+            <w:r>
+              <w:rPr>
+                <w:sz w:val="18"/>
+              </w:rPr>
+              <w:t>Search and genre buttons</w:t>
+            </w:r>
+          </w:p>
+        </w:tc>
+        <w:tc>
+          <w:tcPr>
+            <w:tcW w:w="3250" w:type="dxa"/>
+          </w:tcPr>
+          <w:p>
+            <w:pPr>
+              <w:spacing w:after="60"/>
+            </w:pPr>
+            <w:r>
+              <w:rPr>
+                <w:sz w:val="18"/>
+              </w:rPr>
+              <w:t>Pass</w:t>
+            </w:r>
+          </w:p>
+        </w:tc>
+        <w:tc>
+          <w:tcPr>
+            <w:tcW w:w="3250" w:type="dxa"/>
+          </w:tcPr>
+          <w:p>
+            <w:pPr>
+              <w:spacing w:after="60"/>
+            </w:pPr>
+            <w:r>
+              <w:rPr>
+                <w:sz w:val="18"/>
+              </w:rPr>
+              <w:t>I could search for ABBA and then change the genre without it breaking.</w:t>
+            </w:r>
+          </w:p>
+        </w:tc>
+      </w:tr>
+      <w:tr>
+        <w:tc>
+          <w:tcPr>
+            <w:tcW w:w="3250" w:type="dxa"/>
+          </w:tcPr>
+          <w:p>
+            <w:pPr>
+              <w:spacing w:after="60"/>
+            </w:pPr>
+            <w:r>
+              <w:rPr>
+                <w:sz w:val="18"/>
+              </w:rPr>
+              <w:t>Make image bigger</w:t>
+            </w:r>
+          </w:p>
+        </w:tc>
+        <w:tc>
+          <w:tcPr>
+            <w:tcW w:w="3250" w:type="dxa"/>
+          </w:tcPr>
+          <w:p>
+            <w:pPr>
+              <w:spacing w:after="60"/>
+            </w:pPr>
+            <w:r>
+              <w:rPr>
+                <w:sz w:val="18"/>
+              </w:rPr>
+              <w:t>Pass</w:t>
+            </w:r>
+          </w:p>
+        </w:tc>
+        <w:tc>
+          <w:tcPr>
+            <w:tcW w:w="3250" w:type="dxa"/>
+          </w:tcPr>
+          <w:p>
+            <w:pPr>
+              <w:spacing w:after="60"/>
+            </w:pPr>
+            <w:r>
+              <w:rPr>
+                <w:sz w:val="18"/>
+              </w:rPr>
+              <w:t>The picture opened bigger and Escape closed it.</w:t>
+            </w:r>
+          </w:p>
+        </w:tc>
+      </w:tr>
+      <w:tr>
+        <w:tc>
+          <w:tcPr>
+            <w:tcW w:w="3250" w:type="dxa"/>
+          </w:tcPr>
+          <w:p>
+            <w:pPr>
+              <w:spacing w:after="60"/>
+            </w:pPr>
+            <w:r>
+              <w:rPr>
+                <w:sz w:val="18"/>
+              </w:rPr>
+              <w:t>Song video</w:t>
+            </w:r>
+          </w:p>
+        </w:tc>
+        <w:tc>
+          <w:tcPr>
+            <w:tcW w:w="3250" w:type="dxa"/>
+          </w:tcPr>
+          <w:p>
+            <w:pPr>
+              <w:spacing w:after="60"/>
+            </w:pPr>
+            <w:r>
+              <w:rPr>
+                <w:sz w:val="18"/>
+              </w:rPr>
+              <w:t>Pass</w:t>
+            </w:r>
+          </w:p>
+        </w:tc>
+        <w:tc>
+          <w:tcPr>
+            <w:tcW w:w="3250" w:type="dxa"/>
+          </w:tcPr>
+          <w:p>
+            <w:pPr>
+              <w:spacing w:after="60"/>
+            </w:pPr>
+            <w:r>
+              <w:rPr>
+                <w:sz w:val="18"/>
+              </w:rPr>
+              <w:t>Pressing Play put the YouTube video on the page. I checked the videos played in localhost too.</w:t>
+            </w:r>
+          </w:p>
+        </w:tc>
+      </w:tr>
+      <w:tr>
+        <w:tc>
+          <w:tcPr>
+            <w:tcW w:w="3250" w:type="dxa"/>
+          </w:tcPr>
+          <w:p>
+            <w:pPr>
+              <w:spacing w:after="60"/>
+            </w:pPr>
+            <w:r>
+              <w:rPr>
+                <w:sz w:val="18"/>
+              </w:rPr>
+              <w:t>Request page</w:t>
+            </w:r>
+          </w:p>
+        </w:tc>
+        <w:tc>
+          <w:tcPr>
+            <w:tcW w:w="3250" w:type="dxa"/>
+          </w:tcPr>
+          <w:p>
+            <w:pPr>
+              <w:spacing w:after="60"/>
+            </w:pPr>
+            <w:r>
+              <w:rPr>
+                <w:sz w:val="18"/>
+              </w:rPr>
+              <w:t>Pass</w:t>
+            </w:r>
+          </w:p>
+        </w:tc>
+        <w:tc>
+          <w:tcPr>
+            <w:tcW w:w="3250" w:type="dxa"/>
+          </w:tcPr>
+          <w:p>
+            <w:pPr>
+              <w:spacing w:after="60"/>
+            </w:pPr>
+            <w:r>
+              <w:rPr>
+                <w:sz w:val="18"/>
+              </w:rPr>
+              <w:t>It would not make the email until I filled in the required boxes. Then it made the email with the client copied in.</w:t>
+            </w:r>
+          </w:p>
+        </w:tc>
+      </w:tr>
+    </w:tbl>
+    <w:p>
+      <w:pPr>
+        <w:pStyle w:val="Heading2"/>
+      </w:pPr>
+      <w:r>
+        <w:t>Review</w:t>
+      </w:r>
+    </w:p>
+    <w:p>
+      <w:r>
+        <w:t>The main thing I changed was putting the artist information and song together on Explore. Before that, it felt like there were two separate lists. I also checked that the menu and photo popup worked with a keyboard, not just with a mouse. The three pages now have the same layout and navigation, and the parts I tested worked.</w:t>
+      </w:r>
+    </w:p>
+    <w:sectPr>
+      <w:footerReference w:type="default" r:id="rId16"/>
+      <w:pgSz w:w="11909" w:h="16834"/>
+      <w:pgMar w:top="936" w:right="1080" w:bottom="936" w:left="1080" w:header="720" w:footer="720" w:gutter="0"/>
+      <w:cols w:space="720"/>
+      <w:docGrid w:linePitch="360"/>
+    </w:sectPr>
+  </w:body>
+</w:document>
 </file>
 
 <file path=word/endnotes.xml><?xml version="1.0" encoding="utf-8"?>

</xml_diff>

<commit_message>
Simplify code comments and add report attribution
</commit_message>
<xml_diff>
--- a/report/Website development report.docx
+++ b/report/Website development report.docx
@@ -36,6 +36,11 @@
       </w:r>
       <w:r>
         <w:t>page website introducing 1970s music to 17-23-year-olds. I used HTML, CSS and JavaScript.</w:t>
+      </w:r>
+    </w:p>
+    <w:p>
+      <w:r>
+        <w:t>Some parts of the code may have come from Stack Overflow.</w:t>
       </w:r>
     </w:p>
     <w:p>

</xml_diff>

<commit_message>
Add usability testing feedback
</commit_message>
<xml_diff>
--- a/report/Website development report.docx
+++ b/report/Website development report.docx
@@ -40,7 +40,15 @@
     </w:p>
     <w:p>
       <w:r>
-        <w:t>Some parts of the code may have come from Stack Overflow.</w:t>
+        <w:t>Some parts of the code may have come from Stack Overflow</w:t>
+      </w:r>
+      <w:r>
+        <w:t xml:space="preserve"> (stackoverflow.com).</w:t>
+      </w:r>
+    </w:p>
+    <w:p>
+      <w:r>
+        <w:t>I may have used AI to help write some music descriptions.</w:t>
       </w:r>
     </w:p>
     <w:p>
@@ -166,7 +174,7 @@
               <w:rPr>
                 <w:sz w:val="20"/>
               </w:rPr>
-              <w:t>The image makes the decade obvious, but the advert uses too much room on a phone.</w:t>
+              <w:t>The big image makes it clear that it is about the 70s, but the advert takes up too much space on a phone.</w:t>
             </w:r>
           </w:p>
         </w:tc>
@@ -182,7 +190,7 @@
               <w:rPr>
                 <w:sz w:val="20"/>
               </w:rPr>
-              <w:t>Clear heading and image, but no adverts.</w:t>
+              <w:t>I used a clear heading and image without adverts.</w:t>
             </w:r>
           </w:p>
         </w:tc>
@@ -219,7 +227,7 @@
               <w:rPr>
                 <w:sz w:val="20"/>
               </w:rPr>
-              <w:t>The dark layout and large image are strong. It mainly suits people who already know ABBA.</w:t>
+              <w:t>The dark layout and big image look good, but it is mostly for people who already know ABBA.</w:t>
             </w:r>
           </w:p>
         </w:tc>
@@ -235,7 +243,7 @@
               <w:rPr>
                 <w:sz w:val="20"/>
               </w:rPr>
-              <w:t>Short introduction before a listening link.</w:t>
+              <w:t>I used a short introduction before the listening link.</w:t>
             </w:r>
           </w:p>
         </w:tc>
@@ -272,7 +280,7 @@
               <w:rPr>
                 <w:sz w:val="20"/>
               </w:rPr>
-              <w:t>Artist cards and search make browsing easy. Its phone layout feels busy.</w:t>
+              <w:t>The artist cards and search make it easy to browse, but the phone layout feels busy.</w:t>
             </w:r>
           </w:p>
         </w:tc>
@@ -288,7 +296,7 @@
               <w:rPr>
                 <w:sz w:val="20"/>
               </w:rPr>
-              <w:t>Genre buttons and search, with one-column phone cards.</w:t>
+              <w:t>I used genre buttons, search and one-column cards on phones.</w:t>
             </w:r>
           </w:p>
         </w:tc>
@@ -386,7 +394,7 @@
               <w:rPr>
                 <w:sz w:val="20"/>
               </w:rPr>
-              <w:t>There is enough choice for a beginner, without making Explore hard to look through.</w:t>
+              <w:t>This gives beginners enough choice without making Explore hard to use.</w:t>
             </w:r>
           </w:p>
         </w:tc>
@@ -497,7 +505,7 @@
               <w:rPr>
                 <w:sz w:val="20"/>
               </w:rPr>
-              <w:t>These make the content easier to use with a keyboard, screen reader or without sound. [11]</w:t>
+              <w:t>These help people using a keyboard, screen reader or no sound. [11]</w:t>
             </w:r>
           </w:p>
         </w:tc>
@@ -518,9 +526,9 @@
         </w:rPr>
         <w:drawing>
           <wp:inline distT="0" distB="0" distL="0" distR="0" wp14:anchorId="68DE24DE" wp14:editId="2D394CCA">
-            <wp:extent cx="6035040" cy="2042629"/>
+            <wp:extent cx="6035040" cy="3621024"/>
             <wp:effectExtent l="0" t="0" r="0" b="0"/>
-            <wp:docPr id="1" name="Picture 1" descr="Home, Explore and Request are connected through the shared navigation."/>
+            <wp:docPr id="1" name="Picture 1" descr="Site map showing the shared navigation node and the Home, Explore and Request pages."/>
             <wp:cNvGraphicFramePr>
               <a:graphicFrameLocks xmlns:a="http://schemas.openxmlformats.org/drawingml/2006/main" noChangeAspect="1"/>
             </wp:cNvGraphicFramePr>
@@ -540,7 +548,7 @@
                   <pic:spPr>
                     <a:xfrm>
                       <a:off x="0" y="0"/>
-                      <a:ext cx="6035040" cy="2042629"/>
+                      <a:ext cx="6035040" cy="3621024"/>
                     </a:xfrm>
                     <a:prstGeom prst="rect">
                       <a:avLst/>
@@ -555,7 +563,7 @@
     </w:p>
     <w:p>
       <w:r>
-        <w:t>All three pages share the same navigation. Explore has genre shortcuts, and on a phone the links open inside Menu.</w:t>
+        <w:t>The same navigation is used on every page. Explore has genre filters and search, and on phones the links open inside Menu.</w:t>
       </w:r>
     </w:p>
     <w:tbl>
@@ -757,13 +765,7 @@
               <w:rPr>
                 <w:sz w:val="20"/>
               </w:rPr>
-              <w:t>R</w:t>
-            </w:r>
-            <w:r>
-              <w:rPr>
-                <w:sz w:val="20"/>
-              </w:rPr>
-              <w:t>equest form, privacy, credits and accessibility information.</w:t>
+              <w:t>Request form, privacy, credits and accessibility information.</w:t>
             </w:r>
           </w:p>
         </w:tc>
@@ -771,7 +773,7 @@
     </w:tbl>
     <w:p>
       <w:r>
-        <w:t xml:space="preserve">Home is the starting point, Explore has the music and Request is for suggestions. Search ignores capital letters and extra spaces. If there is no result, the genre buttons are still there to </w:t>
+        <w:t xml:space="preserve">Home starts the site, Explore has the music and Request is for suggestions. Search ignores capital letters and extra spaces. If there is no result, the genre buttons are still there to </w:t>
       </w:r>
       <w:r>
         <w:t>navigate</w:t>
@@ -1030,7 +1032,7 @@
     </w:p>
     <w:p>
       <w:r>
-        <w:t>I kept the three pages from my plan. Georgia is used for headings and Arial for the main text, because both are easy to read. I used the same dark blue, gold and pale background on every page so it feels like one site.</w:t>
+        <w:t>I kept the three pages from my plan. I used Georgia for headings and Arial for the main text because they are easy to read. I used the same dark blue, gold and pale background on every page so it feels like one site.</w:t>
       </w:r>
     </w:p>
     <w:p>
@@ -1093,7 +1095,7 @@
     </w:p>
     <w:p>
       <w:r>
-        <w:t>The three designs below show the wireframe, finished desktop page and phone layout. Full-size versions are saved in website-design/page-plans and website-design/website.</w:t>
+        <w:t>The designs below show the wireframe, finished desktop page and phone layout. Full-size versions are saved in website-design/page-plans and website-design/website.</w:t>
       </w:r>
     </w:p>
     <w:tbl>
@@ -1268,7 +1270,7 @@
     </w:tbl>
     <w:p>
       <w:r>
-        <w:t>Home gives a quick way into the music. Explore keeps each artist, photo and song together, with extra facts hidden in accordions. Request uses a short labelled form. On a phone, the content becomes one column and the page links go inside Menu.</w:t>
+        <w:t>Home gives visitors a quick way into the music. Explore keeps each artist, photo and song together, with extra facts hidden in accordions. Request uses a short labelled form. On a phone, the content becomes one column and the page links go inside Menu.</w:t>
       </w:r>
     </w:p>
     <w:p>
@@ -1401,7 +1403,7 @@
     </w:p>
     <w:p>
       <w:r>
-        <w:t>The pages fitted both screen sizes and the links stayed in the same place. I also checked the popup with a keyboard. Explore has seven artists from different styles, and videos only load when someone presses Play.</w:t>
+        <w:t>The pages worked at both sizes and the links stayed in the same place. I also checked the popup with a keyboard. Explore has seven artists from different styles, and videos only load when someone presses Play.</w:t>
       </w:r>
     </w:p>
     <w:p>
@@ -2278,6 +2280,30 @@
     <w:p>
       <w:pPr>
         <w:pStyle w:val="Heading2"/>
+        <w:spacing w:after="140"/>
+      </w:pPr>
+      <w:r>
+        <w:t>Usability testing</w:t>
+      </w:r>
+    </w:p>
+    <w:p>
+      <w:r>
+        <w:t>I made a short online feedback form so I can get opinions from classmates, friends, family and my teacher. I want people with different levels of interest in 1970s music to try the website, so I can see if it works for beginners as well as people who already know the songs.</w:t>
+      </w:r>
+    </w:p>
+    <w:p>
+      <w:r>
+        <w:t>The form asks people to find music, use the search and genre buttons, open extra information, view a larger photo, try a video and use the Request page. It asks what was easy, what was confusing, how the site worked on their device and what should be improved. Name and age are optional, and the form does not ask for email addresses or other private information.</w:t>
+      </w:r>
+    </w:p>
+    <w:p>
+      <w:r>
+        <w:t>I will look for repeated comments and ratings instead of changing the site because of one answer. The questions and testing plan are saved in website-testing/usability-testing.md. The feedback form is available at https://6nwnojh1fz.zite.so.</w:t>
+      </w:r>
+    </w:p>
+    <w:p>
+      <w:pPr>
+        <w:pStyle w:val="Heading2"/>
       </w:pPr>
       <w:r>
         <w:t>Review</w:t>
@@ -2285,7 +2311,7 @@
     </w:p>
     <w:p>
       <w:r>
-        <w:t>The main thing I changed was putting the artist information and song together on Explore. Before that, it felt like there were two separate lists. I also checked that the menu and photo popup worked with a keyboard, not just with a mouse. The three pages now have the same layout and navigation, and the parts I tested worked.</w:t>
+        <w:t>The biggest change I made was putting the artist information and song together on Explore. Before that, it felt like there were two separate lists. I also checked that the menu and photo popup worked with a keyboard, not just with a mouse. The three pages now have the same layout and navigation, and the parts I tested worked.</w:t>
       </w:r>
     </w:p>
     <w:sectPr>

</xml_diff>

<commit_message>
Update report and usability evidence
</commit_message>
<xml_diff>
--- a/report/Website development report.docx
+++ b/report/Website development report.docx
@@ -516,6 +516,7 @@
         <w:pStyle w:val="Heading2"/>
       </w:pPr>
       <w:r>
+        <w:lastRenderedPageBreak/>
         <w:t>Site map and page plan</w:t>
       </w:r>
     </w:p>
@@ -685,7 +686,6 @@
               <w:rPr>
                 <w:sz w:val="20"/>
               </w:rPr>
-              <w:lastRenderedPageBreak/>
               <w:t>Explore</w:t>
             </w:r>
             <w:r>
@@ -1001,6 +1001,7 @@
         <w:rPr>
           <w:sz w:val="20"/>
         </w:rPr>
+        <w:lastRenderedPageBreak/>
         <w:t>[1</w:t>
       </w:r>
       <w:r>
@@ -2298,14 +2299,16 @@
     </w:p>
     <w:p>
       <w:r>
-        <w:t>I will look for repeated comments and ratings instead of changing the site because of one answer. The questions and testing plan are saved in website-testing/usability-testing.md. The feedback form is available at https://6nwnojh1fz.zite.so.</w:t>
+        <w:t>I will look for repeated comments and ratings instead of changing the site because of one answer.</w:t>
       </w:r>
     </w:p>
+    <w:p/>
     <w:p>
       <w:pPr>
         <w:pStyle w:val="Heading2"/>
       </w:pPr>
       <w:r>
+        <w:lastRenderedPageBreak/>
         <w:t>Review</w:t>
       </w:r>
     </w:p>

</xml_diff>

<commit_message>
Save latest project changes
</commit_message>
<xml_diff>
--- a/report/Website development report.docx
+++ b/report/Website development report.docx
@@ -174,7 +174,19 @@
               <w:rPr>
                 <w:sz w:val="20"/>
               </w:rPr>
-              <w:t>The big image makes it clear that it is about the 70s, but the advert takes up too much space on a phone.</w:t>
+              <w:t>The big image makes it clear that it is about the 70s, but the ad</w:t>
+            </w:r>
+            <w:r>
+              <w:rPr>
+                <w:sz w:val="20"/>
+              </w:rPr>
+              <w:t xml:space="preserve">s </w:t>
+            </w:r>
+            <w:r>
+              <w:rPr>
+                <w:sz w:val="20"/>
+              </w:rPr>
+              <w:t>take too much space on a phone.</w:t>
             </w:r>
           </w:p>
         </w:tc>
@@ -953,7 +965,7 @@
         <w:rPr>
           <w:sz w:val="20"/>
         </w:rPr>
-        <w:t>] GOV.UK, Using somebody else's intellectual property: Copyright. https://www.gov.uk/using-somebody-elses-intellectual-property/copyright</w:t>
+        <w:t>] GOV.UK, Using somebody else's intellectual property: https://www.gov.uk/using-somebody-elses-intellectual-property/copyright</w:t>
       </w:r>
     </w:p>
     <w:p>
@@ -1033,7 +1045,13 @@
     </w:p>
     <w:p>
       <w:r>
-        <w:t>I kept the three pages from my plan. I used Georgia for headings and Arial for the main text because they are easy to read. I used the same dark blue, gold and pale background on every page so it feels like one site.</w:t>
+        <w:t xml:space="preserve">I kept the </w:t>
+      </w:r>
+      <w:r>
+        <w:t>3</w:t>
+      </w:r>
+      <w:r>
+        <w:t xml:space="preserve"> pages from my plan. I used Georgia for headings and Arial for the main text because they are easy to read. I used the same dark blue, gold and pale background on every page so it feels like one site.</w:t>
       </w:r>
     </w:p>
     <w:p>
@@ -1096,7 +1114,10 @@
     </w:p>
     <w:p>
       <w:r>
-        <w:t>The designs below show the wireframe, finished desktop page and phone layout. Full-size versions are saved in website-design/page-plans and website-design/website.</w:t>
+        <w:t xml:space="preserve">The designs below show the wireframe, finished desktop page and phone layout. Full-size versions are saved in </w:t>
+      </w:r>
+      <w:r>
+        <w:t>the project’s folder.</w:t>
       </w:r>
     </w:p>
     <w:tbl>
@@ -1335,7 +1356,21 @@
     </w:p>
     <w:p>
       <w:r>
-        <w:t>The Explore menu links to each genre. Search stays on Explore. A blank search gives help and no matches gives a way back to all artists. The image popup has a Close button and keyboard support. The request button checks the required boxes, then opens a pre-filled email for the visitor to send.</w:t>
+        <w:t>The Explore menu links to each genre. Search stays on Explore. A</w:t>
+      </w:r>
+      <w:r>
+        <w:t xml:space="preserve">n empty </w:t>
+      </w:r>
+      <w:r>
+        <w:t xml:space="preserve">search gives </w:t>
+      </w:r>
+      <w:proofErr w:type="gramStart"/>
+      <w:r>
+        <w:t>help</w:t>
+      </w:r>
+      <w:proofErr w:type="gramEnd"/>
+      <w:r>
+        <w:t xml:space="preserve"> and no matches gives a way back to all artists. The image popup has a Close button and keyboard support. The request button checks the required boxes, then opens a pre-filled email for the visitor to send.</w:t>
       </w:r>
     </w:p>
     <w:p>
@@ -1423,7 +1458,13 @@
         <w:t xml:space="preserve"> [12]</w:t>
       </w:r>
       <w:r>
-        <w:t xml:space="preserve"> and official YouTube embeds. The video has original title cards and script, an ElevenLabs voiceover, captions and a written transcript. </w:t>
+        <w:t xml:space="preserve"> and official YouTube</w:t>
+      </w:r>
+      <w:r>
+        <w:t xml:space="preserve"> videos</w:t>
+      </w:r>
+      <w:r>
+        <w:t xml:space="preserve">. The video has original title cards and script, an ElevenLabs voiceover, captions and a written transcript. </w:t>
       </w:r>
     </w:p>
     <w:p>
@@ -1526,7 +1567,13 @@
     </w:p>
     <w:p>
       <w:r>
-        <w:t>I kept all the artists on Explore because it is easier to look through them in one place. Search takes you there too. The genre buttons clear the search and show the selected genre. The request link checks the required boxes before it opens an email.</w:t>
+        <w:t>I kept all the artists on Explore because it</w:t>
+      </w:r>
+      <w:r>
+        <w:t>’s</w:t>
+      </w:r>
+      <w:r>
+        <w:t xml:space="preserve"> easier to look through them in one place. Search takes you there too. The genre buttons clear the search and show the selected genre. The request link checks the required boxes before it opens an email.</w:t>
       </w:r>
     </w:p>
     <w:p>
@@ -1544,7 +1591,13 @@
     </w:p>
     <w:p>
       <w:r>
-        <w:t xml:space="preserve">The song videos only load after someone presses Play, so the page is not trying to load all of them straight away. Sources and credits open in a new tab, which means people do not lose their place on the </w:t>
+        <w:t xml:space="preserve">The song videos only load </w:t>
+      </w:r>
+      <w:r>
+        <w:t>when</w:t>
+      </w:r>
+      <w:r>
+        <w:t xml:space="preserve"> someone presses Play, so the page is not trying to load all of them straight away. Sources and credits open in a new tab, which means people do not lose the </w:t>
       </w:r>
       <w:r>
         <w:t>web</w:t>
@@ -1563,7 +1616,13 @@
     </w:p>
     <w:p>
       <w:r>
-        <w:t xml:space="preserve">I tried the pages on Edge on my laptop and at phone size. I also used the keyboard for the menu, Skip link and bigger-photo button. I checked the YouTube videos in my local preview as well. </w:t>
+        <w:t>I tried the pages on</w:t>
+      </w:r>
+      <w:r>
+        <w:t xml:space="preserve"> Microsoft</w:t>
+      </w:r>
+      <w:r>
+        <w:t xml:space="preserve"> Edge on my laptop and at phone size. I also used the keyboard for the menu, Skip link and bigger-photo button. I checked the YouTube videos in my local preview as well. </w:t>
       </w:r>
     </w:p>
     <w:tbl>
@@ -2289,7 +2348,21 @@
     </w:p>
     <w:p>
       <w:r>
-        <w:t>I made a short online feedback form so I can get opinions from classmates, friends, family and my teacher. I want people with different levels of interest in 1970s music to try the website, so I can see if it works for beginners as well as people who already know the songs.</w:t>
+        <w:t xml:space="preserve">I made </w:t>
+      </w:r>
+      <w:proofErr w:type="gramStart"/>
+      <w:r>
+        <w:t>a short online feedback</w:t>
+      </w:r>
+      <w:proofErr w:type="gramEnd"/>
+      <w:r>
+        <w:t xml:space="preserve"> form so I can get opinions from </w:t>
+      </w:r>
+      <w:r>
+        <w:t>the website’s users</w:t>
+      </w:r>
+      <w:r>
+        <w:t>. I want people with different levels of interest in 1970s music to try the website, so I can see if it works for beginners as well as people who already know the songs.</w:t>
       </w:r>
     </w:p>
     <w:p>
@@ -2299,7 +2372,10 @@
     </w:p>
     <w:p>
       <w:r>
-        <w:t>I will look for repeated comments and ratings instead of changing the site because of one answer.</w:t>
+        <w:t>I will look for repeated comments</w:t>
+      </w:r>
+      <w:r>
+        <w:t xml:space="preserve"> and suggestions to update the website.</w:t>
       </w:r>
     </w:p>
     <w:p/>

</xml_diff>